<commit_message>
Pushing MATLAB scripts and updated Notes
</commit_message>
<xml_diff>
--- a/MATLAB_Notes.docx
+++ b/MATLAB_Notes.docx
@@ -60,7 +60,7 @@
           <w:r>
             <w:fldChar w:fldCharType="separate"/>
           </w:r>
-          <w:hyperlink w:anchor="_Toc235343760" w:history="1">
+          <w:hyperlink w:anchor="_Toc235357131" w:history="1">
             <w:r>
               <w:rPr>
                 <w:rStyle w:val="Hyperlink"/>
@@ -104,7 +104,7 @@
                 <w:noProof/>
                 <w:webHidden/>
               </w:rPr>
-              <w:instrText xml:space="preserve"> PAGEREF _Toc235343760 \h </w:instrText>
+              <w:instrText xml:space="preserve"> PAGEREF _Toc235357131 \h </w:instrText>
             </w:r>
             <w:r>
               <w:rPr>
@@ -124,7 +124,7 @@
                 <w:noProof/>
                 <w:webHidden/>
               </w:rPr>
-              <w:t>1</w:t>
+              <w:t>2</w:t>
             </w:r>
             <w:r>
               <w:rPr>
@@ -148,7 +148,7 @@
               <w:lang w:eastAsia="en-BW"/>
             </w:rPr>
           </w:pPr>
-          <w:hyperlink w:anchor="_Toc235343761" w:history="1">
+          <w:hyperlink w:anchor="_Toc235357132" w:history="1">
             <w:r>
               <w:rPr>
                 <w:rStyle w:val="Hyperlink"/>
@@ -192,7 +192,7 @@
                 <w:noProof/>
                 <w:webHidden/>
               </w:rPr>
-              <w:instrText xml:space="preserve"> PAGEREF _Toc235343761 \h </w:instrText>
+              <w:instrText xml:space="preserve"> PAGEREF _Toc235357132 \h </w:instrText>
             </w:r>
             <w:r>
               <w:rPr>
@@ -212,7 +212,7 @@
                 <w:noProof/>
                 <w:webHidden/>
               </w:rPr>
-              <w:t>1</w:t>
+              <w:t>2</w:t>
             </w:r>
             <w:r>
               <w:rPr>
@@ -236,7 +236,7 @@
               <w:lang w:eastAsia="en-BW"/>
             </w:rPr>
           </w:pPr>
-          <w:hyperlink w:anchor="_Toc235343762" w:history="1">
+          <w:hyperlink w:anchor="_Toc235357133" w:history="1">
             <w:r>
               <w:rPr>
                 <w:rStyle w:val="Hyperlink"/>
@@ -280,7 +280,7 @@
                 <w:noProof/>
                 <w:webHidden/>
               </w:rPr>
-              <w:instrText xml:space="preserve"> PAGEREF _Toc235343762 \h </w:instrText>
+              <w:instrText xml:space="preserve"> PAGEREF _Toc235357133 \h </w:instrText>
             </w:r>
             <w:r>
               <w:rPr>
@@ -324,7 +324,7 @@
               <w:lang w:eastAsia="en-BW"/>
             </w:rPr>
           </w:pPr>
-          <w:hyperlink w:anchor="_Toc235343763" w:history="1">
+          <w:hyperlink w:anchor="_Toc235357134" w:history="1">
             <w:r>
               <w:rPr>
                 <w:rStyle w:val="Hyperlink"/>
@@ -368,7 +368,7 @@
                 <w:noProof/>
                 <w:webHidden/>
               </w:rPr>
-              <w:instrText xml:space="preserve"> PAGEREF _Toc235343763 \h </w:instrText>
+              <w:instrText xml:space="preserve"> PAGEREF _Toc235357134 \h </w:instrText>
             </w:r>
             <w:r>
               <w:rPr>
@@ -412,7 +412,7 @@
               <w:lang w:eastAsia="en-BW"/>
             </w:rPr>
           </w:pPr>
-          <w:hyperlink w:anchor="_Toc235343764" w:history="1">
+          <w:hyperlink w:anchor="_Toc235357135" w:history="1">
             <w:r>
               <w:rPr>
                 <w:rStyle w:val="Hyperlink"/>
@@ -456,7 +456,7 @@
                 <w:noProof/>
                 <w:webHidden/>
               </w:rPr>
-              <w:instrText xml:space="preserve"> PAGEREF _Toc235343764 \h </w:instrText>
+              <w:instrText xml:space="preserve"> PAGEREF _Toc235357135 \h </w:instrText>
             </w:r>
             <w:r>
               <w:rPr>
@@ -500,7 +500,7 @@
               <w:lang w:eastAsia="en-BW"/>
             </w:rPr>
           </w:pPr>
-          <w:hyperlink w:anchor="_Toc235343765" w:history="1">
+          <w:hyperlink w:anchor="_Toc235357136" w:history="1">
             <w:r>
               <w:rPr>
                 <w:rStyle w:val="Hyperlink"/>
@@ -544,7 +544,7 @@
                 <w:noProof/>
                 <w:webHidden/>
               </w:rPr>
-              <w:instrText xml:space="preserve"> PAGEREF _Toc235343765 \h </w:instrText>
+              <w:instrText xml:space="preserve"> PAGEREF _Toc235357136 \h </w:instrText>
             </w:r>
             <w:r>
               <w:rPr>
@@ -588,7 +588,7 @@
               <w:lang w:eastAsia="en-BW"/>
             </w:rPr>
           </w:pPr>
-          <w:hyperlink w:anchor="_Toc235343766" w:history="1">
+          <w:hyperlink w:anchor="_Toc235357137" w:history="1">
             <w:r>
               <w:rPr>
                 <w:rStyle w:val="Hyperlink"/>
@@ -632,7 +632,7 @@
                 <w:noProof/>
                 <w:webHidden/>
               </w:rPr>
-              <w:instrText xml:space="preserve"> PAGEREF _Toc235343766 \h </w:instrText>
+              <w:instrText xml:space="preserve"> PAGEREF _Toc235357137 \h </w:instrText>
             </w:r>
             <w:r>
               <w:rPr>
@@ -676,7 +676,7 @@
               <w:lang w:eastAsia="en-BW"/>
             </w:rPr>
           </w:pPr>
-          <w:hyperlink w:anchor="_Toc235343767" w:history="1">
+          <w:hyperlink w:anchor="_Toc235357138" w:history="1">
             <w:r>
               <w:rPr>
                 <w:rStyle w:val="Hyperlink"/>
@@ -720,7 +720,7 @@
                 <w:noProof/>
                 <w:webHidden/>
               </w:rPr>
-              <w:instrText xml:space="preserve"> PAGEREF _Toc235343767 \h </w:instrText>
+              <w:instrText xml:space="preserve"> PAGEREF _Toc235357138 \h </w:instrText>
             </w:r>
             <w:r>
               <w:rPr>
@@ -740,7 +740,7 @@
                 <w:noProof/>
                 <w:webHidden/>
               </w:rPr>
-              <w:t>2</w:t>
+              <w:t>3</w:t>
             </w:r>
             <w:r>
               <w:rPr>
@@ -764,7 +764,7 @@
               <w:lang w:eastAsia="en-BW"/>
             </w:rPr>
           </w:pPr>
-          <w:hyperlink w:anchor="_Toc235343768" w:history="1">
+          <w:hyperlink w:anchor="_Toc235357139" w:history="1">
             <w:r>
               <w:rPr>
                 <w:rStyle w:val="Hyperlink"/>
@@ -808,7 +808,7 @@
                 <w:noProof/>
                 <w:webHidden/>
               </w:rPr>
-              <w:instrText xml:space="preserve"> PAGEREF _Toc235343768 \h </w:instrText>
+              <w:instrText xml:space="preserve"> PAGEREF _Toc235357139 \h </w:instrText>
             </w:r>
             <w:r>
               <w:rPr>
@@ -828,7 +828,7 @@
                 <w:noProof/>
                 <w:webHidden/>
               </w:rPr>
-              <w:t>2</w:t>
+              <w:t>3</w:t>
             </w:r>
             <w:r>
               <w:rPr>
@@ -852,7 +852,7 @@
               <w:lang w:eastAsia="en-BW"/>
             </w:rPr>
           </w:pPr>
-          <w:hyperlink w:anchor="_Toc235343769" w:history="1">
+          <w:hyperlink w:anchor="_Toc235357140" w:history="1">
             <w:r>
               <w:rPr>
                 <w:rStyle w:val="Hyperlink"/>
@@ -896,7 +896,7 @@
                 <w:noProof/>
                 <w:webHidden/>
               </w:rPr>
-              <w:instrText xml:space="preserve"> PAGEREF _Toc235343769 \h </w:instrText>
+              <w:instrText xml:space="preserve"> PAGEREF _Toc235357140 \h </w:instrText>
             </w:r>
             <w:r>
               <w:rPr>
@@ -940,7 +940,7 @@
               <w:lang w:eastAsia="en-BW"/>
             </w:rPr>
           </w:pPr>
-          <w:hyperlink w:anchor="_Toc235343770" w:history="1">
+          <w:hyperlink w:anchor="_Toc235357141" w:history="1">
             <w:r>
               <w:rPr>
                 <w:rStyle w:val="Hyperlink"/>
@@ -984,7 +984,7 @@
                 <w:noProof/>
                 <w:webHidden/>
               </w:rPr>
-              <w:instrText xml:space="preserve"> PAGEREF _Toc235343770 \h </w:instrText>
+              <w:instrText xml:space="preserve"> PAGEREF _Toc235357141 \h </w:instrText>
             </w:r>
             <w:r>
               <w:rPr>
@@ -1028,7 +1028,7 @@
               <w:lang w:eastAsia="en-BW"/>
             </w:rPr>
           </w:pPr>
-          <w:hyperlink w:anchor="_Toc235343771" w:history="1">
+          <w:hyperlink w:anchor="_Toc235357142" w:history="1">
             <w:r>
               <w:rPr>
                 <w:rStyle w:val="Hyperlink"/>
@@ -1087,7 +1087,7 @@
                 <w:noProof/>
                 <w:webHidden/>
               </w:rPr>
-              <w:instrText xml:space="preserve"> PAGEREF _Toc235343771 \h </w:instrText>
+              <w:instrText xml:space="preserve"> PAGEREF _Toc235357142 \h </w:instrText>
             </w:r>
             <w:r>
               <w:rPr>
@@ -1131,7 +1131,7 @@
               <w:lang w:eastAsia="en-BW"/>
             </w:rPr>
           </w:pPr>
-          <w:hyperlink w:anchor="_Toc235343772" w:history="1">
+          <w:hyperlink w:anchor="_Toc235357143" w:history="1">
             <w:r>
               <w:rPr>
                 <w:rStyle w:val="Hyperlink"/>
@@ -1182,7 +1182,7 @@
                 <w:noProof/>
                 <w:webHidden/>
               </w:rPr>
-              <w:instrText xml:space="preserve"> PAGEREF _Toc235343772 \h </w:instrText>
+              <w:instrText xml:space="preserve"> PAGEREF _Toc235357143 \h </w:instrText>
             </w:r>
             <w:r>
               <w:rPr>
@@ -1226,7 +1226,7 @@
               <w:lang w:eastAsia="en-BW"/>
             </w:rPr>
           </w:pPr>
-          <w:hyperlink w:anchor="_Toc235343773" w:history="1">
+          <w:hyperlink w:anchor="_Toc235357144" w:history="1">
             <w:r>
               <w:rPr>
                 <w:rStyle w:val="Hyperlink"/>
@@ -1270,7 +1270,7 @@
                 <w:noProof/>
                 <w:webHidden/>
               </w:rPr>
-              <w:instrText xml:space="preserve"> PAGEREF _Toc235343773 \h </w:instrText>
+              <w:instrText xml:space="preserve"> PAGEREF _Toc235357144 \h </w:instrText>
             </w:r>
             <w:r>
               <w:rPr>
@@ -1314,7 +1314,7 @@
               <w:lang w:eastAsia="en-BW"/>
             </w:rPr>
           </w:pPr>
-          <w:hyperlink w:anchor="_Toc235343774" w:history="1">
+          <w:hyperlink w:anchor="_Toc235357145" w:history="1">
             <w:r>
               <w:rPr>
                 <w:rStyle w:val="Hyperlink"/>
@@ -1358,7 +1358,7 @@
                 <w:noProof/>
                 <w:webHidden/>
               </w:rPr>
-              <w:instrText xml:space="preserve"> PAGEREF _Toc235343774 \h </w:instrText>
+              <w:instrText xml:space="preserve"> PAGEREF _Toc235357145 \h </w:instrText>
             </w:r>
             <w:r>
               <w:rPr>
@@ -1402,7 +1402,7 @@
               <w:lang w:eastAsia="en-BW"/>
             </w:rPr>
           </w:pPr>
-          <w:hyperlink w:anchor="_Toc235343775" w:history="1">
+          <w:hyperlink w:anchor="_Toc235357146" w:history="1">
             <w:r>
               <w:rPr>
                 <w:rStyle w:val="Hyperlink"/>
@@ -1446,7 +1446,7 @@
                 <w:noProof/>
                 <w:webHidden/>
               </w:rPr>
-              <w:instrText xml:space="preserve"> PAGEREF _Toc235343775 \h </w:instrText>
+              <w:instrText xml:space="preserve"> PAGEREF _Toc235357146 \h </w:instrText>
             </w:r>
             <w:r>
               <w:rPr>
@@ -1467,6 +1467,798 @@
                 <w:webHidden/>
               </w:rPr>
               <w:t>4</w:t>
+            </w:r>
+            <w:r>
+              <w:rPr>
+                <w:noProof/>
+                <w:webHidden/>
+              </w:rPr>
+              <w:fldChar w:fldCharType="end"/>
+            </w:r>
+          </w:hyperlink>
+        </w:p>
+        <w:p>
+          <w:pPr>
+            <w:pStyle w:val="TOC2"/>
+            <w:tabs>
+              <w:tab w:val="left" w:pos="960"/>
+              <w:tab w:val="right" w:leader="dot" w:pos="9628"/>
+            </w:tabs>
+            <w:rPr>
+              <w:rFonts w:eastAsiaTheme="minorEastAsia"/>
+              <w:noProof/>
+              <w:lang w:eastAsia="en-BW"/>
+            </w:rPr>
+          </w:pPr>
+          <w:hyperlink w:anchor="_Toc235357147" w:history="1">
+            <w:r>
+              <w:rPr>
+                <w:rStyle w:val="Hyperlink"/>
+                <w:noProof/>
+                <w:lang w:val="en-US"/>
+              </w:rPr>
+              <w:t>2.3</w:t>
+            </w:r>
+            <w:r>
+              <w:rPr>
+                <w:rFonts w:eastAsiaTheme="minorEastAsia"/>
+                <w:noProof/>
+                <w:lang w:eastAsia="en-BW"/>
+              </w:rPr>
+              <w:tab/>
+            </w:r>
+            <w:r>
+              <w:rPr>
+                <w:rStyle w:val="Hyperlink"/>
+                <w:noProof/>
+                <w:lang w:val="en-US"/>
+              </w:rPr>
+              <w:t>Current Folder</w:t>
+            </w:r>
+            <w:r>
+              <w:rPr>
+                <w:noProof/>
+                <w:webHidden/>
+              </w:rPr>
+              <w:tab/>
+            </w:r>
+            <w:r>
+              <w:rPr>
+                <w:noProof/>
+                <w:webHidden/>
+              </w:rPr>
+              <w:fldChar w:fldCharType="begin"/>
+            </w:r>
+            <w:r>
+              <w:rPr>
+                <w:noProof/>
+                <w:webHidden/>
+              </w:rPr>
+              <w:instrText xml:space="preserve"> PAGEREF _Toc235357147 \h </w:instrText>
+            </w:r>
+            <w:r>
+              <w:rPr>
+                <w:noProof/>
+                <w:webHidden/>
+              </w:rPr>
+            </w:r>
+            <w:r>
+              <w:rPr>
+                <w:noProof/>
+                <w:webHidden/>
+              </w:rPr>
+              <w:fldChar w:fldCharType="separate"/>
+            </w:r>
+            <w:r>
+              <w:rPr>
+                <w:noProof/>
+                <w:webHidden/>
+              </w:rPr>
+              <w:t>5</w:t>
+            </w:r>
+            <w:r>
+              <w:rPr>
+                <w:noProof/>
+                <w:webHidden/>
+              </w:rPr>
+              <w:fldChar w:fldCharType="end"/>
+            </w:r>
+          </w:hyperlink>
+        </w:p>
+        <w:p>
+          <w:pPr>
+            <w:pStyle w:val="TOC1"/>
+            <w:tabs>
+              <w:tab w:val="left" w:pos="480"/>
+              <w:tab w:val="right" w:leader="dot" w:pos="9628"/>
+            </w:tabs>
+            <w:rPr>
+              <w:rFonts w:eastAsiaTheme="minorEastAsia"/>
+              <w:noProof/>
+              <w:lang w:eastAsia="en-BW"/>
+            </w:rPr>
+          </w:pPr>
+          <w:hyperlink w:anchor="_Toc235357148" w:history="1">
+            <w:r>
+              <w:rPr>
+                <w:rStyle w:val="Hyperlink"/>
+                <w:noProof/>
+                <w:lang w:val="en-US"/>
+              </w:rPr>
+              <w:t>3.</w:t>
+            </w:r>
+            <w:r>
+              <w:rPr>
+                <w:rFonts w:eastAsiaTheme="minorEastAsia"/>
+                <w:noProof/>
+                <w:lang w:eastAsia="en-BW"/>
+              </w:rPr>
+              <w:tab/>
+            </w:r>
+            <w:r>
+              <w:rPr>
+                <w:rStyle w:val="Hyperlink"/>
+                <w:noProof/>
+                <w:lang w:val="en-US"/>
+              </w:rPr>
+              <w:t>MATLAB Introduction</w:t>
+            </w:r>
+            <w:r>
+              <w:rPr>
+                <w:noProof/>
+                <w:webHidden/>
+              </w:rPr>
+              <w:tab/>
+            </w:r>
+            <w:r>
+              <w:rPr>
+                <w:noProof/>
+                <w:webHidden/>
+              </w:rPr>
+              <w:fldChar w:fldCharType="begin"/>
+            </w:r>
+            <w:r>
+              <w:rPr>
+                <w:noProof/>
+                <w:webHidden/>
+              </w:rPr>
+              <w:instrText xml:space="preserve"> PAGEREF _Toc235357148 \h </w:instrText>
+            </w:r>
+            <w:r>
+              <w:rPr>
+                <w:noProof/>
+                <w:webHidden/>
+              </w:rPr>
+            </w:r>
+            <w:r>
+              <w:rPr>
+                <w:noProof/>
+                <w:webHidden/>
+              </w:rPr>
+              <w:fldChar w:fldCharType="separate"/>
+            </w:r>
+            <w:r>
+              <w:rPr>
+                <w:noProof/>
+                <w:webHidden/>
+              </w:rPr>
+              <w:t>5</w:t>
+            </w:r>
+            <w:r>
+              <w:rPr>
+                <w:noProof/>
+                <w:webHidden/>
+              </w:rPr>
+              <w:fldChar w:fldCharType="end"/>
+            </w:r>
+          </w:hyperlink>
+        </w:p>
+        <w:p>
+          <w:pPr>
+            <w:pStyle w:val="TOC2"/>
+            <w:tabs>
+              <w:tab w:val="left" w:pos="960"/>
+              <w:tab w:val="right" w:leader="dot" w:pos="9628"/>
+            </w:tabs>
+            <w:rPr>
+              <w:rFonts w:eastAsiaTheme="minorEastAsia"/>
+              <w:noProof/>
+              <w:lang w:eastAsia="en-BW"/>
+            </w:rPr>
+          </w:pPr>
+          <w:hyperlink w:anchor="_Toc235357149" w:history="1">
+            <w:r>
+              <w:rPr>
+                <w:rStyle w:val="Hyperlink"/>
+                <w:noProof/>
+                <w:lang w:val="en-US"/>
+              </w:rPr>
+              <w:t>3.1</w:t>
+            </w:r>
+            <w:r>
+              <w:rPr>
+                <w:rFonts w:eastAsiaTheme="minorEastAsia"/>
+                <w:noProof/>
+                <w:lang w:eastAsia="en-BW"/>
+              </w:rPr>
+              <w:tab/>
+            </w:r>
+            <w:r>
+              <w:rPr>
+                <w:rStyle w:val="Hyperlink"/>
+                <w:noProof/>
+                <w:lang w:val="en-US"/>
+              </w:rPr>
+              <w:t>Scientific Notation</w:t>
+            </w:r>
+            <w:r>
+              <w:rPr>
+                <w:noProof/>
+                <w:webHidden/>
+              </w:rPr>
+              <w:tab/>
+            </w:r>
+            <w:r>
+              <w:rPr>
+                <w:noProof/>
+                <w:webHidden/>
+              </w:rPr>
+              <w:fldChar w:fldCharType="begin"/>
+            </w:r>
+            <w:r>
+              <w:rPr>
+                <w:noProof/>
+                <w:webHidden/>
+              </w:rPr>
+              <w:instrText xml:space="preserve"> PAGEREF _Toc235357149 \h </w:instrText>
+            </w:r>
+            <w:r>
+              <w:rPr>
+                <w:noProof/>
+                <w:webHidden/>
+              </w:rPr>
+            </w:r>
+            <w:r>
+              <w:rPr>
+                <w:noProof/>
+                <w:webHidden/>
+              </w:rPr>
+              <w:fldChar w:fldCharType="separate"/>
+            </w:r>
+            <w:r>
+              <w:rPr>
+                <w:noProof/>
+                <w:webHidden/>
+              </w:rPr>
+              <w:t>5</w:t>
+            </w:r>
+            <w:r>
+              <w:rPr>
+                <w:noProof/>
+                <w:webHidden/>
+              </w:rPr>
+              <w:fldChar w:fldCharType="end"/>
+            </w:r>
+          </w:hyperlink>
+        </w:p>
+        <w:p>
+          <w:pPr>
+            <w:pStyle w:val="TOC2"/>
+            <w:tabs>
+              <w:tab w:val="left" w:pos="960"/>
+              <w:tab w:val="right" w:leader="dot" w:pos="9628"/>
+            </w:tabs>
+            <w:rPr>
+              <w:rFonts w:eastAsiaTheme="minorEastAsia"/>
+              <w:noProof/>
+              <w:lang w:eastAsia="en-BW"/>
+            </w:rPr>
+          </w:pPr>
+          <w:hyperlink w:anchor="_Toc235357150" w:history="1">
+            <w:r>
+              <w:rPr>
+                <w:rStyle w:val="Hyperlink"/>
+                <w:noProof/>
+                <w:lang w:val="en-US"/>
+              </w:rPr>
+              <w:t>3.2</w:t>
+            </w:r>
+            <w:r>
+              <w:rPr>
+                <w:rFonts w:eastAsiaTheme="minorEastAsia"/>
+                <w:noProof/>
+                <w:lang w:eastAsia="en-BW"/>
+              </w:rPr>
+              <w:tab/>
+            </w:r>
+            <w:r>
+              <w:rPr>
+                <w:rStyle w:val="Hyperlink"/>
+                <w:noProof/>
+                <w:lang w:val="en-US"/>
+              </w:rPr>
+              <w:t>Places of Code in MATLAB</w:t>
+            </w:r>
+            <w:r>
+              <w:rPr>
+                <w:noProof/>
+                <w:webHidden/>
+              </w:rPr>
+              <w:tab/>
+            </w:r>
+            <w:r>
+              <w:rPr>
+                <w:noProof/>
+                <w:webHidden/>
+              </w:rPr>
+              <w:fldChar w:fldCharType="begin"/>
+            </w:r>
+            <w:r>
+              <w:rPr>
+                <w:noProof/>
+                <w:webHidden/>
+              </w:rPr>
+              <w:instrText xml:space="preserve"> PAGEREF _Toc235357150 \h </w:instrText>
+            </w:r>
+            <w:r>
+              <w:rPr>
+                <w:noProof/>
+                <w:webHidden/>
+              </w:rPr>
+            </w:r>
+            <w:r>
+              <w:rPr>
+                <w:noProof/>
+                <w:webHidden/>
+              </w:rPr>
+              <w:fldChar w:fldCharType="separate"/>
+            </w:r>
+            <w:r>
+              <w:rPr>
+                <w:noProof/>
+                <w:webHidden/>
+              </w:rPr>
+              <w:t>6</w:t>
+            </w:r>
+            <w:r>
+              <w:rPr>
+                <w:noProof/>
+                <w:webHidden/>
+              </w:rPr>
+              <w:fldChar w:fldCharType="end"/>
+            </w:r>
+          </w:hyperlink>
+        </w:p>
+        <w:p>
+          <w:pPr>
+            <w:pStyle w:val="TOC3"/>
+            <w:tabs>
+              <w:tab w:val="left" w:pos="1440"/>
+              <w:tab w:val="right" w:leader="dot" w:pos="9628"/>
+            </w:tabs>
+            <w:rPr>
+              <w:rFonts w:eastAsiaTheme="minorEastAsia"/>
+              <w:noProof/>
+              <w:lang w:eastAsia="en-BW"/>
+            </w:rPr>
+          </w:pPr>
+          <w:hyperlink w:anchor="_Toc235357151" w:history="1">
+            <w:r>
+              <w:rPr>
+                <w:rStyle w:val="Hyperlink"/>
+                <w:noProof/>
+                <w:lang w:val="en-US"/>
+              </w:rPr>
+              <w:t>3.2.1</w:t>
+            </w:r>
+            <w:r>
+              <w:rPr>
+                <w:rFonts w:eastAsiaTheme="minorEastAsia"/>
+                <w:noProof/>
+                <w:lang w:eastAsia="en-BW"/>
+              </w:rPr>
+              <w:tab/>
+            </w:r>
+            <w:r>
+              <w:rPr>
+                <w:rStyle w:val="Hyperlink"/>
+                <w:noProof/>
+                <w:lang w:val="en-US"/>
+              </w:rPr>
+              <w:t>Interactive Command Interfaces</w:t>
+            </w:r>
+            <w:r>
+              <w:rPr>
+                <w:noProof/>
+                <w:webHidden/>
+              </w:rPr>
+              <w:tab/>
+            </w:r>
+            <w:r>
+              <w:rPr>
+                <w:noProof/>
+                <w:webHidden/>
+              </w:rPr>
+              <w:fldChar w:fldCharType="begin"/>
+            </w:r>
+            <w:r>
+              <w:rPr>
+                <w:noProof/>
+                <w:webHidden/>
+              </w:rPr>
+              <w:instrText xml:space="preserve"> PAGEREF _Toc235357151 \h </w:instrText>
+            </w:r>
+            <w:r>
+              <w:rPr>
+                <w:noProof/>
+                <w:webHidden/>
+              </w:rPr>
+            </w:r>
+            <w:r>
+              <w:rPr>
+                <w:noProof/>
+                <w:webHidden/>
+              </w:rPr>
+              <w:fldChar w:fldCharType="separate"/>
+            </w:r>
+            <w:r>
+              <w:rPr>
+                <w:noProof/>
+                <w:webHidden/>
+              </w:rPr>
+              <w:t>6</w:t>
+            </w:r>
+            <w:r>
+              <w:rPr>
+                <w:noProof/>
+                <w:webHidden/>
+              </w:rPr>
+              <w:fldChar w:fldCharType="end"/>
+            </w:r>
+          </w:hyperlink>
+        </w:p>
+        <w:p>
+          <w:pPr>
+            <w:pStyle w:val="TOC3"/>
+            <w:tabs>
+              <w:tab w:val="left" w:pos="1440"/>
+              <w:tab w:val="right" w:leader="dot" w:pos="9628"/>
+            </w:tabs>
+            <w:rPr>
+              <w:rFonts w:eastAsiaTheme="minorEastAsia"/>
+              <w:noProof/>
+              <w:lang w:eastAsia="en-BW"/>
+            </w:rPr>
+          </w:pPr>
+          <w:hyperlink w:anchor="_Toc235357152" w:history="1">
+            <w:r>
+              <w:rPr>
+                <w:rStyle w:val="Hyperlink"/>
+                <w:noProof/>
+                <w:lang w:val="en-US"/>
+              </w:rPr>
+              <w:t>3.2.2</w:t>
+            </w:r>
+            <w:r>
+              <w:rPr>
+                <w:rFonts w:eastAsiaTheme="minorEastAsia"/>
+                <w:noProof/>
+                <w:lang w:eastAsia="en-BW"/>
+              </w:rPr>
+              <w:tab/>
+            </w:r>
+            <w:r>
+              <w:rPr>
+                <w:rStyle w:val="Hyperlink"/>
+                <w:noProof/>
+                <w:lang w:val="en-US"/>
+              </w:rPr>
+              <w:t>Standard Code Files</w:t>
+            </w:r>
+            <w:r>
+              <w:rPr>
+                <w:noProof/>
+                <w:webHidden/>
+              </w:rPr>
+              <w:tab/>
+            </w:r>
+            <w:r>
+              <w:rPr>
+                <w:noProof/>
+                <w:webHidden/>
+              </w:rPr>
+              <w:fldChar w:fldCharType="begin"/>
+            </w:r>
+            <w:r>
+              <w:rPr>
+                <w:noProof/>
+                <w:webHidden/>
+              </w:rPr>
+              <w:instrText xml:space="preserve"> PAGEREF _Toc235357152 \h </w:instrText>
+            </w:r>
+            <w:r>
+              <w:rPr>
+                <w:noProof/>
+                <w:webHidden/>
+              </w:rPr>
+            </w:r>
+            <w:r>
+              <w:rPr>
+                <w:noProof/>
+                <w:webHidden/>
+              </w:rPr>
+              <w:fldChar w:fldCharType="separate"/>
+            </w:r>
+            <w:r>
+              <w:rPr>
+                <w:noProof/>
+                <w:webHidden/>
+              </w:rPr>
+              <w:t>6</w:t>
+            </w:r>
+            <w:r>
+              <w:rPr>
+                <w:noProof/>
+                <w:webHidden/>
+              </w:rPr>
+              <w:fldChar w:fldCharType="end"/>
+            </w:r>
+          </w:hyperlink>
+        </w:p>
+        <w:p>
+          <w:pPr>
+            <w:pStyle w:val="TOC3"/>
+            <w:tabs>
+              <w:tab w:val="left" w:pos="1440"/>
+              <w:tab w:val="right" w:leader="dot" w:pos="9628"/>
+            </w:tabs>
+            <w:rPr>
+              <w:rFonts w:eastAsiaTheme="minorEastAsia"/>
+              <w:noProof/>
+              <w:lang w:eastAsia="en-BW"/>
+            </w:rPr>
+          </w:pPr>
+          <w:hyperlink w:anchor="_Toc235357153" w:history="1">
+            <w:r>
+              <w:rPr>
+                <w:rStyle w:val="Hyperlink"/>
+                <w:noProof/>
+                <w:lang w:val="en-US"/>
+              </w:rPr>
+              <w:t>3.2.3</w:t>
+            </w:r>
+            <w:r>
+              <w:rPr>
+                <w:rFonts w:eastAsiaTheme="minorEastAsia"/>
+                <w:noProof/>
+                <w:lang w:eastAsia="en-BW"/>
+              </w:rPr>
+              <w:tab/>
+            </w:r>
+            <w:r>
+              <w:rPr>
+                <w:rStyle w:val="Hyperlink"/>
+                <w:noProof/>
+                <w:lang w:val="en-US"/>
+              </w:rPr>
+              <w:t>Notebooks and Interactive Apps</w:t>
+            </w:r>
+            <w:r>
+              <w:rPr>
+                <w:noProof/>
+                <w:webHidden/>
+              </w:rPr>
+              <w:tab/>
+            </w:r>
+            <w:r>
+              <w:rPr>
+                <w:noProof/>
+                <w:webHidden/>
+              </w:rPr>
+              <w:fldChar w:fldCharType="begin"/>
+            </w:r>
+            <w:r>
+              <w:rPr>
+                <w:noProof/>
+                <w:webHidden/>
+              </w:rPr>
+              <w:instrText xml:space="preserve"> PAGEREF _Toc235357153 \h </w:instrText>
+            </w:r>
+            <w:r>
+              <w:rPr>
+                <w:noProof/>
+                <w:webHidden/>
+              </w:rPr>
+            </w:r>
+            <w:r>
+              <w:rPr>
+                <w:noProof/>
+                <w:webHidden/>
+              </w:rPr>
+              <w:fldChar w:fldCharType="separate"/>
+            </w:r>
+            <w:r>
+              <w:rPr>
+                <w:noProof/>
+                <w:webHidden/>
+              </w:rPr>
+              <w:t>7</w:t>
+            </w:r>
+            <w:r>
+              <w:rPr>
+                <w:noProof/>
+                <w:webHidden/>
+              </w:rPr>
+              <w:fldChar w:fldCharType="end"/>
+            </w:r>
+          </w:hyperlink>
+        </w:p>
+        <w:p>
+          <w:pPr>
+            <w:pStyle w:val="TOC3"/>
+            <w:tabs>
+              <w:tab w:val="left" w:pos="1440"/>
+              <w:tab w:val="right" w:leader="dot" w:pos="9628"/>
+            </w:tabs>
+            <w:rPr>
+              <w:rFonts w:eastAsiaTheme="minorEastAsia"/>
+              <w:noProof/>
+              <w:lang w:eastAsia="en-BW"/>
+            </w:rPr>
+          </w:pPr>
+          <w:hyperlink w:anchor="_Toc235357154" w:history="1">
+            <w:r>
+              <w:rPr>
+                <w:rStyle w:val="Hyperlink"/>
+                <w:noProof/>
+                <w:lang w:val="en-US"/>
+              </w:rPr>
+              <w:t>3.2.4</w:t>
+            </w:r>
+            <w:r>
+              <w:rPr>
+                <w:rFonts w:eastAsiaTheme="minorEastAsia"/>
+                <w:noProof/>
+                <w:lang w:eastAsia="en-BW"/>
+              </w:rPr>
+              <w:tab/>
+            </w:r>
+            <w:r>
+              <w:rPr>
+                <w:rStyle w:val="Hyperlink"/>
+                <w:noProof/>
+                <w:lang w:val="en-US"/>
+              </w:rPr>
+              <w:t>Hardware and Visual Environments</w:t>
+            </w:r>
+            <w:r>
+              <w:rPr>
+                <w:noProof/>
+                <w:webHidden/>
+              </w:rPr>
+              <w:tab/>
+            </w:r>
+            <w:r>
+              <w:rPr>
+                <w:noProof/>
+                <w:webHidden/>
+              </w:rPr>
+              <w:fldChar w:fldCharType="begin"/>
+            </w:r>
+            <w:r>
+              <w:rPr>
+                <w:noProof/>
+                <w:webHidden/>
+              </w:rPr>
+              <w:instrText xml:space="preserve"> PAGEREF _Toc235357154 \h </w:instrText>
+            </w:r>
+            <w:r>
+              <w:rPr>
+                <w:noProof/>
+                <w:webHidden/>
+              </w:rPr>
+            </w:r>
+            <w:r>
+              <w:rPr>
+                <w:noProof/>
+                <w:webHidden/>
+              </w:rPr>
+              <w:fldChar w:fldCharType="separate"/>
+            </w:r>
+            <w:r>
+              <w:rPr>
+                <w:noProof/>
+                <w:webHidden/>
+              </w:rPr>
+              <w:t>7</w:t>
+            </w:r>
+            <w:r>
+              <w:rPr>
+                <w:noProof/>
+                <w:webHidden/>
+              </w:rPr>
+              <w:fldChar w:fldCharType="end"/>
+            </w:r>
+          </w:hyperlink>
+        </w:p>
+        <w:p>
+          <w:pPr>
+            <w:pStyle w:val="TOC3"/>
+            <w:tabs>
+              <w:tab w:val="left" w:pos="1440"/>
+              <w:tab w:val="right" w:leader="dot" w:pos="9628"/>
+            </w:tabs>
+            <w:rPr>
+              <w:rFonts w:eastAsiaTheme="minorEastAsia"/>
+              <w:noProof/>
+              <w:lang w:eastAsia="en-BW"/>
+            </w:rPr>
+          </w:pPr>
+          <w:hyperlink w:anchor="_Toc235357155" w:history="1">
+            <w:r>
+              <w:rPr>
+                <w:rStyle w:val="Hyperlink"/>
+                <w:noProof/>
+                <w:lang w:val="en-US"/>
+              </w:rPr>
+              <w:t>3.2.5</w:t>
+            </w:r>
+            <w:r>
+              <w:rPr>
+                <w:rFonts w:eastAsiaTheme="minorEastAsia"/>
+                <w:noProof/>
+                <w:lang w:eastAsia="en-BW"/>
+              </w:rPr>
+              <w:tab/>
+            </w:r>
+            <w:r>
+              <w:rPr>
+                <w:rStyle w:val="Hyperlink"/>
+                <w:noProof/>
+                <w:lang w:val="en-US"/>
+              </w:rPr>
+              <w:t>Outside MATLAB</w:t>
+            </w:r>
+            <w:r>
+              <w:rPr>
+                <w:noProof/>
+                <w:webHidden/>
+              </w:rPr>
+              <w:tab/>
+            </w:r>
+            <w:r>
+              <w:rPr>
+                <w:noProof/>
+                <w:webHidden/>
+              </w:rPr>
+              <w:fldChar w:fldCharType="begin"/>
+            </w:r>
+            <w:r>
+              <w:rPr>
+                <w:noProof/>
+                <w:webHidden/>
+              </w:rPr>
+              <w:instrText xml:space="preserve"> PAGEREF _Toc235357155 \h </w:instrText>
+            </w:r>
+            <w:r>
+              <w:rPr>
+                <w:noProof/>
+                <w:webHidden/>
+              </w:rPr>
+            </w:r>
+            <w:r>
+              <w:rPr>
+                <w:noProof/>
+                <w:webHidden/>
+              </w:rPr>
+              <w:fldChar w:fldCharType="separate"/>
+            </w:r>
+            <w:r>
+              <w:rPr>
+                <w:noProof/>
+                <w:webHidden/>
+              </w:rPr>
+              <w:t>7</w:t>
             </w:r>
             <w:r>
               <w:rPr>
@@ -1508,12 +2300,13 @@
           <w:lang w:val="en-US"/>
         </w:rPr>
       </w:pPr>
-      <w:bookmarkStart w:id="1" w:name="_Toc235343760"/>
+      <w:bookmarkStart w:id="1" w:name="_Toc235357131"/>
       <w:r>
         <w:rPr>
           <w:color w:val="C00000"/>
           <w:lang w:val="en-US"/>
         </w:rPr>
+        <w:lastRenderedPageBreak/>
         <w:t>Purpose of Learning MATLAB</w:t>
       </w:r>
       <w:bookmarkEnd w:id="0"/>
@@ -1533,7 +2326,7 @@
         </w:rPr>
       </w:pPr>
       <w:bookmarkStart w:id="2" w:name="_Toc235277264"/>
-      <w:bookmarkStart w:id="3" w:name="_Toc235343761"/>
+      <w:bookmarkStart w:id="3" w:name="_Toc235357132"/>
       <w:r>
         <w:rPr>
           <w:lang w:val="en-US"/>
@@ -1654,12 +2447,11 @@
           <w:lang w:val="en-US"/>
         </w:rPr>
       </w:pPr>
-      <w:bookmarkStart w:id="4" w:name="_Toc235343762"/>
-      <w:r>
-        <w:rPr>
-          <w:lang w:val="en-US"/>
-        </w:rPr>
-        <w:lastRenderedPageBreak/>
+      <w:bookmarkStart w:id="4" w:name="_Toc235357133"/>
+      <w:r>
+        <w:rPr>
+          <w:lang w:val="en-US"/>
+        </w:rPr>
         <w:t>Algorithm Design and Simulation</w:t>
       </w:r>
       <w:bookmarkEnd w:id="4"/>
@@ -1715,7 +2507,7 @@
           <w:lang w:val="en-US"/>
         </w:rPr>
       </w:pPr>
-      <w:bookmarkStart w:id="5" w:name="_Toc235343763"/>
+      <w:bookmarkStart w:id="5" w:name="_Toc235357134"/>
       <w:r>
         <w:rPr>
           <w:lang w:val="en-US"/>
@@ -1775,7 +2567,7 @@
           <w:lang w:val="en-US"/>
         </w:rPr>
       </w:pPr>
-      <w:bookmarkStart w:id="6" w:name="_Toc235343764"/>
+      <w:bookmarkStart w:id="6" w:name="_Toc235357135"/>
       <w:r>
         <w:rPr>
           <w:lang w:val="en-US"/>
@@ -1835,7 +2627,7 @@
           <w:lang w:val="en-US"/>
         </w:rPr>
       </w:pPr>
-      <w:bookmarkStart w:id="7" w:name="_Toc235343765"/>
+      <w:bookmarkStart w:id="7" w:name="_Toc235357136"/>
       <w:r>
         <w:rPr>
           <w:lang w:val="en-US"/>
@@ -1894,7 +2686,7 @@
           <w:lang w:val="en-US"/>
         </w:rPr>
       </w:pPr>
-      <w:bookmarkStart w:id="8" w:name="_Toc235343766"/>
+      <w:bookmarkStart w:id="8" w:name="_Toc235357137"/>
       <w:r>
         <w:rPr>
           <w:lang w:val="en-US"/>
@@ -1928,6 +2720,7 @@
         <w:rPr>
           <w:lang w:val="en-US"/>
         </w:rPr>
+        <w:lastRenderedPageBreak/>
         <w:t>The core reasons are:</w:t>
       </w:r>
     </w:p>
@@ -1943,7 +2736,7 @@
           <w:lang w:val="en-US"/>
         </w:rPr>
       </w:pPr>
-      <w:bookmarkStart w:id="9" w:name="_Toc235343767"/>
+      <w:bookmarkStart w:id="9" w:name="_Toc235357138"/>
       <w:r>
         <w:rPr>
           <w:lang w:val="en-US"/>
@@ -2018,7 +2811,7 @@
           <w:lang w:val="en-US"/>
         </w:rPr>
       </w:pPr>
-      <w:bookmarkStart w:id="10" w:name="_Toc235343768"/>
+      <w:bookmarkStart w:id="10" w:name="_Toc235357139"/>
       <w:r>
         <w:rPr>
           <w:lang w:val="en-US"/>
@@ -2072,7 +2865,6 @@
           <w:bCs/>
           <w:lang w:val="en-US"/>
         </w:rPr>
-        <w:lastRenderedPageBreak/>
         <w:t>Automated Qualification:</w:t>
       </w:r>
       <w:r>
@@ -2094,7 +2886,7 @@
           <w:lang w:val="en-US"/>
         </w:rPr>
       </w:pPr>
-      <w:bookmarkStart w:id="11" w:name="_Toc235343769"/>
+      <w:bookmarkStart w:id="11" w:name="_Toc235357140"/>
       <w:r>
         <w:rPr>
           <w:lang w:val="en-US"/>
@@ -2175,7 +2967,7 @@
           <w:lang w:val="en-US"/>
         </w:rPr>
       </w:pPr>
-      <w:bookmarkStart w:id="12" w:name="_Toc235343770"/>
+      <w:bookmarkStart w:id="12" w:name="_Toc235357141"/>
       <w:r>
         <w:rPr>
           <w:lang w:val="en-US"/>
@@ -2278,7 +3070,7 @@
           <w:lang w:val="en-US"/>
         </w:rPr>
       </w:pPr>
-      <w:bookmarkStart w:id="13" w:name="_Toc235343771"/>
+      <w:bookmarkStart w:id="13" w:name="_Toc235357142"/>
       <w:r>
         <w:rPr>
           <w:color w:val="C00000"/>
@@ -2327,7 +3119,7 @@
           <w:lang w:val="en-US"/>
         </w:rPr>
       </w:pPr>
-      <w:bookmarkStart w:id="14" w:name="_Toc235343772"/>
+      <w:bookmarkStart w:id="14" w:name="_Toc235357143"/>
       <w:r>
         <w:t>Command</w:t>
       </w:r>
@@ -2383,6 +3175,7 @@
         <w:rPr>
           <w:lang w:val="en-US"/>
         </w:rPr>
+        <w:lastRenderedPageBreak/>
         <w:t>Immediate Code Execution</w:t>
       </w:r>
     </w:p>
@@ -2506,7 +3299,6 @@
         <w:rPr>
           <w:lang w:val="en-US"/>
         </w:rPr>
-        <w:lastRenderedPageBreak/>
         <w:drawing>
           <wp:inline distT="0" distB="0" distL="0" distR="0" wp14:anchorId="384C6B22" wp14:editId="71B91108">
             <wp:extent cx="4313294" cy="1867062"/>
@@ -2561,7 +3353,7 @@
           <w:lang w:val="en-US"/>
         </w:rPr>
       </w:pPr>
-      <w:bookmarkStart w:id="15" w:name="_Toc235343773"/>
+      <w:bookmarkStart w:id="15" w:name="_Toc235357144"/>
       <w:r>
         <w:rPr>
           <w:lang w:val="en-US"/>
@@ -2596,7 +3388,7 @@
           <w:lang w:val="en-US"/>
         </w:rPr>
       </w:pPr>
-      <w:bookmarkStart w:id="16" w:name="_Toc235343774"/>
+      <w:bookmarkStart w:id="16" w:name="_Toc235357145"/>
       <w:r>
         <w:rPr>
           <w:lang w:val="en-US"/>
@@ -2704,7 +3496,7 @@
           <w:lang w:val="en-US"/>
         </w:rPr>
       </w:pPr>
-      <w:bookmarkStart w:id="17" w:name="_Toc235343775"/>
+      <w:bookmarkStart w:id="17" w:name="_Toc235357146"/>
       <w:r>
         <w:rPr>
           <w:lang w:val="en-US"/>
@@ -2793,6 +3585,7 @@
         <w:rPr>
           <w:lang w:val="en-US"/>
         </w:rPr>
+        <w:lastRenderedPageBreak/>
         <w:t>It looks like,</w:t>
       </w:r>
     </w:p>
@@ -2860,13 +3653,14 @@
           <w:lang w:val="en-US"/>
         </w:rPr>
       </w:pPr>
-      <w:r>
-        <w:rPr>
-          <w:lang w:val="en-US"/>
-        </w:rPr>
-        <w:lastRenderedPageBreak/>
+      <w:bookmarkStart w:id="18" w:name="_Toc235357147"/>
+      <w:r>
+        <w:rPr>
+          <w:lang w:val="en-US"/>
+        </w:rPr>
         <w:t>Current Folder</w:t>
       </w:r>
+      <w:bookmarkEnd w:id="18"/>
     </w:p>
     <w:p>
       <w:pPr>
@@ -2966,56 +3760,11 @@
           <w:lang w:val="en-US"/>
         </w:rPr>
       </w:pPr>
-    </w:p>
-    <w:p>
-      <w:pPr>
-        <w:rPr>
-          <w:lang w:val="en-US"/>
-        </w:rPr>
-      </w:pPr>
-    </w:p>
-    <w:p>
-      <w:pPr>
-        <w:jc w:val="both"/>
-        <w:rPr>
-          <w:lang w:val="en-US"/>
-        </w:rPr>
-      </w:pPr>
-    </w:p>
-    <w:p>
-      <w:pPr>
-        <w:jc w:val="both"/>
-        <w:rPr>
-          <w:lang w:val="en-US"/>
-        </w:rPr>
-      </w:pPr>
-    </w:p>
-    <w:p>
-      <w:pPr>
-        <w:jc w:val="both"/>
-        <w:rPr>
-          <w:lang w:val="en-US"/>
-        </w:rPr>
-      </w:pPr>
-      <w:r>
-        <w:rPr>
-          <w:lang w:val="en-US"/>
-        </w:rPr>
-        <w:t>Scratch Work:</w:t>
-      </w:r>
-    </w:p>
-    <w:p>
-      <w:pPr>
-        <w:jc w:val="both"/>
-        <w:rPr>
-          <w:lang w:val="en-US"/>
-        </w:rPr>
-      </w:pPr>
-      <w:r>
-        <w:rPr>
-          <w:lang w:val="en-US"/>
-        </w:rPr>
-        <w:t>Scientific notation example</w:t>
+      <w:r>
+        <w:rPr>
+          <w:lang w:val="en-US"/>
+        </w:rPr>
+        <w:t>It looks like,</w:t>
       </w:r>
     </w:p>
     <w:p>
@@ -3030,10 +3779,10 @@
           <w:lang w:val="en-US"/>
         </w:rPr>
         <w:drawing>
-          <wp:inline distT="0" distB="0" distL="0" distR="0" wp14:anchorId="15EDAD13" wp14:editId="6D8DAF44">
-            <wp:extent cx="6120130" cy="2701290"/>
-            <wp:effectExtent l="0" t="0" r="0" b="3810"/>
-            <wp:docPr id="1274898177" name="Picture 1"/>
+          <wp:inline distT="0" distB="0" distL="0" distR="0" wp14:anchorId="1B2177FE" wp14:editId="32DB7E4C">
+            <wp:extent cx="2067339" cy="1934817"/>
+            <wp:effectExtent l="19050" t="19050" r="9525" b="27940"/>
+            <wp:docPr id="94742208" name="Picture 1"/>
             <wp:cNvGraphicFramePr>
               <a:graphicFrameLocks xmlns:a="http://schemas.openxmlformats.org/drawingml/2006/main" noChangeAspect="1"/>
             </wp:cNvGraphicFramePr>
@@ -3041,7 +3790,7 @@
               <a:graphicData uri="http://schemas.openxmlformats.org/drawingml/2006/picture">
                 <pic:pic xmlns:pic="http://schemas.openxmlformats.org/drawingml/2006/picture">
                   <pic:nvPicPr>
-                    <pic:cNvPr id="1274898177" name=""/>
+                    <pic:cNvPr id="94742208" name=""/>
                     <pic:cNvPicPr/>
                   </pic:nvPicPr>
                   <pic:blipFill>
@@ -3053,11 +3802,16 @@
                   <pic:spPr>
                     <a:xfrm>
                       <a:off x="0" y="0"/>
-                      <a:ext cx="6120130" cy="2701290"/>
+                      <a:ext cx="2073692" cy="1940763"/>
                     </a:xfrm>
                     <a:prstGeom prst="rect">
                       <a:avLst/>
                     </a:prstGeom>
+                    <a:ln w="6350">
+                      <a:solidFill>
+                        <a:schemeClr val="tx1"/>
+                      </a:solidFill>
+                    </a:ln>
                   </pic:spPr>
                 </pic:pic>
               </a:graphicData>
@@ -3068,6 +3822,1198 @@
     </w:p>
     <w:p>
       <w:pPr>
+        <w:pStyle w:val="Heading1"/>
+        <w:numPr>
+          <w:ilvl w:val="0"/>
+          <w:numId w:val="14"/>
+        </w:numPr>
+        <w:ind w:left="426" w:hanging="426"/>
+        <w:rPr>
+          <w:lang w:val="en-US"/>
+        </w:rPr>
+      </w:pPr>
+      <w:bookmarkStart w:id="19" w:name="_Toc235357148"/>
+      <w:r>
+        <w:rPr>
+          <w:lang w:val="en-US"/>
+        </w:rPr>
+        <w:t>MATLAB Introduction</w:t>
+      </w:r>
+      <w:bookmarkEnd w:id="19"/>
+    </w:p>
+    <w:p>
+      <w:pPr>
+        <w:jc w:val="both"/>
+        <w:rPr>
+          <w:lang w:val="en-US"/>
+        </w:rPr>
+      </w:pPr>
+      <w:r>
+        <w:rPr>
+          <w:lang w:val="en-US"/>
+        </w:rPr>
+        <w:t xml:space="preserve">MATLAB (Matrix Laboratory) is a high-level programming language and numeric computing platform developed by MathWorks. </w:t>
+      </w:r>
+    </w:p>
+    <w:p>
+      <w:pPr>
+        <w:pStyle w:val="Heading2"/>
+        <w:numPr>
+          <w:ilvl w:val="1"/>
+          <w:numId w:val="14"/>
+        </w:numPr>
+        <w:ind w:left="709" w:hanging="709"/>
+        <w:rPr>
+          <w:lang w:val="en-US"/>
+        </w:rPr>
+      </w:pPr>
+      <w:bookmarkStart w:id="20" w:name="_Toc235357149"/>
+      <w:r>
+        <w:rPr>
+          <w:lang w:val="en-US"/>
+        </w:rPr>
+        <w:t>Scientific Notation</w:t>
+      </w:r>
+      <w:bookmarkEnd w:id="20"/>
+    </w:p>
+    <w:p>
+      <w:pPr>
+        <w:rPr>
+          <w:lang w:val="en-US"/>
+        </w:rPr>
+      </w:pPr>
+      <w:r>
+        <w:rPr>
+          <w:lang w:val="en-US"/>
+        </w:rPr>
+        <w:t>In MATLAB, scientific notation is represented using the letter ‘e’ to signify x10</w:t>
+      </w:r>
+      <w:r>
+        <w:rPr>
+          <w:vertAlign w:val="superscript"/>
+          <w:lang w:val="en-US"/>
+        </w:rPr>
+        <w:t>exponent</w:t>
+      </w:r>
+      <w:r>
+        <w:rPr>
+          <w:lang w:val="en-US"/>
+        </w:rPr>
+        <w:t>.</w:t>
+      </w:r>
+    </w:p>
+    <w:p>
+      <w:pPr>
+        <w:rPr>
+          <w:lang w:val="en-US"/>
+        </w:rPr>
+      </w:pPr>
+      <w:r>
+        <w:rPr>
+          <w:lang w:val="en-US"/>
+        </w:rPr>
+        <w:t>e.g. 2.5x10</w:t>
+      </w:r>
+      <w:r>
+        <w:rPr>
+          <w:vertAlign w:val="superscript"/>
+          <w:lang w:val="en-US"/>
+        </w:rPr>
+        <w:t>3</w:t>
+      </w:r>
+      <w:r>
+        <w:rPr>
+          <w:vertAlign w:val="superscript"/>
+          <w:lang w:val="en-US"/>
+        </w:rPr>
+        <w:t xml:space="preserve"> </w:t>
+      </w:r>
+      <w:r>
+        <w:rPr>
+          <w:lang w:val="en-US"/>
+        </w:rPr>
+        <w:t>is entered as 2.5e3</w:t>
+      </w:r>
+    </w:p>
+    <w:p>
+      <w:pPr>
+        <w:rPr>
+          <w:b/>
+          <w:bCs/>
+          <w:lang w:val="en-US"/>
+        </w:rPr>
+      </w:pPr>
+      <w:r>
+        <w:rPr>
+          <w:b/>
+          <w:bCs/>
+          <w:lang w:val="en-US"/>
+        </w:rPr>
+        <w:t>Entering Scientific Notation:</w:t>
+      </w:r>
+    </w:p>
+    <w:p>
+      <w:pPr>
+        <w:rPr>
+          <w:lang w:val="en-US"/>
+        </w:rPr>
+      </w:pPr>
+      <w:r>
+        <w:rPr>
+          <w:lang w:val="en-US"/>
+        </w:rPr>
+        <w:lastRenderedPageBreak/>
+        <w:t>You can type values directly using standard shorthand. MATLAB interprets both lowercase and uppercase ‘e’ the same way.</w:t>
+      </w:r>
+    </w:p>
+    <w:p>
+      <w:pPr>
+        <w:rPr>
+          <w:lang w:val="en-US"/>
+        </w:rPr>
+      </w:pPr>
+      <w:r>
+        <w:rPr>
+          <w:lang w:val="en-US"/>
+        </w:rPr>
+        <w:t>3.14 x 10</w:t>
+      </w:r>
+      <w:r>
+        <w:rPr>
+          <w:vertAlign w:val="superscript"/>
+          <w:lang w:val="en-US"/>
+        </w:rPr>
+        <w:t>5</w:t>
+      </w:r>
+      <w:r>
+        <w:rPr>
+          <w:lang w:val="en-US"/>
+        </w:rPr>
+        <w:t xml:space="preserve"> </w:t>
+      </w:r>
+      <w:r>
+        <w:rPr>
+          <w:lang w:val="en-US"/>
+        </w:rPr>
+        <w:sym w:font="Wingdings" w:char="F0E0"/>
+      </w:r>
+      <w:r>
+        <w:rPr>
+          <w:lang w:val="en-US"/>
+        </w:rPr>
+        <w:t xml:space="preserve"> 3.14e5</w:t>
+      </w:r>
+    </w:p>
+    <w:p>
+      <w:pPr>
+        <w:rPr>
+          <w:lang w:val="en-US"/>
+        </w:rPr>
+      </w:pPr>
+      <w:r>
+        <w:rPr>
+          <w:lang w:val="en-US"/>
+        </w:rPr>
+        <w:t>6.02 x 10</w:t>
+      </w:r>
+      <w:r>
+        <w:rPr>
+          <w:vertAlign w:val="superscript"/>
+          <w:lang w:val="en-US"/>
+        </w:rPr>
+        <w:t>-23</w:t>
+      </w:r>
+      <w:r>
+        <w:rPr>
+          <w:lang w:val="en-US"/>
+        </w:rPr>
+        <w:t xml:space="preserve"> </w:t>
+      </w:r>
+      <w:r>
+        <w:rPr>
+          <w:lang w:val="en-US"/>
+        </w:rPr>
+        <w:sym w:font="Wingdings" w:char="F0E0"/>
+      </w:r>
+      <w:r>
+        <w:rPr>
+          <w:lang w:val="en-US"/>
+        </w:rPr>
+        <w:t xml:space="preserve"> 6.02e-23</w:t>
+      </w:r>
+    </w:p>
+    <w:p>
+      <w:pPr>
+        <w:rPr>
+          <w:lang w:val="en-US"/>
+        </w:rPr>
+      </w:pPr>
+      <w:r>
+        <w:rPr>
+          <w:i/>
+          <w:iCs/>
+          <w:u w:val="single"/>
+          <w:lang w:val="en-US"/>
+        </w:rPr>
+        <w:t>Note:</w:t>
+      </w:r>
+      <w:r>
+        <w:rPr>
+          <w:lang w:val="en-US"/>
+        </w:rPr>
+        <w:t xml:space="preserve"> The ‘e’ is strictly a power-of-10 indicator. To use the mathematical constant e (Euler’s number), you must use the exp function instead (e.g., e</w:t>
+      </w:r>
+      <w:r>
+        <w:rPr>
+          <w:vertAlign w:val="superscript"/>
+          <w:lang w:val="en-US"/>
+        </w:rPr>
+        <w:t>2</w:t>
+      </w:r>
+      <w:r>
+        <w:rPr>
+          <w:lang w:val="en-US"/>
+        </w:rPr>
+        <w:t xml:space="preserve"> is written as exp(2)).</w:t>
+      </w:r>
+    </w:p>
+    <w:p>
+      <w:pPr>
+        <w:rPr>
+          <w:lang w:val="en-US"/>
+        </w:rPr>
+      </w:pPr>
+      <w:r>
+        <w:rPr>
+          <w:lang w:val="en-US"/>
+        </w:rPr>
+        <w:t>Example:</w:t>
+      </w:r>
+    </w:p>
+    <w:p>
+      <w:pPr>
+        <w:rPr>
+          <w:lang w:val="en-US"/>
+        </w:rPr>
+      </w:pPr>
+      <w:r>
+        <w:rPr>
+          <w:lang w:val="en-US"/>
+        </w:rPr>
+        <w:drawing>
+          <wp:inline distT="0" distB="0" distL="0" distR="0" wp14:anchorId="48BA1E08" wp14:editId="28E6499F">
+            <wp:extent cx="3101609" cy="1943268"/>
+            <wp:effectExtent l="19050" t="19050" r="22860" b="19050"/>
+            <wp:docPr id="876318390" name="Picture 1"/>
+            <wp:cNvGraphicFramePr>
+              <a:graphicFrameLocks xmlns:a="http://schemas.openxmlformats.org/drawingml/2006/main" noChangeAspect="1"/>
+            </wp:cNvGraphicFramePr>
+            <a:graphic xmlns:a="http://schemas.openxmlformats.org/drawingml/2006/main">
+              <a:graphicData uri="http://schemas.openxmlformats.org/drawingml/2006/picture">
+                <pic:pic xmlns:pic="http://schemas.openxmlformats.org/drawingml/2006/picture">
+                  <pic:nvPicPr>
+                    <pic:cNvPr id="876318390" name=""/>
+                    <pic:cNvPicPr/>
+                  </pic:nvPicPr>
+                  <pic:blipFill>
+                    <a:blip r:embed="rId11"/>
+                    <a:stretch>
+                      <a:fillRect/>
+                    </a:stretch>
+                  </pic:blipFill>
+                  <pic:spPr>
+                    <a:xfrm>
+                      <a:off x="0" y="0"/>
+                      <a:ext cx="3101609" cy="1943268"/>
+                    </a:xfrm>
+                    <a:prstGeom prst="rect">
+                      <a:avLst/>
+                    </a:prstGeom>
+                    <a:ln w="6350">
+                      <a:solidFill>
+                        <a:schemeClr val="tx1"/>
+                      </a:solidFill>
+                    </a:ln>
+                  </pic:spPr>
+                </pic:pic>
+              </a:graphicData>
+            </a:graphic>
+          </wp:inline>
+        </w:drawing>
+      </w:r>
+    </w:p>
+    <w:p>
+      <w:pPr>
+        <w:pStyle w:val="Heading2"/>
+        <w:numPr>
+          <w:ilvl w:val="1"/>
+          <w:numId w:val="14"/>
+        </w:numPr>
+        <w:ind w:left="709" w:hanging="709"/>
+        <w:rPr>
+          <w:lang w:val="en-US"/>
+        </w:rPr>
+      </w:pPr>
+      <w:bookmarkStart w:id="21" w:name="_Toc235357150"/>
+      <w:r>
+        <w:rPr>
+          <w:lang w:val="en-US"/>
+        </w:rPr>
+        <w:t>Places of Code in MATLAB</w:t>
+      </w:r>
+      <w:bookmarkEnd w:id="21"/>
+    </w:p>
+    <w:p>
+      <w:pPr>
+        <w:jc w:val="both"/>
+        <w:rPr>
+          <w:lang w:val="en-US"/>
+        </w:rPr>
+      </w:pPr>
+      <w:r>
+        <w:rPr>
+          <w:lang w:val="en-US"/>
+        </w:rPr>
+        <w:t>In MATLAB, there are several distinct places where you can write, run, and store code depending on whether you want a quick calculation, a reusable program, an interactive notebook, or a graphical interface.</w:t>
+      </w:r>
+    </w:p>
+    <w:p>
+      <w:pPr>
+        <w:pStyle w:val="Heading3"/>
+        <w:numPr>
+          <w:ilvl w:val="2"/>
+          <w:numId w:val="14"/>
+        </w:numPr>
+        <w:ind w:left="709"/>
+        <w:jc w:val="both"/>
+        <w:rPr>
+          <w:lang w:val="en-US"/>
+        </w:rPr>
+      </w:pPr>
+      <w:bookmarkStart w:id="22" w:name="_Toc235357151"/>
+      <w:r>
+        <w:rPr>
+          <w:lang w:val="en-US"/>
+        </w:rPr>
+        <w:t>Interactive Command Interfaces</w:t>
+      </w:r>
+      <w:bookmarkEnd w:id="22"/>
+    </w:p>
+    <w:p>
+      <w:pPr>
+        <w:pStyle w:val="ListParagraph"/>
+        <w:numPr>
+          <w:ilvl w:val="0"/>
+          <w:numId w:val="4"/>
+        </w:numPr>
+        <w:jc w:val="both"/>
+        <w:rPr>
+          <w:b/>
+          <w:bCs/>
+          <w:lang w:val="en-US"/>
+        </w:rPr>
+      </w:pPr>
+      <w:r>
+        <w:rPr>
+          <w:b/>
+          <w:bCs/>
+          <w:lang w:val="en-US"/>
+        </w:rPr>
+        <w:t xml:space="preserve">Command Window: </w:t>
+      </w:r>
+    </w:p>
+    <w:p>
+      <w:pPr>
+        <w:pStyle w:val="ListParagraph"/>
+        <w:numPr>
+          <w:ilvl w:val="1"/>
+          <w:numId w:val="4"/>
+        </w:numPr>
+        <w:jc w:val="both"/>
+        <w:rPr>
+          <w:lang w:val="en-US"/>
+        </w:rPr>
+      </w:pPr>
+      <w:r>
+        <w:rPr>
+          <w:lang w:val="en-US"/>
+        </w:rPr>
+        <w:t>The immediate, interactive prompt (&gt;&gt;) where you can type code and see results instantly.</w:t>
+      </w:r>
+    </w:p>
+    <w:p>
+      <w:pPr>
+        <w:pStyle w:val="ListParagraph"/>
+        <w:numPr>
+          <w:ilvl w:val="1"/>
+          <w:numId w:val="4"/>
+        </w:numPr>
+        <w:jc w:val="both"/>
+        <w:rPr>
+          <w:lang w:val="en-US"/>
+        </w:rPr>
+      </w:pPr>
+      <w:r>
+        <w:rPr>
+          <w:lang w:val="en-US"/>
+        </w:rPr>
+        <w:t>It is ideal for quick mathematical tests, debugging, or issuing single commands.</w:t>
+      </w:r>
+    </w:p>
+    <w:p>
+      <w:pPr>
+        <w:pStyle w:val="ListParagraph"/>
+        <w:numPr>
+          <w:ilvl w:val="1"/>
+          <w:numId w:val="4"/>
+        </w:numPr>
+        <w:jc w:val="both"/>
+        <w:rPr>
+          <w:lang w:val="en-US"/>
+        </w:rPr>
+      </w:pPr>
+      <w:r>
+        <w:rPr>
+          <w:lang w:val="en-US"/>
+        </w:rPr>
+        <w:t xml:space="preserve">Code entered here is lost once </w:t>
+      </w:r>
+      <w:r>
+        <w:rPr>
+          <w:lang w:val="en-US"/>
+        </w:rPr>
+        <w:t>MATLAB closes unless saved to history.</w:t>
+      </w:r>
+    </w:p>
+    <w:p>
+      <w:pPr>
+        <w:pStyle w:val="Heading3"/>
+        <w:numPr>
+          <w:ilvl w:val="2"/>
+          <w:numId w:val="14"/>
+        </w:numPr>
+        <w:ind w:left="709"/>
+        <w:jc w:val="both"/>
+        <w:rPr>
+          <w:lang w:val="en-US"/>
+        </w:rPr>
+      </w:pPr>
+      <w:bookmarkStart w:id="23" w:name="_Toc235357152"/>
+      <w:r>
+        <w:rPr>
+          <w:lang w:val="en-US"/>
+        </w:rPr>
+        <w:t>Standard Code Files</w:t>
+      </w:r>
+      <w:bookmarkEnd w:id="23"/>
+    </w:p>
+    <w:p>
+      <w:pPr>
+        <w:pStyle w:val="ListParagraph"/>
+        <w:numPr>
+          <w:ilvl w:val="0"/>
+          <w:numId w:val="4"/>
+        </w:numPr>
+        <w:jc w:val="both"/>
+        <w:rPr>
+          <w:b/>
+          <w:bCs/>
+          <w:lang w:val="en-US"/>
+        </w:rPr>
+      </w:pPr>
+      <w:r>
+        <w:rPr>
+          <w:b/>
+          <w:bCs/>
+          <w:lang w:val="en-US"/>
+        </w:rPr>
+        <w:t xml:space="preserve">The Editor (Scripts): </w:t>
+      </w:r>
+    </w:p>
+    <w:p>
+      <w:pPr>
+        <w:pStyle w:val="ListParagraph"/>
+        <w:numPr>
+          <w:ilvl w:val="1"/>
+          <w:numId w:val="4"/>
+        </w:numPr>
+        <w:jc w:val="both"/>
+        <w:rPr>
+          <w:lang w:val="en-US"/>
+        </w:rPr>
+      </w:pPr>
+      <w:r>
+        <w:rPr>
+          <w:lang w:val="en-US"/>
+        </w:rPr>
+        <w:t xml:space="preserve">Used for creating plain-text </w:t>
+      </w:r>
+      <w:r>
+        <w:rPr>
+          <w:color w:val="EE0000"/>
+          <w:highlight w:val="lightGray"/>
+          <w:lang w:val="en-US"/>
+        </w:rPr>
+        <w:t>‘.m’</w:t>
+      </w:r>
+      <w:r>
+        <w:rPr>
+          <w:lang w:val="en-US"/>
+        </w:rPr>
+        <w:t xml:space="preserve"> files containing consecutive lines of code.</w:t>
+      </w:r>
+    </w:p>
+    <w:p>
+      <w:pPr>
+        <w:pStyle w:val="ListParagraph"/>
+        <w:numPr>
+          <w:ilvl w:val="1"/>
+          <w:numId w:val="4"/>
+        </w:numPr>
+        <w:jc w:val="both"/>
+        <w:rPr>
+          <w:lang w:val="en-US"/>
+        </w:rPr>
+      </w:pPr>
+      <w:r>
+        <w:rPr>
+          <w:lang w:val="en-US"/>
+        </w:rPr>
+        <w:t>These allow you to organize inputs, mathematical processes, and outputs into a permanent file.</w:t>
+      </w:r>
+    </w:p>
+    <w:p>
+      <w:pPr>
+        <w:pStyle w:val="ListParagraph"/>
+        <w:numPr>
+          <w:ilvl w:val="0"/>
+          <w:numId w:val="4"/>
+        </w:numPr>
+        <w:jc w:val="both"/>
+        <w:rPr>
+          <w:b/>
+          <w:bCs/>
+          <w:lang w:val="en-US"/>
+        </w:rPr>
+      </w:pPr>
+      <w:r>
+        <w:rPr>
+          <w:b/>
+          <w:bCs/>
+          <w:lang w:val="en-US"/>
+        </w:rPr>
+        <w:t>Functions:</w:t>
+      </w:r>
+    </w:p>
+    <w:p>
+      <w:pPr>
+        <w:pStyle w:val="ListParagraph"/>
+        <w:numPr>
+          <w:ilvl w:val="1"/>
+          <w:numId w:val="4"/>
+        </w:numPr>
+        <w:jc w:val="both"/>
+        <w:rPr>
+          <w:lang w:val="en-US"/>
+        </w:rPr>
+      </w:pPr>
+      <w:r>
+        <w:rPr>
+          <w:lang w:val="en-US"/>
+        </w:rPr>
+        <w:t xml:space="preserve">Specialized </w:t>
+      </w:r>
+      <w:r>
+        <w:rPr>
+          <w:color w:val="EE0000"/>
+          <w:highlight w:val="lightGray"/>
+          <w:lang w:val="en-US"/>
+        </w:rPr>
+        <w:t>‘.m’</w:t>
+      </w:r>
+      <w:r>
+        <w:rPr>
+          <w:lang w:val="en-US"/>
+        </w:rPr>
+        <w:t xml:space="preserve"> files that accept inputs and return calculated outputs.</w:t>
+      </w:r>
+    </w:p>
+    <w:p>
+      <w:pPr>
+        <w:pStyle w:val="ListParagraph"/>
+        <w:numPr>
+          <w:ilvl w:val="1"/>
+          <w:numId w:val="4"/>
+        </w:numPr>
+        <w:jc w:val="both"/>
+        <w:rPr>
+          <w:lang w:val="en-US"/>
+        </w:rPr>
+      </w:pPr>
+      <w:r>
+        <w:rPr>
+          <w:lang w:val="en-US"/>
+        </w:rPr>
+        <w:t>They maintain their own isolated variables, keeping your primary workspace clean.</w:t>
+      </w:r>
+    </w:p>
+    <w:p>
+      <w:pPr>
+        <w:pStyle w:val="ListParagraph"/>
+        <w:numPr>
+          <w:ilvl w:val="0"/>
+          <w:numId w:val="4"/>
+        </w:numPr>
+        <w:jc w:val="both"/>
+        <w:rPr>
+          <w:b/>
+          <w:bCs/>
+          <w:lang w:val="en-US"/>
+        </w:rPr>
+      </w:pPr>
+      <w:r>
+        <w:rPr>
+          <w:b/>
+          <w:bCs/>
+          <w:lang w:val="en-US"/>
+        </w:rPr>
+        <w:t>Class Definitions:</w:t>
+      </w:r>
+    </w:p>
+    <w:p>
+      <w:pPr>
+        <w:pStyle w:val="ListParagraph"/>
+        <w:numPr>
+          <w:ilvl w:val="1"/>
+          <w:numId w:val="4"/>
+        </w:numPr>
+        <w:jc w:val="both"/>
+        <w:rPr>
+          <w:lang w:val="en-US"/>
+        </w:rPr>
+      </w:pPr>
+      <w:r>
+        <w:rPr>
+          <w:lang w:val="en-US"/>
+        </w:rPr>
+        <w:lastRenderedPageBreak/>
+        <w:t xml:space="preserve">Object-oriented code files starting with the </w:t>
+      </w:r>
+      <w:r>
+        <w:rPr>
+          <w:highlight w:val="lightGray"/>
+          <w:lang w:val="en-US"/>
+        </w:rPr>
+        <w:t>classdef</w:t>
+      </w:r>
+      <w:r>
+        <w:rPr>
+          <w:lang w:val="en-US"/>
+        </w:rPr>
+        <w:t xml:space="preserve"> keyword.</w:t>
+      </w:r>
+    </w:p>
+    <w:p>
+      <w:pPr>
+        <w:pStyle w:val="ListParagraph"/>
+        <w:numPr>
+          <w:ilvl w:val="1"/>
+          <w:numId w:val="4"/>
+        </w:numPr>
+        <w:jc w:val="both"/>
+        <w:rPr>
+          <w:lang w:val="en-US"/>
+        </w:rPr>
+      </w:pPr>
+      <w:r>
+        <w:rPr>
+          <w:lang w:val="en-US"/>
+        </w:rPr>
+        <w:t>These are structured to group data properties and specialized functions together.</w:t>
+      </w:r>
+    </w:p>
+    <w:p>
+      <w:pPr>
+        <w:pStyle w:val="Heading3"/>
+        <w:numPr>
+          <w:ilvl w:val="2"/>
+          <w:numId w:val="14"/>
+        </w:numPr>
+        <w:ind w:left="709"/>
+        <w:rPr>
+          <w:lang w:val="en-US"/>
+        </w:rPr>
+      </w:pPr>
+      <w:bookmarkStart w:id="24" w:name="_Toc235357153"/>
+      <w:r>
+        <w:rPr>
+          <w:lang w:val="en-US"/>
+        </w:rPr>
+        <w:t>Notebooks and Interactive Apps</w:t>
+      </w:r>
+      <w:bookmarkEnd w:id="24"/>
+    </w:p>
+    <w:p>
+      <w:pPr>
+        <w:pStyle w:val="ListParagraph"/>
+        <w:numPr>
+          <w:ilvl w:val="0"/>
+          <w:numId w:val="4"/>
+        </w:numPr>
+        <w:jc w:val="both"/>
+        <w:rPr>
+          <w:lang w:val="en-US"/>
+        </w:rPr>
+      </w:pPr>
+      <w:r>
+        <w:rPr>
+          <w:lang w:val="en-US"/>
+        </w:rPr>
+        <w:t>The Live Editor (Live Scripts):</w:t>
+      </w:r>
+    </w:p>
+    <w:p>
+      <w:pPr>
+        <w:pStyle w:val="ListParagraph"/>
+        <w:numPr>
+          <w:ilvl w:val="1"/>
+          <w:numId w:val="4"/>
+        </w:numPr>
+        <w:jc w:val="both"/>
+        <w:rPr>
+          <w:lang w:val="en-US"/>
+        </w:rPr>
+      </w:pPr>
+      <w:r>
+        <w:rPr>
+          <w:lang w:val="en-US"/>
+        </w:rPr>
+        <w:t xml:space="preserve">Used for creating </w:t>
+      </w:r>
+      <w:r>
+        <w:rPr>
+          <w:color w:val="EE0000"/>
+          <w:highlight w:val="lightGray"/>
+          <w:lang w:val="en-US"/>
+        </w:rPr>
+        <w:t>‘.m</w:t>
+      </w:r>
+      <w:r>
+        <w:rPr>
+          <w:color w:val="EE0000"/>
+          <w:highlight w:val="lightGray"/>
+          <w:lang w:val="en-US"/>
+        </w:rPr>
+        <w:t>lx</w:t>
+      </w:r>
+      <w:r>
+        <w:rPr>
+          <w:color w:val="EE0000"/>
+          <w:highlight w:val="lightGray"/>
+          <w:lang w:val="en-US"/>
+        </w:rPr>
+        <w:t>’</w:t>
+      </w:r>
+      <w:r>
+        <w:rPr>
+          <w:lang w:val="en-US"/>
+        </w:rPr>
+        <w:t xml:space="preserve"> files. </w:t>
+      </w:r>
+    </w:p>
+    <w:p>
+      <w:pPr>
+        <w:pStyle w:val="ListParagraph"/>
+        <w:numPr>
+          <w:ilvl w:val="1"/>
+          <w:numId w:val="4"/>
+        </w:numPr>
+        <w:jc w:val="both"/>
+        <w:rPr>
+          <w:lang w:val="en-US"/>
+        </w:rPr>
+      </w:pPr>
+      <w:r>
+        <w:rPr>
+          <w:lang w:val="en-US"/>
+        </w:rPr>
+        <w:t>These interactive notebooks let you blend executable MATLAB code with formatted text, mathematical equations, images, and live, embedded graphics.</w:t>
+      </w:r>
+    </w:p>
+    <w:p>
+      <w:pPr>
+        <w:pStyle w:val="Heading3"/>
+        <w:numPr>
+          <w:ilvl w:val="2"/>
+          <w:numId w:val="14"/>
+        </w:numPr>
+        <w:ind w:left="709"/>
+        <w:rPr>
+          <w:lang w:val="en-US"/>
+        </w:rPr>
+      </w:pPr>
+      <w:bookmarkStart w:id="25" w:name="_Toc235357154"/>
+      <w:r>
+        <w:rPr>
+          <w:lang w:val="en-US"/>
+        </w:rPr>
+        <w:t>Hardware and Visual Environments</w:t>
+      </w:r>
+      <w:bookmarkEnd w:id="25"/>
+    </w:p>
+    <w:p>
+      <w:pPr>
+        <w:pStyle w:val="ListParagraph"/>
+        <w:numPr>
+          <w:ilvl w:val="0"/>
+          <w:numId w:val="4"/>
+        </w:numPr>
+        <w:jc w:val="both"/>
+        <w:rPr>
+          <w:lang w:val="en-US"/>
+        </w:rPr>
+      </w:pPr>
+      <w:r>
+        <w:rPr>
+          <w:lang w:val="en-US"/>
+        </w:rPr>
+        <w:t>Simulink &amp; MATLAB Function Blocks:</w:t>
+      </w:r>
+    </w:p>
+    <w:p>
+      <w:pPr>
+        <w:pStyle w:val="ListParagraph"/>
+        <w:numPr>
+          <w:ilvl w:val="1"/>
+          <w:numId w:val="4"/>
+        </w:numPr>
+        <w:jc w:val="both"/>
+        <w:rPr>
+          <w:lang w:val="en-US"/>
+        </w:rPr>
+      </w:pPr>
+      <w:r>
+        <w:rPr>
+          <w:lang w:val="en-US"/>
+        </w:rPr>
+        <w:t xml:space="preserve">Within the graphical </w:t>
+      </w:r>
+      <w:r>
+        <w:rPr>
+          <w:lang w:val="en-US"/>
+        </w:rPr>
+        <w:t>environment of Simulink, you can drag and drop a “MATLAB Function” block.</w:t>
+      </w:r>
+    </w:p>
+    <w:p>
+      <w:pPr>
+        <w:pStyle w:val="ListParagraph"/>
+        <w:numPr>
+          <w:ilvl w:val="1"/>
+          <w:numId w:val="4"/>
+        </w:numPr>
+        <w:jc w:val="both"/>
+        <w:rPr>
+          <w:lang w:val="en-US"/>
+        </w:rPr>
+      </w:pPr>
+      <w:r>
+        <w:rPr>
+          <w:lang w:val="en-US"/>
+        </w:rPr>
+        <w:t>Double-clicking this block opens and embedded text editor where you write code directly inside the visual system model.</w:t>
+      </w:r>
+    </w:p>
+    <w:p>
+      <w:pPr>
+        <w:pStyle w:val="Heading3"/>
+        <w:numPr>
+          <w:ilvl w:val="2"/>
+          <w:numId w:val="14"/>
+        </w:numPr>
+        <w:ind w:left="709"/>
+        <w:rPr>
+          <w:lang w:val="en-US"/>
+        </w:rPr>
+      </w:pPr>
+      <w:bookmarkStart w:id="26" w:name="_Toc235357155"/>
+      <w:r>
+        <w:rPr>
+          <w:lang w:val="en-US"/>
+        </w:rPr>
+        <w:t>Outside MATLAB</w:t>
+      </w:r>
+      <w:bookmarkEnd w:id="26"/>
+    </w:p>
+    <w:p>
+      <w:pPr>
+        <w:pStyle w:val="ListParagraph"/>
+        <w:numPr>
+          <w:ilvl w:val="0"/>
+          <w:numId w:val="4"/>
+        </w:numPr>
+        <w:rPr>
+          <w:lang w:val="en-US"/>
+        </w:rPr>
+      </w:pPr>
+      <w:r>
+        <w:rPr>
+          <w:lang w:val="en-US"/>
+        </w:rPr>
+        <w:t xml:space="preserve">External Editors: </w:t>
+      </w:r>
+    </w:p>
+    <w:p>
+      <w:pPr>
+        <w:pStyle w:val="ListParagraph"/>
+        <w:numPr>
+          <w:ilvl w:val="1"/>
+          <w:numId w:val="4"/>
+        </w:numPr>
+        <w:rPr>
+          <w:lang w:val="en-US"/>
+        </w:rPr>
+      </w:pPr>
+      <w:r>
+        <w:rPr>
+          <w:lang w:val="en-US"/>
+        </w:rPr>
+        <w:t>If you do not want to use the native desktop client, you can write and run files using the official MATLAB extension for Visual Studio Code.</w:t>
+      </w:r>
+    </w:p>
+    <w:p>
+      <w:pPr>
+        <w:pStyle w:val="Heading3"/>
+        <w:numPr>
+          <w:ilvl w:val="2"/>
+          <w:numId w:val="14"/>
+        </w:numPr>
+        <w:ind w:left="709"/>
+        <w:rPr>
+          <w:lang w:val="en-US"/>
+        </w:rPr>
+      </w:pPr>
+      <w:r>
+        <w:rPr>
+          <w:lang w:val="en-US"/>
+        </w:rPr>
+        <w:t>MATLAB File Extension</w:t>
+      </w:r>
+    </w:p>
+    <w:p>
+      <w:pPr>
+        <w:rPr>
+          <w:lang w:val="en-US"/>
+        </w:rPr>
+      </w:pPr>
+      <w:r>
+        <w:drawing>
+          <wp:inline distT="0" distB="0" distL="0" distR="0" wp14:anchorId="362D23D4" wp14:editId="43AA2D2D">
+            <wp:extent cx="6120130" cy="1794510"/>
+            <wp:effectExtent l="0" t="0" r="0" b="0"/>
+            <wp:docPr id="1701294901" name="Picture 1"/>
+            <wp:cNvGraphicFramePr>
+              <a:graphicFrameLocks xmlns:a="http://schemas.openxmlformats.org/drawingml/2006/main" noChangeAspect="1"/>
+            </wp:cNvGraphicFramePr>
+            <a:graphic xmlns:a="http://schemas.openxmlformats.org/drawingml/2006/main">
+              <a:graphicData uri="http://schemas.openxmlformats.org/drawingml/2006/picture">
+                <pic:pic xmlns:pic="http://schemas.openxmlformats.org/drawingml/2006/picture">
+                  <pic:nvPicPr>
+                    <pic:cNvPr id="0" name="Picture 1"/>
+                    <pic:cNvPicPr>
+                      <a:picLocks noChangeAspect="1" noChangeArrowheads="1"/>
+                    </pic:cNvPicPr>
+                  </pic:nvPicPr>
+                  <pic:blipFill>
+                    <a:blip r:embed="rId12">
+                      <a:extLst>
+                        <a:ext uri="{28A0092B-C50C-407E-A947-70E740481C1C}">
+                          <a14:useLocalDpi xmlns:a14="http://schemas.microsoft.com/office/drawing/2010/main" val="0"/>
+                        </a:ext>
+                      </a:extLst>
+                    </a:blip>
+                    <a:srcRect/>
+                    <a:stretch>
+                      <a:fillRect/>
+                    </a:stretch>
+                  </pic:blipFill>
+                  <pic:spPr bwMode="auto">
+                    <a:xfrm>
+                      <a:off x="0" y="0"/>
+                      <a:ext cx="6120130" cy="1794510"/>
+                    </a:xfrm>
+                    <a:prstGeom prst="rect">
+                      <a:avLst/>
+                    </a:prstGeom>
+                    <a:noFill/>
+                    <a:ln>
+                      <a:noFill/>
+                    </a:ln>
+                  </pic:spPr>
+                </pic:pic>
+              </a:graphicData>
+            </a:graphic>
+          </wp:inline>
+        </w:drawing>
+      </w:r>
+    </w:p>
+    <w:p>
+      <w:pPr>
+        <w:rPr>
+          <w:lang w:val="en-US"/>
+        </w:rPr>
+      </w:pPr>
+      <w:r>
+        <w:rPr>
+          <w:lang w:val="en-US"/>
+        </w:rPr>
+        <w:t>Rules for file name:</w:t>
+      </w:r>
+    </w:p>
+    <w:p>
+      <w:pPr>
+        <w:pStyle w:val="ListParagraph"/>
+        <w:numPr>
+          <w:ilvl w:val="0"/>
+          <w:numId w:val="15"/>
+        </w:numPr>
+        <w:rPr>
+          <w:lang w:val="en-US"/>
+        </w:rPr>
+      </w:pPr>
+      <w:r>
+        <w:rPr>
+          <w:lang w:val="en-US"/>
+        </w:rPr>
+        <w:t>No spaces allowed</w:t>
+      </w:r>
+    </w:p>
+    <w:p>
+      <w:pPr>
+        <w:pStyle w:val="ListParagraph"/>
+        <w:numPr>
+          <w:ilvl w:val="0"/>
+          <w:numId w:val="15"/>
+        </w:numPr>
+        <w:rPr>
+          <w:lang w:val="en-US"/>
+        </w:rPr>
+      </w:pPr>
+      <w:r>
+        <w:rPr>
+          <w:lang w:val="en-US"/>
+        </w:rPr>
+        <w:t>Name must be start with a letter</w:t>
+      </w:r>
+    </w:p>
+    <w:p>
+      <w:pPr>
+        <w:pStyle w:val="ListParagraph"/>
+        <w:numPr>
+          <w:ilvl w:val="0"/>
+          <w:numId w:val="15"/>
+        </w:numPr>
+        <w:rPr>
+          <w:lang w:val="en-US"/>
+        </w:rPr>
+      </w:pPr>
+      <w:r>
+        <w:rPr>
+          <w:lang w:val="en-US"/>
+        </w:rPr>
+        <w:t>No special characters, only underscore is allowed</w:t>
+      </w:r>
+    </w:p>
+    <w:p>
+      <w:pPr>
+        <w:pStyle w:val="ListParagraph"/>
+        <w:numPr>
+          <w:ilvl w:val="0"/>
+          <w:numId w:val="15"/>
+        </w:numPr>
+        <w:rPr>
+          <w:lang w:val="en-US"/>
+        </w:rPr>
+      </w:pPr>
+      <w:r>
+        <w:rPr>
+          <w:lang w:val="en-US"/>
+        </w:rPr>
+        <w:t>Only single string is allowed</w:t>
+      </w:r>
+    </w:p>
+    <w:p>
+      <w:pPr>
+        <w:pStyle w:val="Heading2"/>
+        <w:numPr>
+          <w:ilvl w:val="1"/>
+          <w:numId w:val="14"/>
+        </w:numPr>
+        <w:ind w:left="709" w:hanging="709"/>
+        <w:rPr>
+          <w:lang w:val="en-US"/>
+        </w:rPr>
+      </w:pPr>
+      <w:r>
+        <w:rPr>
+          <w:lang w:val="en-US"/>
+        </w:rPr>
+        <w:t>Script (The Editor)</w:t>
+      </w:r>
+    </w:p>
+    <w:p>
+      <w:pPr>
+        <w:jc w:val="both"/>
+        <w:rPr>
+          <w:lang w:val="en-US"/>
+        </w:rPr>
+      </w:pPr>
+      <w:r>
+        <w:rPr>
+          <w:lang w:val="en-US"/>
+        </w:rPr>
+        <w:t>A MATLAB script is a plain text file containing a sequence of MATLAB Commands that executes sequentially from top to bottom.</w:t>
+      </w:r>
+    </w:p>
+    <w:p>
+      <w:pPr>
+        <w:pStyle w:val="Heading3"/>
+        <w:rPr>
+          <w:lang w:val="en-US"/>
+        </w:rPr>
+      </w:pPr>
+      <w:r>
+        <w:rPr>
+          <w:lang w:val="en-US"/>
+        </w:rPr>
+        <w:lastRenderedPageBreak/>
+        <w:t xml:space="preserve">3.3.1 </w:t>
+      </w:r>
+    </w:p>
+    <w:p>
+      <w:pPr>
+        <w:jc w:val="both"/>
+        <w:rPr>
+          <w:lang w:val="en-US"/>
+        </w:rPr>
+      </w:pPr>
+      <w:r>
+        <w:rPr>
+          <w:lang w:val="en-US"/>
+        </w:rPr>
+        <w:t>Scratch Work:</w:t>
+      </w:r>
+    </w:p>
+    <w:p>
+      <w:pPr>
+        <w:jc w:val="both"/>
+        <w:rPr>
+          <w:lang w:val="en-US"/>
+        </w:rPr>
+      </w:pPr>
+    </w:p>
+    <w:p>
+      <w:pPr>
         <w:jc w:val="both"/>
         <w:rPr>
           <w:lang w:val="en-US"/>
@@ -3105,7 +5051,6 @@
         <w:rPr>
           <w:lang w:val="en-US"/>
         </w:rPr>
-        <w:lastRenderedPageBreak/>
         <w:drawing>
           <wp:inline distT="0" distB="0" distL="0" distR="0" wp14:anchorId="1AB94E6E" wp14:editId="52028A28">
             <wp:extent cx="5014395" cy="2758679"/>
@@ -3122,7 +5067,7 @@
                     <pic:cNvPicPr/>
                   </pic:nvPicPr>
                   <pic:blipFill>
-                    <a:blip r:embed="rId11"/>
+                    <a:blip r:embed="rId13"/>
                     <a:stretch>
                       <a:fillRect/>
                     </a:stretch>
@@ -3198,7 +5143,7 @@
                     <pic:cNvPicPr/>
                   </pic:nvPicPr>
                   <pic:blipFill>
-                    <a:blip r:embed="rId12"/>
+                    <a:blip r:embed="rId14"/>
                     <a:stretch>
                       <a:fillRect/>
                     </a:stretch>
@@ -3261,7 +5206,7 @@
                     <pic:cNvPicPr/>
                   </pic:nvPicPr>
                   <pic:blipFill>
-                    <a:blip r:embed="rId13"/>
+                    <a:blip r:embed="rId15"/>
                     <a:stretch>
                       <a:fillRect/>
                     </a:stretch>
@@ -3323,7 +5268,7 @@
                     <pic:cNvPicPr/>
                   </pic:nvPicPr>
                   <pic:blipFill>
-                    <a:blip r:embed="rId14"/>
+                    <a:blip r:embed="rId16"/>
                     <a:stretch>
                       <a:fillRect/>
                     </a:stretch>
@@ -3353,7 +5298,7 @@
       </w:pPr>
     </w:p>
     <w:sectPr>
-      <w:footerReference w:type="default" r:id="rId15"/>
+      <w:footerReference w:type="default" r:id="rId17"/>
       <w:pgSz w:w="11906" w:h="16838"/>
       <w:pgMar w:top="1134" w:right="1134" w:bottom="1440" w:left="1134" w:header="709" w:footer="709" w:gutter="0"/>
       <w:cols w:space="708"/>
@@ -3449,7 +5394,7 @@
                   <w:kern w:val="0"/>
                   <w14:ligatures w14:val="none"/>
                 </w:rPr>
-                <w:t>EmbedSphere Technologies By</w:t>
+                <w:t>Ketan Jadhav</w:t>
               </w:r>
               <w:r>
                 <w:rPr>
@@ -3457,15 +5402,7 @@
                   <w:kern w:val="0"/>
                   <w14:ligatures w14:val="none"/>
                 </w:rPr>
-                <w:t xml:space="preserve"> </w:t>
-              </w:r>
-              <w:r>
-                <w:rPr>
-                  <w:color w:val="000000" w:themeColor="text1"/>
-                  <w:kern w:val="0"/>
-                  <w14:ligatures w14:val="none"/>
-                </w:rPr>
-                <w:t>Ketan Jadhav</w:t>
+                <w:t>, Email: erkpjadhav22@outlook.com</w:t>
               </w:r>
             </w:sdtContent>
           </w:sdt>
@@ -3649,6 +5586,95 @@
     </w:lvl>
   </w:abstractNum>
   <w:abstractNum w:abstractNumId="1" w15:restartNumberingAfterBreak="0">
+    <w:nsid w:val="10CE570B"/>
+    <w:multiLevelType w:val="hybridMultilevel"/>
+    <w:tmpl w:val="7C042F34"/>
+    <w:lvl w:ilvl="0" w:tplc="F3CA1FA6">
+      <w:start w:val="1"/>
+      <w:numFmt w:val="lowerRoman"/>
+      <w:lvlText w:val="%1."/>
+      <w:lvlJc w:val="left"/>
+      <w:pPr>
+        <w:ind w:left="1080" w:hanging="720"/>
+      </w:pPr>
+      <w:rPr>
+        <w:rFonts w:hint="default"/>
+      </w:rPr>
+    </w:lvl>
+    <w:lvl w:ilvl="1" w:tplc="0C000019" w:tentative="1">
+      <w:start w:val="1"/>
+      <w:numFmt w:val="lowerLetter"/>
+      <w:lvlText w:val="%2."/>
+      <w:lvlJc w:val="left"/>
+      <w:pPr>
+        <w:ind w:left="1440" w:hanging="360"/>
+      </w:pPr>
+    </w:lvl>
+    <w:lvl w:ilvl="2" w:tplc="0C00001B" w:tentative="1">
+      <w:start w:val="1"/>
+      <w:numFmt w:val="lowerRoman"/>
+      <w:lvlText w:val="%3."/>
+      <w:lvlJc w:val="right"/>
+      <w:pPr>
+        <w:ind w:left="2160" w:hanging="180"/>
+      </w:pPr>
+    </w:lvl>
+    <w:lvl w:ilvl="3" w:tplc="0C00000F" w:tentative="1">
+      <w:start w:val="1"/>
+      <w:numFmt w:val="decimal"/>
+      <w:lvlText w:val="%4."/>
+      <w:lvlJc w:val="left"/>
+      <w:pPr>
+        <w:ind w:left="2880" w:hanging="360"/>
+      </w:pPr>
+    </w:lvl>
+    <w:lvl w:ilvl="4" w:tplc="0C000019" w:tentative="1">
+      <w:start w:val="1"/>
+      <w:numFmt w:val="lowerLetter"/>
+      <w:lvlText w:val="%5."/>
+      <w:lvlJc w:val="left"/>
+      <w:pPr>
+        <w:ind w:left="3600" w:hanging="360"/>
+      </w:pPr>
+    </w:lvl>
+    <w:lvl w:ilvl="5" w:tplc="0C00001B" w:tentative="1">
+      <w:start w:val="1"/>
+      <w:numFmt w:val="lowerRoman"/>
+      <w:lvlText w:val="%6."/>
+      <w:lvlJc w:val="right"/>
+      <w:pPr>
+        <w:ind w:left="4320" w:hanging="180"/>
+      </w:pPr>
+    </w:lvl>
+    <w:lvl w:ilvl="6" w:tplc="0C00000F" w:tentative="1">
+      <w:start w:val="1"/>
+      <w:numFmt w:val="decimal"/>
+      <w:lvlText w:val="%7."/>
+      <w:lvlJc w:val="left"/>
+      <w:pPr>
+        <w:ind w:left="5040" w:hanging="360"/>
+      </w:pPr>
+    </w:lvl>
+    <w:lvl w:ilvl="7" w:tplc="0C000019" w:tentative="1">
+      <w:start w:val="1"/>
+      <w:numFmt w:val="lowerLetter"/>
+      <w:lvlText w:val="%8."/>
+      <w:lvlJc w:val="left"/>
+      <w:pPr>
+        <w:ind w:left="5760" w:hanging="360"/>
+      </w:pPr>
+    </w:lvl>
+    <w:lvl w:ilvl="8" w:tplc="0C00001B" w:tentative="1">
+      <w:start w:val="1"/>
+      <w:numFmt w:val="lowerRoman"/>
+      <w:lvlText w:val="%9."/>
+      <w:lvlJc w:val="right"/>
+      <w:pPr>
+        <w:ind w:left="6480" w:hanging="180"/>
+      </w:pPr>
+    </w:lvl>
+  </w:abstractNum>
+  <w:abstractNum w:abstractNumId="2" w15:restartNumberingAfterBreak="0">
     <w:nsid w:val="1DB31D95"/>
     <w:multiLevelType w:val="hybridMultilevel"/>
     <w:tmpl w:val="9F785EC8"/>
@@ -3737,7 +5763,7 @@
       </w:pPr>
     </w:lvl>
   </w:abstractNum>
-  <w:abstractNum w:abstractNumId="2" w15:restartNumberingAfterBreak="0">
+  <w:abstractNum w:abstractNumId="3" w15:restartNumberingAfterBreak="0">
     <w:nsid w:val="28E52558"/>
     <w:multiLevelType w:val="hybridMultilevel"/>
     <w:tmpl w:val="1D56CA9A"/>
@@ -3826,7 +5852,7 @@
       </w:pPr>
     </w:lvl>
   </w:abstractNum>
-  <w:abstractNum w:abstractNumId="3" w15:restartNumberingAfterBreak="0">
+  <w:abstractNum w:abstractNumId="4" w15:restartNumberingAfterBreak="0">
     <w:nsid w:val="2D610B4F"/>
     <w:multiLevelType w:val="hybridMultilevel"/>
     <w:tmpl w:val="2454ED96"/>
@@ -3915,7 +5941,7 @@
       </w:pPr>
     </w:lvl>
   </w:abstractNum>
-  <w:abstractNum w:abstractNumId="4" w15:restartNumberingAfterBreak="0">
+  <w:abstractNum w:abstractNumId="5" w15:restartNumberingAfterBreak="0">
     <w:nsid w:val="375D3C9B"/>
     <w:multiLevelType w:val="hybridMultilevel"/>
     <w:tmpl w:val="1396B204"/>
@@ -4004,7 +6030,7 @@
       </w:pPr>
     </w:lvl>
   </w:abstractNum>
-  <w:abstractNum w:abstractNumId="5" w15:restartNumberingAfterBreak="0">
+  <w:abstractNum w:abstractNumId="6" w15:restartNumberingAfterBreak="0">
     <w:nsid w:val="49D06403"/>
     <w:multiLevelType w:val="hybridMultilevel"/>
     <w:tmpl w:val="B582D2C8"/>
@@ -4093,7 +6119,7 @@
       </w:pPr>
     </w:lvl>
   </w:abstractNum>
-  <w:abstractNum w:abstractNumId="6" w15:restartNumberingAfterBreak="0">
+  <w:abstractNum w:abstractNumId="7" w15:restartNumberingAfterBreak="0">
     <w:nsid w:val="4E235E42"/>
     <w:multiLevelType w:val="multilevel"/>
     <w:tmpl w:val="18F0FDC2"/>
@@ -4206,7 +6232,7 @@
       </w:rPr>
     </w:lvl>
   </w:abstractNum>
-  <w:abstractNum w:abstractNumId="7" w15:restartNumberingAfterBreak="0">
+  <w:abstractNum w:abstractNumId="8" w15:restartNumberingAfterBreak="0">
     <w:nsid w:val="53F64998"/>
     <w:multiLevelType w:val="hybridMultilevel"/>
     <w:tmpl w:val="EAB47FF6"/>
@@ -4318,7 +6344,7 @@
       </w:rPr>
     </w:lvl>
   </w:abstractNum>
-  <w:abstractNum w:abstractNumId="8" w15:restartNumberingAfterBreak="0">
+  <w:abstractNum w:abstractNumId="9" w15:restartNumberingAfterBreak="0">
     <w:nsid w:val="57C7451F"/>
     <w:multiLevelType w:val="multilevel"/>
     <w:tmpl w:val="24960192"/>
@@ -4439,7 +6465,7 @@
       </w:rPr>
     </w:lvl>
   </w:abstractNum>
-  <w:abstractNum w:abstractNumId="9" w15:restartNumberingAfterBreak="0">
+  <w:abstractNum w:abstractNumId="10" w15:restartNumberingAfterBreak="0">
     <w:nsid w:val="677421C7"/>
     <w:multiLevelType w:val="multilevel"/>
     <w:tmpl w:val="060AFFAA"/>
@@ -4560,7 +6586,7 @@
       </w:rPr>
     </w:lvl>
   </w:abstractNum>
-  <w:abstractNum w:abstractNumId="10" w15:restartNumberingAfterBreak="0">
+  <w:abstractNum w:abstractNumId="11" w15:restartNumberingAfterBreak="0">
     <w:nsid w:val="6F4D3440"/>
     <w:multiLevelType w:val="multilevel"/>
     <w:tmpl w:val="0C00001F"/>
@@ -4647,25 +6673,25 @@
     </w:lvl>
   </w:abstractNum>
   <w:num w:numId="1" w16cid:durableId="1815876298">
+    <w:abstractNumId w:val="5"/>
+  </w:num>
+  <w:num w:numId="2" w16cid:durableId="1808157322">
+    <w:abstractNumId w:val="6"/>
+  </w:num>
+  <w:num w:numId="3" w16cid:durableId="82264793">
+    <w:abstractNumId w:val="7"/>
+  </w:num>
+  <w:num w:numId="4" w16cid:durableId="1499539739">
+    <w:abstractNumId w:val="8"/>
+  </w:num>
+  <w:num w:numId="5" w16cid:durableId="1400178965">
     <w:abstractNumId w:val="4"/>
   </w:num>
-  <w:num w:numId="2" w16cid:durableId="1808157322">
-    <w:abstractNumId w:val="5"/>
-  </w:num>
-  <w:num w:numId="3" w16cid:durableId="82264793">
-    <w:abstractNumId w:val="6"/>
-  </w:num>
-  <w:num w:numId="4" w16cid:durableId="1499539739">
-    <w:abstractNumId w:val="7"/>
-  </w:num>
-  <w:num w:numId="5" w16cid:durableId="1400178965">
+  <w:num w:numId="6" w16cid:durableId="418604041">
     <w:abstractNumId w:val="3"/>
   </w:num>
-  <w:num w:numId="6" w16cid:durableId="418604041">
-    <w:abstractNumId w:val="2"/>
-  </w:num>
   <w:num w:numId="7" w16cid:durableId="1087848103">
-    <w:abstractNumId w:val="6"/>
+    <w:abstractNumId w:val="7"/>
     <w:lvlOverride w:ilvl="0">
       <w:startOverride w:val="1"/>
     </w:lvlOverride>
@@ -4695,7 +6721,7 @@
     </w:lvlOverride>
   </w:num>
   <w:num w:numId="8" w16cid:durableId="1169566866">
-    <w:abstractNumId w:val="6"/>
+    <w:abstractNumId w:val="7"/>
     <w:lvlOverride w:ilvl="0">
       <w:startOverride w:val="1"/>
     </w:lvlOverride>
@@ -4725,16 +6751,16 @@
     </w:lvlOverride>
   </w:num>
   <w:num w:numId="9" w16cid:durableId="1341080002">
-    <w:abstractNumId w:val="10"/>
+    <w:abstractNumId w:val="11"/>
   </w:num>
   <w:num w:numId="10" w16cid:durableId="435445030">
-    <w:abstractNumId w:val="1"/>
+    <w:abstractNumId w:val="2"/>
   </w:num>
   <w:num w:numId="11" w16cid:durableId="1300451678">
-    <w:abstractNumId w:val="8"/>
+    <w:abstractNumId w:val="9"/>
   </w:num>
   <w:num w:numId="12" w16cid:durableId="809981902">
-    <w:abstractNumId w:val="10"/>
+    <w:abstractNumId w:val="11"/>
     <w:lvlOverride w:ilvl="0">
       <w:startOverride w:val="1"/>
     </w:lvlOverride>
@@ -4767,7 +6793,10 @@
     <w:abstractNumId w:val="0"/>
   </w:num>
   <w:num w:numId="14" w16cid:durableId="1591235183">
-    <w:abstractNumId w:val="9"/>
+    <w:abstractNumId w:val="10"/>
+  </w:num>
+  <w:num w:numId="15" w16cid:durableId="73212612">
+    <w:abstractNumId w:val="1"/>
   </w:num>
 </w:numbering>
 </file>
@@ -5898,7 +7927,8 @@
   </w:compat>
   <w:rsids>
     <w:rsidRoot w:val="00D57D4B"/>
-    <w:rsid w:val="00764A91"/>
+    <w:rsid w:val="0029642A"/>
+    <w:rsid w:val="00335F32"/>
     <w:rsid w:val="00D57D4B"/>
     <w:rsid w:val="00E33EF4"/>
   </w:rsids>

</xml_diff>

<commit_message>
Pushing first live script and MATLAB notes
</commit_message>
<xml_diff>
--- a/MATLAB_Notes.docx
+++ b/MATLAB_Notes.docx
@@ -60,7 +60,7 @@
           <w:r>
             <w:fldChar w:fldCharType="separate"/>
           </w:r>
-          <w:hyperlink w:anchor="_Toc235357131" w:history="1">
+          <w:hyperlink w:anchor="_Toc235388783" w:history="1">
             <w:r>
               <w:rPr>
                 <w:rStyle w:val="Hyperlink"/>
@@ -104,7 +104,7 @@
                 <w:noProof/>
                 <w:webHidden/>
               </w:rPr>
-              <w:instrText xml:space="preserve"> PAGEREF _Toc235357131 \h </w:instrText>
+              <w:instrText xml:space="preserve"> PAGEREF _Toc235388783 \h </w:instrText>
             </w:r>
             <w:r>
               <w:rPr>
@@ -148,7 +148,7 @@
               <w:lang w:eastAsia="en-BW"/>
             </w:rPr>
           </w:pPr>
-          <w:hyperlink w:anchor="_Toc235357132" w:history="1">
+          <w:hyperlink w:anchor="_Toc235388784" w:history="1">
             <w:r>
               <w:rPr>
                 <w:rStyle w:val="Hyperlink"/>
@@ -192,7 +192,7 @@
                 <w:noProof/>
                 <w:webHidden/>
               </w:rPr>
-              <w:instrText xml:space="preserve"> PAGEREF _Toc235357132 \h </w:instrText>
+              <w:instrText xml:space="preserve"> PAGEREF _Toc235388784 \h </w:instrText>
             </w:r>
             <w:r>
               <w:rPr>
@@ -236,7 +236,7 @@
               <w:lang w:eastAsia="en-BW"/>
             </w:rPr>
           </w:pPr>
-          <w:hyperlink w:anchor="_Toc235357133" w:history="1">
+          <w:hyperlink w:anchor="_Toc235388785" w:history="1">
             <w:r>
               <w:rPr>
                 <w:rStyle w:val="Hyperlink"/>
@@ -280,7 +280,7 @@
                 <w:noProof/>
                 <w:webHidden/>
               </w:rPr>
-              <w:instrText xml:space="preserve"> PAGEREF _Toc235357133 \h </w:instrText>
+              <w:instrText xml:space="preserve"> PAGEREF _Toc235388785 \h </w:instrText>
             </w:r>
             <w:r>
               <w:rPr>
@@ -324,7 +324,7 @@
               <w:lang w:eastAsia="en-BW"/>
             </w:rPr>
           </w:pPr>
-          <w:hyperlink w:anchor="_Toc235357134" w:history="1">
+          <w:hyperlink w:anchor="_Toc235388786" w:history="1">
             <w:r>
               <w:rPr>
                 <w:rStyle w:val="Hyperlink"/>
@@ -368,7 +368,7 @@
                 <w:noProof/>
                 <w:webHidden/>
               </w:rPr>
-              <w:instrText xml:space="preserve"> PAGEREF _Toc235357134 \h </w:instrText>
+              <w:instrText xml:space="preserve"> PAGEREF _Toc235388786 \h </w:instrText>
             </w:r>
             <w:r>
               <w:rPr>
@@ -412,7 +412,7 @@
               <w:lang w:eastAsia="en-BW"/>
             </w:rPr>
           </w:pPr>
-          <w:hyperlink w:anchor="_Toc235357135" w:history="1">
+          <w:hyperlink w:anchor="_Toc235388787" w:history="1">
             <w:r>
               <w:rPr>
                 <w:rStyle w:val="Hyperlink"/>
@@ -456,7 +456,7 @@
                 <w:noProof/>
                 <w:webHidden/>
               </w:rPr>
-              <w:instrText xml:space="preserve"> PAGEREF _Toc235357135 \h </w:instrText>
+              <w:instrText xml:space="preserve"> PAGEREF _Toc235388787 \h </w:instrText>
             </w:r>
             <w:r>
               <w:rPr>
@@ -500,7 +500,7 @@
               <w:lang w:eastAsia="en-BW"/>
             </w:rPr>
           </w:pPr>
-          <w:hyperlink w:anchor="_Toc235357136" w:history="1">
+          <w:hyperlink w:anchor="_Toc235388788" w:history="1">
             <w:r>
               <w:rPr>
                 <w:rStyle w:val="Hyperlink"/>
@@ -544,7 +544,7 @@
                 <w:noProof/>
                 <w:webHidden/>
               </w:rPr>
-              <w:instrText xml:space="preserve"> PAGEREF _Toc235357136 \h </w:instrText>
+              <w:instrText xml:space="preserve"> PAGEREF _Toc235388788 \h </w:instrText>
             </w:r>
             <w:r>
               <w:rPr>
@@ -588,7 +588,7 @@
               <w:lang w:eastAsia="en-BW"/>
             </w:rPr>
           </w:pPr>
-          <w:hyperlink w:anchor="_Toc235357137" w:history="1">
+          <w:hyperlink w:anchor="_Toc235388789" w:history="1">
             <w:r>
               <w:rPr>
                 <w:rStyle w:val="Hyperlink"/>
@@ -632,7 +632,7 @@
                 <w:noProof/>
                 <w:webHidden/>
               </w:rPr>
-              <w:instrText xml:space="preserve"> PAGEREF _Toc235357137 \h </w:instrText>
+              <w:instrText xml:space="preserve"> PAGEREF _Toc235388789 \h </w:instrText>
             </w:r>
             <w:r>
               <w:rPr>
@@ -676,7 +676,7 @@
               <w:lang w:eastAsia="en-BW"/>
             </w:rPr>
           </w:pPr>
-          <w:hyperlink w:anchor="_Toc235357138" w:history="1">
+          <w:hyperlink w:anchor="_Toc235388790" w:history="1">
             <w:r>
               <w:rPr>
                 <w:rStyle w:val="Hyperlink"/>
@@ -720,7 +720,7 @@
                 <w:noProof/>
                 <w:webHidden/>
               </w:rPr>
-              <w:instrText xml:space="preserve"> PAGEREF _Toc235357138 \h </w:instrText>
+              <w:instrText xml:space="preserve"> PAGEREF _Toc235388790 \h </w:instrText>
             </w:r>
             <w:r>
               <w:rPr>
@@ -740,7 +740,7 @@
                 <w:noProof/>
                 <w:webHidden/>
               </w:rPr>
-              <w:t>3</w:t>
+              <w:t>2</w:t>
             </w:r>
             <w:r>
               <w:rPr>
@@ -764,7 +764,7 @@
               <w:lang w:eastAsia="en-BW"/>
             </w:rPr>
           </w:pPr>
-          <w:hyperlink w:anchor="_Toc235357139" w:history="1">
+          <w:hyperlink w:anchor="_Toc235388791" w:history="1">
             <w:r>
               <w:rPr>
                 <w:rStyle w:val="Hyperlink"/>
@@ -808,7 +808,7 @@
                 <w:noProof/>
                 <w:webHidden/>
               </w:rPr>
-              <w:instrText xml:space="preserve"> PAGEREF _Toc235357139 \h </w:instrText>
+              <w:instrText xml:space="preserve"> PAGEREF _Toc235388791 \h </w:instrText>
             </w:r>
             <w:r>
               <w:rPr>
@@ -828,7 +828,7 @@
                 <w:noProof/>
                 <w:webHidden/>
               </w:rPr>
-              <w:t>3</w:t>
+              <w:t>2</w:t>
             </w:r>
             <w:r>
               <w:rPr>
@@ -852,7 +852,7 @@
               <w:lang w:eastAsia="en-BW"/>
             </w:rPr>
           </w:pPr>
-          <w:hyperlink w:anchor="_Toc235357140" w:history="1">
+          <w:hyperlink w:anchor="_Toc235388792" w:history="1">
             <w:r>
               <w:rPr>
                 <w:rStyle w:val="Hyperlink"/>
@@ -896,7 +896,7 @@
                 <w:noProof/>
                 <w:webHidden/>
               </w:rPr>
-              <w:instrText xml:space="preserve"> PAGEREF _Toc235357140 \h </w:instrText>
+              <w:instrText xml:space="preserve"> PAGEREF _Toc235388792 \h </w:instrText>
             </w:r>
             <w:r>
               <w:rPr>
@@ -916,7 +916,7 @@
                 <w:noProof/>
                 <w:webHidden/>
               </w:rPr>
-              <w:t>3</w:t>
+              <w:t>2</w:t>
             </w:r>
             <w:r>
               <w:rPr>
@@ -940,7 +940,7 @@
               <w:lang w:eastAsia="en-BW"/>
             </w:rPr>
           </w:pPr>
-          <w:hyperlink w:anchor="_Toc235357141" w:history="1">
+          <w:hyperlink w:anchor="_Toc235388793" w:history="1">
             <w:r>
               <w:rPr>
                 <w:rStyle w:val="Hyperlink"/>
@@ -984,7 +984,7 @@
                 <w:noProof/>
                 <w:webHidden/>
               </w:rPr>
-              <w:instrText xml:space="preserve"> PAGEREF _Toc235357141 \h </w:instrText>
+              <w:instrText xml:space="preserve"> PAGEREF _Toc235388793 \h </w:instrText>
             </w:r>
             <w:r>
               <w:rPr>
@@ -1004,7 +1004,7 @@
                 <w:noProof/>
                 <w:webHidden/>
               </w:rPr>
-              <w:t>3</w:t>
+              <w:t>2</w:t>
             </w:r>
             <w:r>
               <w:rPr>
@@ -1028,7 +1028,7 @@
               <w:lang w:eastAsia="en-BW"/>
             </w:rPr>
           </w:pPr>
-          <w:hyperlink w:anchor="_Toc235357142" w:history="1">
+          <w:hyperlink w:anchor="_Toc235388794" w:history="1">
             <w:r>
               <w:rPr>
                 <w:rStyle w:val="Hyperlink"/>
@@ -1087,7 +1087,7 @@
                 <w:noProof/>
                 <w:webHidden/>
               </w:rPr>
-              <w:instrText xml:space="preserve"> PAGEREF _Toc235357142 \h </w:instrText>
+              <w:instrText xml:space="preserve"> PAGEREF _Toc235388794 \h </w:instrText>
             </w:r>
             <w:r>
               <w:rPr>
@@ -1107,7 +1107,7 @@
                 <w:noProof/>
                 <w:webHidden/>
               </w:rPr>
-              <w:t>3</w:t>
+              <w:t>2</w:t>
             </w:r>
             <w:r>
               <w:rPr>
@@ -1131,7 +1131,7 @@
               <w:lang w:eastAsia="en-BW"/>
             </w:rPr>
           </w:pPr>
-          <w:hyperlink w:anchor="_Toc235357143" w:history="1">
+          <w:hyperlink w:anchor="_Toc235388795" w:history="1">
             <w:r>
               <w:rPr>
                 <w:rStyle w:val="Hyperlink"/>
@@ -1182,7 +1182,7 @@
                 <w:noProof/>
                 <w:webHidden/>
               </w:rPr>
-              <w:instrText xml:space="preserve"> PAGEREF _Toc235357143 \h </w:instrText>
+              <w:instrText xml:space="preserve"> PAGEREF _Toc235388795 \h </w:instrText>
             </w:r>
             <w:r>
               <w:rPr>
@@ -1202,7 +1202,7 @@
                 <w:noProof/>
                 <w:webHidden/>
               </w:rPr>
-              <w:t>3</w:t>
+              <w:t>2</w:t>
             </w:r>
             <w:r>
               <w:rPr>
@@ -1226,7 +1226,7 @@
               <w:lang w:eastAsia="en-BW"/>
             </w:rPr>
           </w:pPr>
-          <w:hyperlink w:anchor="_Toc235357144" w:history="1">
+          <w:hyperlink w:anchor="_Toc235388796" w:history="1">
             <w:r>
               <w:rPr>
                 <w:rStyle w:val="Hyperlink"/>
@@ -1270,7 +1270,7 @@
                 <w:noProof/>
                 <w:webHidden/>
               </w:rPr>
-              <w:instrText xml:space="preserve"> PAGEREF _Toc235357144 \h </w:instrText>
+              <w:instrText xml:space="preserve"> PAGEREF _Toc235388796 \h </w:instrText>
             </w:r>
             <w:r>
               <w:rPr>
@@ -1290,7 +1290,7 @@
                 <w:noProof/>
                 <w:webHidden/>
               </w:rPr>
-              <w:t>4</w:t>
+              <w:t>2</w:t>
             </w:r>
             <w:r>
               <w:rPr>
@@ -1314,7 +1314,7 @@
               <w:lang w:eastAsia="en-BW"/>
             </w:rPr>
           </w:pPr>
-          <w:hyperlink w:anchor="_Toc235357145" w:history="1">
+          <w:hyperlink w:anchor="_Toc235388797" w:history="1">
             <w:r>
               <w:rPr>
                 <w:rStyle w:val="Hyperlink"/>
@@ -1358,7 +1358,7 @@
                 <w:noProof/>
                 <w:webHidden/>
               </w:rPr>
-              <w:instrText xml:space="preserve"> PAGEREF _Toc235357145 \h </w:instrText>
+              <w:instrText xml:space="preserve"> PAGEREF _Toc235388797 \h </w:instrText>
             </w:r>
             <w:r>
               <w:rPr>
@@ -1378,7 +1378,7 @@
                 <w:noProof/>
                 <w:webHidden/>
               </w:rPr>
-              <w:t>4</w:t>
+              <w:t>2</w:t>
             </w:r>
             <w:r>
               <w:rPr>
@@ -1402,7 +1402,7 @@
               <w:lang w:eastAsia="en-BW"/>
             </w:rPr>
           </w:pPr>
-          <w:hyperlink w:anchor="_Toc235357146" w:history="1">
+          <w:hyperlink w:anchor="_Toc235388798" w:history="1">
             <w:r>
               <w:rPr>
                 <w:rStyle w:val="Hyperlink"/>
@@ -1446,7 +1446,7 @@
                 <w:noProof/>
                 <w:webHidden/>
               </w:rPr>
-              <w:instrText xml:space="preserve"> PAGEREF _Toc235357146 \h </w:instrText>
+              <w:instrText xml:space="preserve"> PAGEREF _Toc235388798 \h </w:instrText>
             </w:r>
             <w:r>
               <w:rPr>
@@ -1466,7 +1466,7 @@
                 <w:noProof/>
                 <w:webHidden/>
               </w:rPr>
-              <w:t>4</w:t>
+              <w:t>2</w:t>
             </w:r>
             <w:r>
               <w:rPr>
@@ -1490,7 +1490,7 @@
               <w:lang w:eastAsia="en-BW"/>
             </w:rPr>
           </w:pPr>
-          <w:hyperlink w:anchor="_Toc235357147" w:history="1">
+          <w:hyperlink w:anchor="_Toc235388799" w:history="1">
             <w:r>
               <w:rPr>
                 <w:rStyle w:val="Hyperlink"/>
@@ -1534,7 +1534,7 @@
                 <w:noProof/>
                 <w:webHidden/>
               </w:rPr>
-              <w:instrText xml:space="preserve"> PAGEREF _Toc235357147 \h </w:instrText>
+              <w:instrText xml:space="preserve"> PAGEREF _Toc235388799 \h </w:instrText>
             </w:r>
             <w:r>
               <w:rPr>
@@ -1554,7 +1554,7 @@
                 <w:noProof/>
                 <w:webHidden/>
               </w:rPr>
-              <w:t>5</w:t>
+              <w:t>2</w:t>
             </w:r>
             <w:r>
               <w:rPr>
@@ -1578,12 +1578,11 @@
               <w:lang w:eastAsia="en-BW"/>
             </w:rPr>
           </w:pPr>
-          <w:hyperlink w:anchor="_Toc235357148" w:history="1">
+          <w:hyperlink w:anchor="_Toc235388800" w:history="1">
             <w:r>
               <w:rPr>
                 <w:rStyle w:val="Hyperlink"/>
                 <w:noProof/>
-                <w:lang w:val="en-US"/>
               </w:rPr>
               <w:t>3.</w:t>
             </w:r>
@@ -1599,7 +1598,6 @@
               <w:rPr>
                 <w:rStyle w:val="Hyperlink"/>
                 <w:noProof/>
-                <w:lang w:val="en-US"/>
               </w:rPr>
               <w:t>MATLAB Introduction</w:t>
             </w:r>
@@ -1622,7 +1620,7 @@
                 <w:noProof/>
                 <w:webHidden/>
               </w:rPr>
-              <w:instrText xml:space="preserve"> PAGEREF _Toc235357148 \h </w:instrText>
+              <w:instrText xml:space="preserve"> PAGEREF _Toc235388800 \h </w:instrText>
             </w:r>
             <w:r>
               <w:rPr>
@@ -1642,7 +1640,7 @@
                 <w:noProof/>
                 <w:webHidden/>
               </w:rPr>
-              <w:t>5</w:t>
+              <w:t>2</w:t>
             </w:r>
             <w:r>
               <w:rPr>
@@ -1666,7 +1664,7 @@
               <w:lang w:eastAsia="en-BW"/>
             </w:rPr>
           </w:pPr>
-          <w:hyperlink w:anchor="_Toc235357149" w:history="1">
+          <w:hyperlink w:anchor="_Toc235388801" w:history="1">
             <w:r>
               <w:rPr>
                 <w:rStyle w:val="Hyperlink"/>
@@ -1710,7 +1708,7 @@
                 <w:noProof/>
                 <w:webHidden/>
               </w:rPr>
-              <w:instrText xml:space="preserve"> PAGEREF _Toc235357149 \h </w:instrText>
+              <w:instrText xml:space="preserve"> PAGEREF _Toc235388801 \h </w:instrText>
             </w:r>
             <w:r>
               <w:rPr>
@@ -1730,7 +1728,7 @@
                 <w:noProof/>
                 <w:webHidden/>
               </w:rPr>
-              <w:t>5</w:t>
+              <w:t>2</w:t>
             </w:r>
             <w:r>
               <w:rPr>
@@ -1754,7 +1752,7 @@
               <w:lang w:eastAsia="en-BW"/>
             </w:rPr>
           </w:pPr>
-          <w:hyperlink w:anchor="_Toc235357150" w:history="1">
+          <w:hyperlink w:anchor="_Toc235388802" w:history="1">
             <w:r>
               <w:rPr>
                 <w:rStyle w:val="Hyperlink"/>
@@ -1798,7 +1796,7 @@
                 <w:noProof/>
                 <w:webHidden/>
               </w:rPr>
-              <w:instrText xml:space="preserve"> PAGEREF _Toc235357150 \h </w:instrText>
+              <w:instrText xml:space="preserve"> PAGEREF _Toc235388802 \h </w:instrText>
             </w:r>
             <w:r>
               <w:rPr>
@@ -1818,7 +1816,7 @@
                 <w:noProof/>
                 <w:webHidden/>
               </w:rPr>
-              <w:t>6</w:t>
+              <w:t>2</w:t>
             </w:r>
             <w:r>
               <w:rPr>
@@ -1842,7 +1840,7 @@
               <w:lang w:eastAsia="en-BW"/>
             </w:rPr>
           </w:pPr>
-          <w:hyperlink w:anchor="_Toc235357151" w:history="1">
+          <w:hyperlink w:anchor="_Toc235388803" w:history="1">
             <w:r>
               <w:rPr>
                 <w:rStyle w:val="Hyperlink"/>
@@ -1886,7 +1884,7 @@
                 <w:noProof/>
                 <w:webHidden/>
               </w:rPr>
-              <w:instrText xml:space="preserve"> PAGEREF _Toc235357151 \h </w:instrText>
+              <w:instrText xml:space="preserve"> PAGEREF _Toc235388803 \h </w:instrText>
             </w:r>
             <w:r>
               <w:rPr>
@@ -1906,7 +1904,7 @@
                 <w:noProof/>
                 <w:webHidden/>
               </w:rPr>
-              <w:t>6</w:t>
+              <w:t>2</w:t>
             </w:r>
             <w:r>
               <w:rPr>
@@ -1930,7 +1928,7 @@
               <w:lang w:eastAsia="en-BW"/>
             </w:rPr>
           </w:pPr>
-          <w:hyperlink w:anchor="_Toc235357152" w:history="1">
+          <w:hyperlink w:anchor="_Toc235388804" w:history="1">
             <w:r>
               <w:rPr>
                 <w:rStyle w:val="Hyperlink"/>
@@ -1974,7 +1972,7 @@
                 <w:noProof/>
                 <w:webHidden/>
               </w:rPr>
-              <w:instrText xml:space="preserve"> PAGEREF _Toc235357152 \h </w:instrText>
+              <w:instrText xml:space="preserve"> PAGEREF _Toc235388804 \h </w:instrText>
             </w:r>
             <w:r>
               <w:rPr>
@@ -1994,7 +1992,7 @@
                 <w:noProof/>
                 <w:webHidden/>
               </w:rPr>
-              <w:t>6</w:t>
+              <w:t>2</w:t>
             </w:r>
             <w:r>
               <w:rPr>
@@ -2018,7 +2016,7 @@
               <w:lang w:eastAsia="en-BW"/>
             </w:rPr>
           </w:pPr>
-          <w:hyperlink w:anchor="_Toc235357153" w:history="1">
+          <w:hyperlink w:anchor="_Toc235388805" w:history="1">
             <w:r>
               <w:rPr>
                 <w:rStyle w:val="Hyperlink"/>
@@ -2062,7 +2060,7 @@
                 <w:noProof/>
                 <w:webHidden/>
               </w:rPr>
-              <w:instrText xml:space="preserve"> PAGEREF _Toc235357153 \h </w:instrText>
+              <w:instrText xml:space="preserve"> PAGEREF _Toc235388805 \h </w:instrText>
             </w:r>
             <w:r>
               <w:rPr>
@@ -2082,7 +2080,7 @@
                 <w:noProof/>
                 <w:webHidden/>
               </w:rPr>
-              <w:t>7</w:t>
+              <w:t>2</w:t>
             </w:r>
             <w:r>
               <w:rPr>
@@ -2106,7 +2104,7 @@
               <w:lang w:eastAsia="en-BW"/>
             </w:rPr>
           </w:pPr>
-          <w:hyperlink w:anchor="_Toc235357154" w:history="1">
+          <w:hyperlink w:anchor="_Toc235388806" w:history="1">
             <w:r>
               <w:rPr>
                 <w:rStyle w:val="Hyperlink"/>
@@ -2150,7 +2148,7 @@
                 <w:noProof/>
                 <w:webHidden/>
               </w:rPr>
-              <w:instrText xml:space="preserve"> PAGEREF _Toc235357154 \h </w:instrText>
+              <w:instrText xml:space="preserve"> PAGEREF _Toc235388806 \h </w:instrText>
             </w:r>
             <w:r>
               <w:rPr>
@@ -2170,7 +2168,7 @@
                 <w:noProof/>
                 <w:webHidden/>
               </w:rPr>
-              <w:t>7</w:t>
+              <w:t>2</w:t>
             </w:r>
             <w:r>
               <w:rPr>
@@ -2194,7 +2192,7 @@
               <w:lang w:eastAsia="en-BW"/>
             </w:rPr>
           </w:pPr>
-          <w:hyperlink w:anchor="_Toc235357155" w:history="1">
+          <w:hyperlink w:anchor="_Toc235388807" w:history="1">
             <w:r>
               <w:rPr>
                 <w:rStyle w:val="Hyperlink"/>
@@ -2238,7 +2236,7 @@
                 <w:noProof/>
                 <w:webHidden/>
               </w:rPr>
-              <w:instrText xml:space="preserve"> PAGEREF _Toc235357155 \h </w:instrText>
+              <w:instrText xml:space="preserve"> PAGEREF _Toc235388807 \h </w:instrText>
             </w:r>
             <w:r>
               <w:rPr>
@@ -2258,7 +2256,447 @@
                 <w:noProof/>
                 <w:webHidden/>
               </w:rPr>
-              <w:t>7</w:t>
+              <w:t>2</w:t>
+            </w:r>
+            <w:r>
+              <w:rPr>
+                <w:noProof/>
+                <w:webHidden/>
+              </w:rPr>
+              <w:fldChar w:fldCharType="end"/>
+            </w:r>
+          </w:hyperlink>
+        </w:p>
+        <w:p>
+          <w:pPr>
+            <w:pStyle w:val="TOC3"/>
+            <w:tabs>
+              <w:tab w:val="left" w:pos="1440"/>
+              <w:tab w:val="right" w:leader="dot" w:pos="9628"/>
+            </w:tabs>
+            <w:rPr>
+              <w:rFonts w:eastAsiaTheme="minorEastAsia"/>
+              <w:noProof/>
+              <w:lang w:eastAsia="en-BW"/>
+            </w:rPr>
+          </w:pPr>
+          <w:hyperlink w:anchor="_Toc235388808" w:history="1">
+            <w:r>
+              <w:rPr>
+                <w:rStyle w:val="Hyperlink"/>
+                <w:noProof/>
+                <w:lang w:val="en-US"/>
+              </w:rPr>
+              <w:t>3.2.6</w:t>
+            </w:r>
+            <w:r>
+              <w:rPr>
+                <w:rFonts w:eastAsiaTheme="minorEastAsia"/>
+                <w:noProof/>
+                <w:lang w:eastAsia="en-BW"/>
+              </w:rPr>
+              <w:tab/>
+            </w:r>
+            <w:r>
+              <w:rPr>
+                <w:rStyle w:val="Hyperlink"/>
+                <w:noProof/>
+                <w:lang w:val="en-US"/>
+              </w:rPr>
+              <w:t>MATLAB File Extension</w:t>
+            </w:r>
+            <w:r>
+              <w:rPr>
+                <w:noProof/>
+                <w:webHidden/>
+              </w:rPr>
+              <w:tab/>
+            </w:r>
+            <w:r>
+              <w:rPr>
+                <w:noProof/>
+                <w:webHidden/>
+              </w:rPr>
+              <w:fldChar w:fldCharType="begin"/>
+            </w:r>
+            <w:r>
+              <w:rPr>
+                <w:noProof/>
+                <w:webHidden/>
+              </w:rPr>
+              <w:instrText xml:space="preserve"> PAGEREF _Toc235388808 \h </w:instrText>
+            </w:r>
+            <w:r>
+              <w:rPr>
+                <w:noProof/>
+                <w:webHidden/>
+              </w:rPr>
+            </w:r>
+            <w:r>
+              <w:rPr>
+                <w:noProof/>
+                <w:webHidden/>
+              </w:rPr>
+              <w:fldChar w:fldCharType="separate"/>
+            </w:r>
+            <w:r>
+              <w:rPr>
+                <w:noProof/>
+                <w:webHidden/>
+              </w:rPr>
+              <w:t>2</w:t>
+            </w:r>
+            <w:r>
+              <w:rPr>
+                <w:noProof/>
+                <w:webHidden/>
+              </w:rPr>
+              <w:fldChar w:fldCharType="end"/>
+            </w:r>
+          </w:hyperlink>
+        </w:p>
+        <w:p>
+          <w:pPr>
+            <w:pStyle w:val="TOC2"/>
+            <w:tabs>
+              <w:tab w:val="left" w:pos="960"/>
+              <w:tab w:val="right" w:leader="dot" w:pos="9628"/>
+            </w:tabs>
+            <w:rPr>
+              <w:rFonts w:eastAsiaTheme="minorEastAsia"/>
+              <w:noProof/>
+              <w:lang w:eastAsia="en-BW"/>
+            </w:rPr>
+          </w:pPr>
+          <w:hyperlink w:anchor="_Toc235388809" w:history="1">
+            <w:r>
+              <w:rPr>
+                <w:rStyle w:val="Hyperlink"/>
+                <w:noProof/>
+                <w:lang w:val="en-US"/>
+              </w:rPr>
+              <w:t>3.3</w:t>
+            </w:r>
+            <w:r>
+              <w:rPr>
+                <w:rFonts w:eastAsiaTheme="minorEastAsia"/>
+                <w:noProof/>
+                <w:lang w:eastAsia="en-BW"/>
+              </w:rPr>
+              <w:tab/>
+            </w:r>
+            <w:r>
+              <w:rPr>
+                <w:rStyle w:val="Hyperlink"/>
+                <w:noProof/>
+                <w:lang w:val="en-US"/>
+              </w:rPr>
+              <w:t>Script (The Editor)</w:t>
+            </w:r>
+            <w:r>
+              <w:rPr>
+                <w:noProof/>
+                <w:webHidden/>
+              </w:rPr>
+              <w:tab/>
+            </w:r>
+            <w:r>
+              <w:rPr>
+                <w:noProof/>
+                <w:webHidden/>
+              </w:rPr>
+              <w:fldChar w:fldCharType="begin"/>
+            </w:r>
+            <w:r>
+              <w:rPr>
+                <w:noProof/>
+                <w:webHidden/>
+              </w:rPr>
+              <w:instrText xml:space="preserve"> PAGEREF _Toc235388809 \h </w:instrText>
+            </w:r>
+            <w:r>
+              <w:rPr>
+                <w:noProof/>
+                <w:webHidden/>
+              </w:rPr>
+            </w:r>
+            <w:r>
+              <w:rPr>
+                <w:noProof/>
+                <w:webHidden/>
+              </w:rPr>
+              <w:fldChar w:fldCharType="separate"/>
+            </w:r>
+            <w:r>
+              <w:rPr>
+                <w:noProof/>
+                <w:webHidden/>
+              </w:rPr>
+              <w:t>2</w:t>
+            </w:r>
+            <w:r>
+              <w:rPr>
+                <w:noProof/>
+                <w:webHidden/>
+              </w:rPr>
+              <w:fldChar w:fldCharType="end"/>
+            </w:r>
+          </w:hyperlink>
+        </w:p>
+        <w:p>
+          <w:pPr>
+            <w:pStyle w:val="TOC3"/>
+            <w:tabs>
+              <w:tab w:val="left" w:pos="1440"/>
+              <w:tab w:val="right" w:leader="dot" w:pos="9628"/>
+            </w:tabs>
+            <w:rPr>
+              <w:rFonts w:eastAsiaTheme="minorEastAsia"/>
+              <w:noProof/>
+              <w:lang w:eastAsia="en-BW"/>
+            </w:rPr>
+          </w:pPr>
+          <w:hyperlink w:anchor="_Toc235388810" w:history="1">
+            <w:r>
+              <w:rPr>
+                <w:rStyle w:val="Hyperlink"/>
+                <w:noProof/>
+                <w:lang w:val="en-US"/>
+              </w:rPr>
+              <w:t>3.3.1</w:t>
+            </w:r>
+            <w:r>
+              <w:rPr>
+                <w:rFonts w:eastAsiaTheme="minorEastAsia"/>
+                <w:noProof/>
+                <w:lang w:eastAsia="en-BW"/>
+              </w:rPr>
+              <w:tab/>
+            </w:r>
+            <w:r>
+              <w:rPr>
+                <w:rStyle w:val="Hyperlink"/>
+                <w:noProof/>
+                <w:lang w:val="en-US"/>
+              </w:rPr>
+              <w:t>How to Create a Script</w:t>
+            </w:r>
+            <w:r>
+              <w:rPr>
+                <w:noProof/>
+                <w:webHidden/>
+              </w:rPr>
+              <w:tab/>
+            </w:r>
+            <w:r>
+              <w:rPr>
+                <w:noProof/>
+                <w:webHidden/>
+              </w:rPr>
+              <w:fldChar w:fldCharType="begin"/>
+            </w:r>
+            <w:r>
+              <w:rPr>
+                <w:noProof/>
+                <w:webHidden/>
+              </w:rPr>
+              <w:instrText xml:space="preserve"> PAGEREF _Toc235388810 \h </w:instrText>
+            </w:r>
+            <w:r>
+              <w:rPr>
+                <w:noProof/>
+                <w:webHidden/>
+              </w:rPr>
+            </w:r>
+            <w:r>
+              <w:rPr>
+                <w:noProof/>
+                <w:webHidden/>
+              </w:rPr>
+              <w:fldChar w:fldCharType="separate"/>
+            </w:r>
+            <w:r>
+              <w:rPr>
+                <w:noProof/>
+                <w:webHidden/>
+              </w:rPr>
+              <w:t>2</w:t>
+            </w:r>
+            <w:r>
+              <w:rPr>
+                <w:noProof/>
+                <w:webHidden/>
+              </w:rPr>
+              <w:fldChar w:fldCharType="end"/>
+            </w:r>
+          </w:hyperlink>
+        </w:p>
+        <w:p>
+          <w:pPr>
+            <w:pStyle w:val="TOC2"/>
+            <w:tabs>
+              <w:tab w:val="left" w:pos="960"/>
+              <w:tab w:val="right" w:leader="dot" w:pos="9628"/>
+            </w:tabs>
+            <w:rPr>
+              <w:rFonts w:eastAsiaTheme="minorEastAsia"/>
+              <w:noProof/>
+              <w:lang w:eastAsia="en-BW"/>
+            </w:rPr>
+          </w:pPr>
+          <w:hyperlink w:anchor="_Toc235388811" w:history="1">
+            <w:r>
+              <w:rPr>
+                <w:rStyle w:val="Hyperlink"/>
+                <w:noProof/>
+                <w:lang w:val="en-US"/>
+              </w:rPr>
+              <w:t>3.4</w:t>
+            </w:r>
+            <w:r>
+              <w:rPr>
+                <w:rFonts w:eastAsiaTheme="minorEastAsia"/>
+                <w:noProof/>
+                <w:lang w:eastAsia="en-BW"/>
+              </w:rPr>
+              <w:tab/>
+            </w:r>
+            <w:r>
+              <w:rPr>
+                <w:rStyle w:val="Hyperlink"/>
+                <w:noProof/>
+                <w:lang w:val="en-US"/>
+              </w:rPr>
+              <w:t>Live Script</w:t>
+            </w:r>
+            <w:r>
+              <w:rPr>
+                <w:noProof/>
+                <w:webHidden/>
+              </w:rPr>
+              <w:tab/>
+            </w:r>
+            <w:r>
+              <w:rPr>
+                <w:noProof/>
+                <w:webHidden/>
+              </w:rPr>
+              <w:fldChar w:fldCharType="begin"/>
+            </w:r>
+            <w:r>
+              <w:rPr>
+                <w:noProof/>
+                <w:webHidden/>
+              </w:rPr>
+              <w:instrText xml:space="preserve"> PAGEREF _Toc235388811 \h </w:instrText>
+            </w:r>
+            <w:r>
+              <w:rPr>
+                <w:noProof/>
+                <w:webHidden/>
+              </w:rPr>
+            </w:r>
+            <w:r>
+              <w:rPr>
+                <w:noProof/>
+                <w:webHidden/>
+              </w:rPr>
+              <w:fldChar w:fldCharType="separate"/>
+            </w:r>
+            <w:r>
+              <w:rPr>
+                <w:noProof/>
+                <w:webHidden/>
+              </w:rPr>
+              <w:t>2</w:t>
+            </w:r>
+            <w:r>
+              <w:rPr>
+                <w:noProof/>
+                <w:webHidden/>
+              </w:rPr>
+              <w:fldChar w:fldCharType="end"/>
+            </w:r>
+          </w:hyperlink>
+        </w:p>
+        <w:p>
+          <w:pPr>
+            <w:pStyle w:val="TOC3"/>
+            <w:tabs>
+              <w:tab w:val="left" w:pos="1440"/>
+              <w:tab w:val="right" w:leader="dot" w:pos="9628"/>
+            </w:tabs>
+            <w:rPr>
+              <w:rFonts w:eastAsiaTheme="minorEastAsia"/>
+              <w:noProof/>
+              <w:lang w:eastAsia="en-BW"/>
+            </w:rPr>
+          </w:pPr>
+          <w:hyperlink w:anchor="_Toc235388812" w:history="1">
+            <w:r>
+              <w:rPr>
+                <w:rStyle w:val="Hyperlink"/>
+                <w:noProof/>
+                <w:lang w:val="en-US"/>
+              </w:rPr>
+              <w:t>3.4.1</w:t>
+            </w:r>
+            <w:r>
+              <w:rPr>
+                <w:rFonts w:eastAsiaTheme="minorEastAsia"/>
+                <w:noProof/>
+                <w:lang w:eastAsia="en-BW"/>
+              </w:rPr>
+              <w:tab/>
+            </w:r>
+            <w:r>
+              <w:rPr>
+                <w:rStyle w:val="Hyperlink"/>
+                <w:noProof/>
+                <w:lang w:val="en-US"/>
+              </w:rPr>
+              <w:t>How to Create a Live Script</w:t>
+            </w:r>
+            <w:r>
+              <w:rPr>
+                <w:noProof/>
+                <w:webHidden/>
+              </w:rPr>
+              <w:tab/>
+            </w:r>
+            <w:r>
+              <w:rPr>
+                <w:noProof/>
+                <w:webHidden/>
+              </w:rPr>
+              <w:fldChar w:fldCharType="begin"/>
+            </w:r>
+            <w:r>
+              <w:rPr>
+                <w:noProof/>
+                <w:webHidden/>
+              </w:rPr>
+              <w:instrText xml:space="preserve"> PAGEREF _Toc235388812 \h </w:instrText>
+            </w:r>
+            <w:r>
+              <w:rPr>
+                <w:noProof/>
+                <w:webHidden/>
+              </w:rPr>
+            </w:r>
+            <w:r>
+              <w:rPr>
+                <w:noProof/>
+                <w:webHidden/>
+              </w:rPr>
+              <w:fldChar w:fldCharType="separate"/>
+            </w:r>
+            <w:r>
+              <w:rPr>
+                <w:noProof/>
+                <w:webHidden/>
+              </w:rPr>
+              <w:t>2</w:t>
             </w:r>
             <w:r>
               <w:rPr>
@@ -2276,16 +2714,12 @@
               <w:bCs/>
               <w:noProof/>
             </w:rPr>
+            <w:lastRenderedPageBreak/>
             <w:fldChar w:fldCharType="end"/>
           </w:r>
         </w:p>
       </w:sdtContent>
     </w:sdt>
-    <w:p>
-      <w:pPr>
-        <w:jc w:val="both"/>
-      </w:pPr>
-    </w:p>
     <w:p>
       <w:pPr>
         <w:pStyle w:val="Heading1"/>
@@ -2300,13 +2734,12 @@
           <w:lang w:val="en-US"/>
         </w:rPr>
       </w:pPr>
-      <w:bookmarkStart w:id="1" w:name="_Toc235357131"/>
+      <w:bookmarkStart w:id="1" w:name="_Toc235388783"/>
       <w:r>
         <w:rPr>
           <w:color w:val="C00000"/>
           <w:lang w:val="en-US"/>
         </w:rPr>
-        <w:lastRenderedPageBreak/>
         <w:t>Purpose of Learning MATLAB</w:t>
       </w:r>
       <w:bookmarkEnd w:id="0"/>
@@ -2326,7 +2759,7 @@
         </w:rPr>
       </w:pPr>
       <w:bookmarkStart w:id="2" w:name="_Toc235277264"/>
-      <w:bookmarkStart w:id="3" w:name="_Toc235357132"/>
+      <w:bookmarkStart w:id="3" w:name="_Toc235388784"/>
       <w:r>
         <w:rPr>
           <w:lang w:val="en-US"/>
@@ -2447,7 +2880,7 @@
           <w:lang w:val="en-US"/>
         </w:rPr>
       </w:pPr>
-      <w:bookmarkStart w:id="4" w:name="_Toc235357133"/>
+      <w:bookmarkStart w:id="4" w:name="_Toc235388785"/>
       <w:r>
         <w:rPr>
           <w:lang w:val="en-US"/>
@@ -2507,7 +2940,7 @@
           <w:lang w:val="en-US"/>
         </w:rPr>
       </w:pPr>
-      <w:bookmarkStart w:id="5" w:name="_Toc235357134"/>
+      <w:bookmarkStart w:id="5" w:name="_Toc235388786"/>
       <w:r>
         <w:rPr>
           <w:lang w:val="en-US"/>
@@ -2567,7 +3000,7 @@
           <w:lang w:val="en-US"/>
         </w:rPr>
       </w:pPr>
-      <w:bookmarkStart w:id="6" w:name="_Toc235357135"/>
+      <w:bookmarkStart w:id="6" w:name="_Toc235388787"/>
       <w:r>
         <w:rPr>
           <w:lang w:val="en-US"/>
@@ -2627,7 +3060,7 @@
           <w:lang w:val="en-US"/>
         </w:rPr>
       </w:pPr>
-      <w:bookmarkStart w:id="7" w:name="_Toc235357136"/>
+      <w:bookmarkStart w:id="7" w:name="_Toc235388788"/>
       <w:r>
         <w:rPr>
           <w:lang w:val="en-US"/>
@@ -2686,7 +3119,7 @@
           <w:lang w:val="en-US"/>
         </w:rPr>
       </w:pPr>
-      <w:bookmarkStart w:id="8" w:name="_Toc235357137"/>
+      <w:bookmarkStart w:id="8" w:name="_Toc235388789"/>
       <w:r>
         <w:rPr>
           <w:lang w:val="en-US"/>
@@ -2720,7 +3153,6 @@
         <w:rPr>
           <w:lang w:val="en-US"/>
         </w:rPr>
-        <w:lastRenderedPageBreak/>
         <w:t>The core reasons are:</w:t>
       </w:r>
     </w:p>
@@ -2736,7 +3168,7 @@
           <w:lang w:val="en-US"/>
         </w:rPr>
       </w:pPr>
-      <w:bookmarkStart w:id="9" w:name="_Toc235357138"/>
+      <w:bookmarkStart w:id="9" w:name="_Toc235388790"/>
       <w:r>
         <w:rPr>
           <w:lang w:val="en-US"/>
@@ -2811,7 +3243,7 @@
           <w:lang w:val="en-US"/>
         </w:rPr>
       </w:pPr>
-      <w:bookmarkStart w:id="10" w:name="_Toc235357139"/>
+      <w:bookmarkStart w:id="10" w:name="_Toc235388791"/>
       <w:r>
         <w:rPr>
           <w:lang w:val="en-US"/>
@@ -2886,7 +3318,7 @@
           <w:lang w:val="en-US"/>
         </w:rPr>
       </w:pPr>
-      <w:bookmarkStart w:id="11" w:name="_Toc235357140"/>
+      <w:bookmarkStart w:id="11" w:name="_Toc235388792"/>
       <w:r>
         <w:rPr>
           <w:lang w:val="en-US"/>
@@ -2967,7 +3399,7 @@
           <w:lang w:val="en-US"/>
         </w:rPr>
       </w:pPr>
-      <w:bookmarkStart w:id="12" w:name="_Toc235357141"/>
+      <w:bookmarkStart w:id="12" w:name="_Toc235388793"/>
       <w:r>
         <w:rPr>
           <w:lang w:val="en-US"/>
@@ -3070,7 +3502,7 @@
           <w:lang w:val="en-US"/>
         </w:rPr>
       </w:pPr>
-      <w:bookmarkStart w:id="13" w:name="_Toc235357142"/>
+      <w:bookmarkStart w:id="13" w:name="_Toc235388794"/>
       <w:r>
         <w:rPr>
           <w:color w:val="C00000"/>
@@ -3119,7 +3551,7 @@
           <w:lang w:val="en-US"/>
         </w:rPr>
       </w:pPr>
-      <w:bookmarkStart w:id="14" w:name="_Toc235357143"/>
+      <w:bookmarkStart w:id="14" w:name="_Toc235388795"/>
       <w:r>
         <w:t>Command</w:t>
       </w:r>
@@ -3175,7 +3607,6 @@
         <w:rPr>
           <w:lang w:val="en-US"/>
         </w:rPr>
-        <w:lastRenderedPageBreak/>
         <w:t>Immediate Code Execution</w:t>
       </w:r>
     </w:p>
@@ -3353,7 +3784,7 @@
           <w:lang w:val="en-US"/>
         </w:rPr>
       </w:pPr>
-      <w:bookmarkStart w:id="15" w:name="_Toc235357144"/>
+      <w:bookmarkStart w:id="15" w:name="_Toc235388796"/>
       <w:r>
         <w:rPr>
           <w:lang w:val="en-US"/>
@@ -3388,7 +3819,7 @@
           <w:lang w:val="en-US"/>
         </w:rPr>
       </w:pPr>
-      <w:bookmarkStart w:id="16" w:name="_Toc235357145"/>
+      <w:bookmarkStart w:id="16" w:name="_Toc235388797"/>
       <w:r>
         <w:rPr>
           <w:lang w:val="en-US"/>
@@ -3496,7 +3927,7 @@
           <w:lang w:val="en-US"/>
         </w:rPr>
       </w:pPr>
-      <w:bookmarkStart w:id="17" w:name="_Toc235357146"/>
+      <w:bookmarkStart w:id="17" w:name="_Toc235388798"/>
       <w:r>
         <w:rPr>
           <w:lang w:val="en-US"/>
@@ -3585,7 +4016,6 @@
         <w:rPr>
           <w:lang w:val="en-US"/>
         </w:rPr>
-        <w:lastRenderedPageBreak/>
         <w:t>It looks like,</w:t>
       </w:r>
     </w:p>
@@ -3653,7 +4083,7 @@
           <w:lang w:val="en-US"/>
         </w:rPr>
       </w:pPr>
-      <w:bookmarkStart w:id="18" w:name="_Toc235357147"/>
+      <w:bookmarkStart w:id="18" w:name="_Toc235388799"/>
       <w:r>
         <w:rPr>
           <w:lang w:val="en-US"/>
@@ -3829,13 +4259,13 @@
         </w:numPr>
         <w:ind w:left="426" w:hanging="426"/>
         <w:rPr>
-          <w:lang w:val="en-US"/>
-        </w:rPr>
-      </w:pPr>
-      <w:bookmarkStart w:id="19" w:name="_Toc235357148"/>
-      <w:r>
-        <w:rPr>
-          <w:lang w:val="en-US"/>
+          <w:color w:val="C00000"/>
+        </w:rPr>
+      </w:pPr>
+      <w:bookmarkStart w:id="19" w:name="_Toc235388800"/>
+      <w:r>
+        <w:rPr>
+          <w:color w:val="C00000"/>
         </w:rPr>
         <w:t>MATLAB Introduction</w:t>
       </w:r>
@@ -3867,7 +4297,7 @@
           <w:lang w:val="en-US"/>
         </w:rPr>
       </w:pPr>
-      <w:bookmarkStart w:id="20" w:name="_Toc235357149"/>
+      <w:bookmarkStart w:id="20" w:name="_Toc235388801"/>
       <w:r>
         <w:rPr>
           <w:lang w:val="en-US"/>
@@ -3962,7 +4392,6 @@
         <w:rPr>
           <w:lang w:val="en-US"/>
         </w:rPr>
-        <w:lastRenderedPageBreak/>
         <w:t>You can type values directly using standard shorthand. MATLAB interprets both lowercase and uppercase ‘e’ the same way.</w:t>
       </w:r>
     </w:p>
@@ -4154,7 +4583,7 @@
           <w:lang w:val="en-US"/>
         </w:rPr>
       </w:pPr>
-      <w:bookmarkStart w:id="21" w:name="_Toc235357150"/>
+      <w:bookmarkStart w:id="21" w:name="_Toc235388802"/>
       <w:r>
         <w:rPr>
           <w:lang w:val="en-US"/>
@@ -4190,7 +4619,7 @@
           <w:lang w:val="en-US"/>
         </w:rPr>
       </w:pPr>
-      <w:bookmarkStart w:id="22" w:name="_Toc235357151"/>
+      <w:bookmarkStart w:id="22" w:name="_Toc235388803"/>
       <w:r>
         <w:rPr>
           <w:lang w:val="en-US"/>
@@ -4298,7 +4727,7 @@
           <w:lang w:val="en-US"/>
         </w:rPr>
       </w:pPr>
-      <w:bookmarkStart w:id="23" w:name="_Toc235357152"/>
+      <w:bookmarkStart w:id="23" w:name="_Toc235388804"/>
       <w:r>
         <w:rPr>
           <w:lang w:val="en-US"/>
@@ -4496,7 +4925,6 @@
         <w:rPr>
           <w:lang w:val="en-US"/>
         </w:rPr>
-        <w:lastRenderedPageBreak/>
         <w:t xml:space="preserve">Object-oriented code files starting with the </w:t>
       </w:r>
       <w:r>
@@ -4544,7 +4972,7 @@
           <w:lang w:val="en-US"/>
         </w:rPr>
       </w:pPr>
-      <w:bookmarkStart w:id="24" w:name="_Toc235357153"/>
+      <w:bookmarkStart w:id="24" w:name="_Toc235388805"/>
       <w:r>
         <w:rPr>
           <w:lang w:val="en-US"/>
@@ -4562,11 +4990,15 @@
         </w:numPr>
         <w:jc w:val="both"/>
         <w:rPr>
-          <w:lang w:val="en-US"/>
-        </w:rPr>
-      </w:pPr>
-      <w:r>
-        <w:rPr>
+          <w:b/>
+          <w:bCs/>
+          <w:lang w:val="en-US"/>
+        </w:rPr>
+      </w:pPr>
+      <w:r>
+        <w:rPr>
+          <w:b/>
+          <w:bCs/>
           <w:lang w:val="en-US"/>
         </w:rPr>
         <w:t>The Live Editor (Live Scripts):</w:t>
@@ -4652,7 +5084,7 @@
           <w:lang w:val="en-US"/>
         </w:rPr>
       </w:pPr>
-      <w:bookmarkStart w:id="25" w:name="_Toc235357154"/>
+      <w:bookmarkStart w:id="25" w:name="_Toc235388806"/>
       <w:r>
         <w:rPr>
           <w:lang w:val="en-US"/>
@@ -4670,11 +5102,15 @@
         </w:numPr>
         <w:jc w:val="both"/>
         <w:rPr>
-          <w:lang w:val="en-US"/>
-        </w:rPr>
-      </w:pPr>
-      <w:r>
-        <w:rPr>
+          <w:b/>
+          <w:bCs/>
+          <w:lang w:val="en-US"/>
+        </w:rPr>
+      </w:pPr>
+      <w:r>
+        <w:rPr>
+          <w:b/>
+          <w:bCs/>
           <w:lang w:val="en-US"/>
         </w:rPr>
         <w:t>Simulink &amp; MATLAB Function Blocks:</w:t>
@@ -4736,7 +5172,7 @@
           <w:lang w:val="en-US"/>
         </w:rPr>
       </w:pPr>
-      <w:bookmarkStart w:id="26" w:name="_Toc235357155"/>
+      <w:bookmarkStart w:id="26" w:name="_Toc235388807"/>
       <w:r>
         <w:rPr>
           <w:lang w:val="en-US"/>
@@ -4753,11 +5189,15 @@
           <w:numId w:val="4"/>
         </w:numPr>
         <w:rPr>
-          <w:lang w:val="en-US"/>
-        </w:rPr>
-      </w:pPr>
-      <w:r>
-        <w:rPr>
+          <w:b/>
+          <w:bCs/>
+          <w:lang w:val="en-US"/>
+        </w:rPr>
+      </w:pPr>
+      <w:r>
+        <w:rPr>
+          <w:b/>
+          <w:bCs/>
           <w:lang w:val="en-US"/>
         </w:rPr>
         <w:t xml:space="preserve">External Editors: </w:t>
@@ -4793,12 +5233,14 @@
           <w:lang w:val="en-US"/>
         </w:rPr>
       </w:pPr>
+      <w:bookmarkStart w:id="27" w:name="_Toc235388808"/>
       <w:r>
         <w:rPr>
           <w:lang w:val="en-US"/>
         </w:rPr>
         <w:t>MATLAB File Extension</w:t>
       </w:r>
+      <w:bookmarkEnd w:id="27"/>
     </w:p>
     <w:p>
       <w:pPr>
@@ -4860,11 +5302,15 @@
     <w:p>
       <w:pPr>
         <w:rPr>
-          <w:lang w:val="en-US"/>
-        </w:rPr>
-      </w:pPr>
-      <w:r>
-        <w:rPr>
+          <w:b/>
+          <w:bCs/>
+          <w:lang w:val="en-US"/>
+        </w:rPr>
+      </w:pPr>
+      <w:r>
+        <w:rPr>
+          <w:b/>
+          <w:bCs/>
           <w:lang w:val="en-US"/>
         </w:rPr>
         <w:t>Rules for file name:</w:t>
@@ -4954,12 +5400,14 @@
           <w:lang w:val="en-US"/>
         </w:rPr>
       </w:pPr>
+      <w:bookmarkStart w:id="28" w:name="_Toc235388809"/>
       <w:r>
         <w:rPr>
           <w:lang w:val="en-US"/>
         </w:rPr>
         <w:t>Script (The Editor)</w:t>
       </w:r>
+      <w:bookmarkEnd w:id="28"/>
     </w:p>
     <w:p>
       <w:pPr>
@@ -4977,67 +5425,268 @@
     </w:p>
     <w:p>
       <w:pPr>
+        <w:pStyle w:val="ListParagraph"/>
+        <w:numPr>
+          <w:ilvl w:val="0"/>
+          <w:numId w:val="4"/>
+        </w:numPr>
+        <w:jc w:val="both"/>
+        <w:rPr>
+          <w:lang w:val="en-US"/>
+        </w:rPr>
+      </w:pPr>
+      <w:r>
+        <w:rPr>
+          <w:lang w:val="en-US"/>
+        </w:rPr>
+        <w:t xml:space="preserve">File extension: </w:t>
+      </w:r>
+      <w:r>
+        <w:rPr>
+          <w:color w:val="EE0000"/>
+          <w:highlight w:val="lightGray"/>
+          <w:lang w:val="en-US"/>
+        </w:rPr>
+        <w:t>‘.m’</w:t>
+      </w:r>
+      <w:r>
+        <w:rPr>
+          <w:lang w:val="en-US"/>
+        </w:rPr>
+        <w:t>,</w:t>
+      </w:r>
+      <w:r>
+        <w:rPr>
+          <w:color w:val="EE0000"/>
+          <w:lang w:val="en-US"/>
+        </w:rPr>
+        <w:t xml:space="preserve"> </w:t>
+      </w:r>
+      <w:r>
+        <w:rPr>
+          <w:lang w:val="en-US"/>
+        </w:rPr>
+        <w:t xml:space="preserve">e.g., </w:t>
+      </w:r>
+      <w:r>
+        <w:rPr>
+          <w:lang w:val="en-US"/>
+        </w:rPr>
+        <w:t>file.m</w:t>
+      </w:r>
+    </w:p>
+    <w:p>
+      <w:pPr>
         <w:pStyle w:val="Heading3"/>
-        <w:rPr>
-          <w:lang w:val="en-US"/>
-        </w:rPr>
-      </w:pPr>
-      <w:r>
-        <w:rPr>
-          <w:lang w:val="en-US"/>
-        </w:rPr>
-        <w:lastRenderedPageBreak/>
-        <w:t xml:space="preserve">3.3.1 </w:t>
-      </w:r>
-    </w:p>
-    <w:p>
-      <w:pPr>
-        <w:jc w:val="both"/>
-        <w:rPr>
-          <w:lang w:val="en-US"/>
-        </w:rPr>
-      </w:pPr>
-      <w:r>
-        <w:rPr>
-          <w:lang w:val="en-US"/>
-        </w:rPr>
-        <w:t>Scratch Work:</w:t>
-      </w:r>
-    </w:p>
-    <w:p>
-      <w:pPr>
-        <w:jc w:val="both"/>
-        <w:rPr>
-          <w:lang w:val="en-US"/>
-        </w:rPr>
-      </w:pPr>
-    </w:p>
-    <w:p>
-      <w:pPr>
-        <w:jc w:val="both"/>
-        <w:rPr>
-          <w:lang w:val="en-US"/>
-        </w:rPr>
-      </w:pPr>
-      <w:r>
-        <w:rPr>
-          <w:lang w:val="en-US"/>
-        </w:rPr>
-        <w:t>Script, how it works</w:t>
-      </w:r>
-    </w:p>
-    <w:p>
-      <w:pPr>
-        <w:jc w:val="both"/>
-        <w:rPr>
-          <w:lang w:val="en-US"/>
-        </w:rPr>
-      </w:pPr>
-      <w:r>
-        <w:rPr>
-          <w:lang w:val="en-US"/>
-        </w:rPr>
-        <w:t>Example</w:t>
+        <w:numPr>
+          <w:ilvl w:val="2"/>
+          <w:numId w:val="14"/>
+        </w:numPr>
+        <w:ind w:left="709"/>
+        <w:rPr>
+          <w:lang w:val="en-US"/>
+        </w:rPr>
+      </w:pPr>
+      <w:bookmarkStart w:id="29" w:name="_Toc235388810"/>
+      <w:r>
+        <w:rPr>
+          <w:lang w:val="en-US"/>
+        </w:rPr>
+        <w:t>How to Create a Script</w:t>
+      </w:r>
+      <w:bookmarkEnd w:id="29"/>
+    </w:p>
+    <w:p>
+      <w:pPr>
+        <w:jc w:val="both"/>
+        <w:rPr>
+          <w:lang w:val="en-US"/>
+        </w:rPr>
+      </w:pPr>
+      <w:r>
+        <w:rPr>
+          <w:lang w:val="en-US"/>
+        </w:rPr>
+        <w:t>You can start a new script file using any of these methods:</w:t>
+      </w:r>
+    </w:p>
+    <w:p>
+      <w:pPr>
+        <w:pStyle w:val="ListParagraph"/>
+        <w:numPr>
+          <w:ilvl w:val="0"/>
+          <w:numId w:val="4"/>
+        </w:numPr>
+        <w:jc w:val="both"/>
+        <w:rPr>
+          <w:lang w:val="en-US"/>
+        </w:rPr>
+      </w:pPr>
+      <w:r>
+        <w:rPr>
+          <w:b/>
+          <w:bCs/>
+          <w:lang w:val="en-US"/>
+        </w:rPr>
+        <w:t>The Toolbar:</w:t>
+      </w:r>
+      <w:r>
+        <w:rPr>
+          <w:lang w:val="en-US"/>
+        </w:rPr>
+        <w:t xml:space="preserve"> Click the New Script button under the </w:t>
+      </w:r>
+      <w:r>
+        <w:rPr>
+          <w:i/>
+          <w:iCs/>
+          <w:lang w:val="en-US"/>
+        </w:rPr>
+        <w:t>Home</w:t>
+      </w:r>
+      <w:r>
+        <w:rPr>
+          <w:lang w:val="en-US"/>
+        </w:rPr>
+        <w:t xml:space="preserve"> or </w:t>
+      </w:r>
+      <w:r>
+        <w:rPr>
+          <w:i/>
+          <w:iCs/>
+          <w:lang w:val="en-US"/>
+        </w:rPr>
+        <w:t>Editor</w:t>
+      </w:r>
+      <w:r>
+        <w:rPr>
+          <w:lang w:val="en-US"/>
+        </w:rPr>
+        <w:t xml:space="preserve"> tab.</w:t>
+      </w:r>
+    </w:p>
+    <w:p>
+      <w:pPr>
+        <w:pStyle w:val="ListParagraph"/>
+        <w:numPr>
+          <w:ilvl w:val="0"/>
+          <w:numId w:val="4"/>
+        </w:numPr>
+        <w:jc w:val="both"/>
+        <w:rPr>
+          <w:lang w:val="en-US"/>
+        </w:rPr>
+      </w:pPr>
+      <w:r>
+        <w:rPr>
+          <w:b/>
+          <w:bCs/>
+          <w:lang w:val="en-US"/>
+        </w:rPr>
+        <w:t>The Command Window:</w:t>
+      </w:r>
+      <w:r>
+        <w:rPr>
+          <w:lang w:val="en-US"/>
+        </w:rPr>
+        <w:t xml:space="preserve"> Type </w:t>
+      </w:r>
+      <w:r>
+        <w:rPr>
+          <w:highlight w:val="lightGray"/>
+          <w:lang w:val="en-US"/>
+        </w:rPr>
+        <w:t>edit myscript.m</w:t>
+      </w:r>
+      <w:r>
+        <w:rPr>
+          <w:lang w:val="en-US"/>
+        </w:rPr>
+        <w:t xml:space="preserve"> in command prompt to automatically create and open a file named </w:t>
+      </w:r>
+      <w:r>
+        <w:rPr>
+          <w:highlight w:val="lightGray"/>
+          <w:lang w:val="en-US"/>
+        </w:rPr>
+        <w:t>myscript.m</w:t>
+      </w:r>
+      <w:r>
+        <w:rPr>
+          <w:lang w:val="en-US"/>
+        </w:rPr>
+        <w:t>.</w:t>
+      </w:r>
+    </w:p>
+    <w:p>
+      <w:pPr>
+        <w:pStyle w:val="ListParagraph"/>
+        <w:numPr>
+          <w:ilvl w:val="0"/>
+          <w:numId w:val="4"/>
+        </w:numPr>
+        <w:jc w:val="both"/>
+        <w:rPr>
+          <w:lang w:val="en-US"/>
+        </w:rPr>
+      </w:pPr>
+      <w:r>
+        <w:rPr>
+          <w:b/>
+          <w:bCs/>
+          <w:lang w:val="en-US"/>
+        </w:rPr>
+        <w:t>Keyboard Shortcut:</w:t>
+      </w:r>
+      <w:r>
+        <w:rPr>
+          <w:lang w:val="en-US"/>
+        </w:rPr>
+        <w:t xml:space="preserve"> Press </w:t>
+      </w:r>
+      <w:r>
+        <w:rPr>
+          <w:highlight w:val="lightGray"/>
+          <w:lang w:val="en-US"/>
+        </w:rPr>
+        <w:t>Ctrl + N</w:t>
+      </w:r>
+      <w:r>
+        <w:rPr>
+          <w:lang w:val="en-US"/>
+        </w:rPr>
+        <w:t xml:space="preserve"> (in Windows OS) or </w:t>
+      </w:r>
+      <w:r>
+        <w:rPr>
+          <w:highlight w:val="lightGray"/>
+          <w:lang w:val="en-US"/>
+        </w:rPr>
+        <w:t>Cmd + N</w:t>
+      </w:r>
+      <w:r>
+        <w:rPr>
+          <w:lang w:val="en-US"/>
+        </w:rPr>
+        <w:t xml:space="preserve"> (in Mac OS).</w:t>
+      </w:r>
+    </w:p>
+    <w:p>
+      <w:pPr>
+        <w:jc w:val="both"/>
+        <w:rPr>
+          <w:b/>
+          <w:bCs/>
+          <w:lang w:val="en-US"/>
+        </w:rPr>
+      </w:pPr>
+      <w:r>
+        <w:rPr>
+          <w:b/>
+          <w:bCs/>
+          <w:lang w:val="en-US"/>
+        </w:rPr>
+        <w:t>Example 1:</w:t>
       </w:r>
     </w:p>
     <w:p>
@@ -5052,10 +5701,10 @@
           <w:lang w:val="en-US"/>
         </w:rPr>
         <w:drawing>
-          <wp:inline distT="0" distB="0" distL="0" distR="0" wp14:anchorId="1AB94E6E" wp14:editId="52028A28">
-            <wp:extent cx="5014395" cy="2758679"/>
-            <wp:effectExtent l="0" t="0" r="0" b="3810"/>
-            <wp:docPr id="1379186540" name="Picture 1"/>
+          <wp:inline distT="0" distB="0" distL="0" distR="0" wp14:anchorId="04401694" wp14:editId="4A5C716D">
+            <wp:extent cx="4266565" cy="1900391"/>
+            <wp:effectExtent l="19050" t="19050" r="19685" b="24130"/>
+            <wp:docPr id="1771132016" name="Picture 1"/>
             <wp:cNvGraphicFramePr>
               <a:graphicFrameLocks xmlns:a="http://schemas.openxmlformats.org/drawingml/2006/main" noChangeAspect="1"/>
             </wp:cNvGraphicFramePr>
@@ -5063,7 +5712,7 @@
               <a:graphicData uri="http://schemas.openxmlformats.org/drawingml/2006/picture">
                 <pic:pic xmlns:pic="http://schemas.openxmlformats.org/drawingml/2006/picture">
                   <pic:nvPicPr>
-                    <pic:cNvPr id="1379186540" name=""/>
+                    <pic:cNvPr id="1771132016" name=""/>
                     <pic:cNvPicPr/>
                   </pic:nvPicPr>
                   <pic:blipFill>
@@ -5075,11 +5724,16 @@
                   <pic:spPr>
                     <a:xfrm>
                       <a:off x="0" y="0"/>
-                      <a:ext cx="5014395" cy="2758679"/>
+                      <a:ext cx="4287703" cy="1909806"/>
                     </a:xfrm>
                     <a:prstGeom prst="rect">
                       <a:avLst/>
                     </a:prstGeom>
+                    <a:ln w="6350">
+                      <a:solidFill>
+                        <a:schemeClr val="tx1"/>
+                      </a:solidFill>
+                    </a:ln>
                   </pic:spPr>
                 </pic:pic>
               </a:graphicData>
@@ -5092,28 +5746,18 @@
       <w:pPr>
         <w:jc w:val="both"/>
         <w:rPr>
-          <w:lang w:val="en-US"/>
-        </w:rPr>
-      </w:pPr>
-      <w:r>
-        <w:rPr>
-          <w:lang w:val="en-US"/>
-        </w:rPr>
-        <w:t>Save the above file with file format</w:t>
-      </w:r>
-    </w:p>
-    <w:p>
-      <w:pPr>
-        <w:jc w:val="both"/>
-        <w:rPr>
-          <w:lang w:val="en-US"/>
-        </w:rPr>
-      </w:pPr>
-      <w:r>
-        <w:rPr>
-          <w:lang w:val="en-US"/>
-        </w:rPr>
-        <w:t>Example 2: Script</w:t>
+          <w:b/>
+          <w:bCs/>
+          <w:lang w:val="en-US"/>
+        </w:rPr>
+      </w:pPr>
+      <w:r>
+        <w:rPr>
+          <w:b/>
+          <w:bCs/>
+          <w:lang w:val="en-US"/>
+        </w:rPr>
+        <w:t>Output:</w:t>
       </w:r>
     </w:p>
     <w:p>
@@ -5128,10 +5772,10 @@
           <w:lang w:val="en-US"/>
         </w:rPr>
         <w:drawing>
-          <wp:inline distT="0" distB="0" distL="0" distR="0" wp14:anchorId="535C25FA" wp14:editId="59E9A23E">
-            <wp:extent cx="6120130" cy="3127375"/>
-            <wp:effectExtent l="0" t="0" r="0" b="0"/>
-            <wp:docPr id="749593736" name="Picture 1"/>
+          <wp:inline distT="0" distB="0" distL="0" distR="0" wp14:anchorId="5706B406" wp14:editId="3B717930">
+            <wp:extent cx="4266565" cy="2414461"/>
+            <wp:effectExtent l="19050" t="19050" r="19685" b="24130"/>
+            <wp:docPr id="1034990264" name="Picture 1"/>
             <wp:cNvGraphicFramePr>
               <a:graphicFrameLocks xmlns:a="http://schemas.openxmlformats.org/drawingml/2006/main" noChangeAspect="1"/>
             </wp:cNvGraphicFramePr>
@@ -5139,7 +5783,7 @@
               <a:graphicData uri="http://schemas.openxmlformats.org/drawingml/2006/picture">
                 <pic:pic xmlns:pic="http://schemas.openxmlformats.org/drawingml/2006/picture">
                   <pic:nvPicPr>
-                    <pic:cNvPr id="749593736" name=""/>
+                    <pic:cNvPr id="1034990264" name=""/>
                     <pic:cNvPicPr/>
                   </pic:nvPicPr>
                   <pic:blipFill>
@@ -5151,11 +5795,16 @@
                   <pic:spPr>
                     <a:xfrm>
                       <a:off x="0" y="0"/>
-                      <a:ext cx="6120130" cy="3127375"/>
+                      <a:ext cx="4291069" cy="2428328"/>
                     </a:xfrm>
                     <a:prstGeom prst="rect">
                       <a:avLst/>
                     </a:prstGeom>
+                    <a:ln w="6350">
+                      <a:solidFill>
+                        <a:schemeClr val="tx1"/>
+                      </a:solidFill>
+                    </a:ln>
                   </pic:spPr>
                 </pic:pic>
               </a:graphicData>
@@ -5168,33 +5817,36 @@
       <w:pPr>
         <w:jc w:val="both"/>
         <w:rPr>
-          <w:lang w:val="en-US"/>
-        </w:rPr>
-      </w:pPr>
-      <w:r>
-        <w:rPr>
-          <w:lang w:val="en-US"/>
-        </w:rPr>
-        <w:t>Shortcut in Script</w:t>
-      </w:r>
-    </w:p>
-    <w:p>
-      <w:pPr>
-        <w:jc w:val="both"/>
-        <w:rPr>
-          <w:lang w:val="en-US"/>
-        </w:rPr>
-      </w:pPr>
-      <w:r>
-        <w:rPr>
-          <w:lang w:val="en-US"/>
-        </w:rPr>
-        <w:lastRenderedPageBreak/>
+          <w:b/>
+          <w:bCs/>
+          <w:lang w:val="en-US"/>
+        </w:rPr>
+      </w:pPr>
+      <w:r>
+        <w:rPr>
+          <w:b/>
+          <w:bCs/>
+          <w:lang w:val="en-US"/>
+        </w:rPr>
+        <w:t>Example 2:</w:t>
+      </w:r>
+    </w:p>
+    <w:p>
+      <w:pPr>
+        <w:jc w:val="both"/>
+        <w:rPr>
+          <w:lang w:val="en-US"/>
+        </w:rPr>
+      </w:pPr>
+      <w:r>
+        <w:rPr>
+          <w:lang w:val="en-US"/>
+        </w:rPr>
         <w:drawing>
-          <wp:inline distT="0" distB="0" distL="0" distR="0" wp14:anchorId="58C7A106" wp14:editId="7D7943AF">
-            <wp:extent cx="2453853" cy="1920406"/>
-            <wp:effectExtent l="0" t="0" r="3810" b="3810"/>
-            <wp:docPr id="726647697" name="Picture 1"/>
+          <wp:inline distT="0" distB="0" distL="0" distR="0" wp14:anchorId="7C1BF267" wp14:editId="04FAC281">
+            <wp:extent cx="3892991" cy="2200076"/>
+            <wp:effectExtent l="19050" t="19050" r="12700" b="10160"/>
+            <wp:docPr id="1858492388" name="Picture 1"/>
             <wp:cNvGraphicFramePr>
               <a:graphicFrameLocks xmlns:a="http://schemas.openxmlformats.org/drawingml/2006/main" noChangeAspect="1"/>
             </wp:cNvGraphicFramePr>
@@ -5202,7 +5854,7 @@
               <a:graphicData uri="http://schemas.openxmlformats.org/drawingml/2006/picture">
                 <pic:pic xmlns:pic="http://schemas.openxmlformats.org/drawingml/2006/picture">
                   <pic:nvPicPr>
-                    <pic:cNvPr id="726647697" name=""/>
+                    <pic:cNvPr id="1858492388" name=""/>
                     <pic:cNvPicPr/>
                   </pic:nvPicPr>
                   <pic:blipFill>
@@ -5214,11 +5866,16 @@
                   <pic:spPr>
                     <a:xfrm>
                       <a:off x="0" y="0"/>
-                      <a:ext cx="2453853" cy="1920406"/>
+                      <a:ext cx="3899377" cy="2203685"/>
                     </a:xfrm>
                     <a:prstGeom prst="rect">
                       <a:avLst/>
                     </a:prstGeom>
+                    <a:ln w="6350">
+                      <a:solidFill>
+                        <a:schemeClr val="tx1"/>
+                      </a:solidFill>
+                    </a:ln>
                   </pic:spPr>
                 </pic:pic>
               </a:graphicData>
@@ -5226,6 +5883,598 @@
           </wp:inline>
         </w:drawing>
       </w:r>
+    </w:p>
+    <w:p>
+      <w:pPr>
+        <w:jc w:val="both"/>
+        <w:rPr>
+          <w:b/>
+          <w:bCs/>
+          <w:lang w:val="en-US"/>
+        </w:rPr>
+      </w:pPr>
+      <w:r>
+        <w:rPr>
+          <w:b/>
+          <w:bCs/>
+          <w:lang w:val="en-US"/>
+        </w:rPr>
+        <w:t>Output:</w:t>
+      </w:r>
+    </w:p>
+    <w:p>
+      <w:pPr>
+        <w:jc w:val="both"/>
+        <w:rPr>
+          <w:lang w:val="en-US"/>
+        </w:rPr>
+      </w:pPr>
+      <w:r>
+        <w:rPr>
+          <w:lang w:val="en-US"/>
+        </w:rPr>
+        <w:drawing>
+          <wp:inline distT="0" distB="0" distL="0" distR="0" wp14:anchorId="77FB0521" wp14:editId="18F6A58D">
+            <wp:extent cx="3871295" cy="2324301"/>
+            <wp:effectExtent l="19050" t="19050" r="15240" b="19050"/>
+            <wp:docPr id="600864518" name="Picture 1"/>
+            <wp:cNvGraphicFramePr>
+              <a:graphicFrameLocks xmlns:a="http://schemas.openxmlformats.org/drawingml/2006/main" noChangeAspect="1"/>
+            </wp:cNvGraphicFramePr>
+            <a:graphic xmlns:a="http://schemas.openxmlformats.org/drawingml/2006/main">
+              <a:graphicData uri="http://schemas.openxmlformats.org/drawingml/2006/picture">
+                <pic:pic xmlns:pic="http://schemas.openxmlformats.org/drawingml/2006/picture">
+                  <pic:nvPicPr>
+                    <pic:cNvPr id="600864518" name=""/>
+                    <pic:cNvPicPr/>
+                  </pic:nvPicPr>
+                  <pic:blipFill>
+                    <a:blip r:embed="rId16"/>
+                    <a:stretch>
+                      <a:fillRect/>
+                    </a:stretch>
+                  </pic:blipFill>
+                  <pic:spPr>
+                    <a:xfrm>
+                      <a:off x="0" y="0"/>
+                      <a:ext cx="3871295" cy="2324301"/>
+                    </a:xfrm>
+                    <a:prstGeom prst="rect">
+                      <a:avLst/>
+                    </a:prstGeom>
+                    <a:ln w="6350">
+                      <a:solidFill>
+                        <a:schemeClr val="tx1"/>
+                      </a:solidFill>
+                    </a:ln>
+                  </pic:spPr>
+                </pic:pic>
+              </a:graphicData>
+            </a:graphic>
+          </wp:inline>
+        </w:drawing>
+      </w:r>
+    </w:p>
+    <w:p>
+      <w:pPr>
+        <w:jc w:val="both"/>
+        <w:rPr>
+          <w:b/>
+          <w:bCs/>
+          <w:lang w:val="en-US"/>
+        </w:rPr>
+      </w:pPr>
+      <w:r>
+        <w:rPr>
+          <w:b/>
+          <w:bCs/>
+          <w:lang w:val="en-US"/>
+        </w:rPr>
+        <w:t>Example 3:</w:t>
+      </w:r>
+    </w:p>
+    <w:p>
+      <w:pPr>
+        <w:jc w:val="both"/>
+        <w:rPr>
+          <w:lang w:val="en-US"/>
+        </w:rPr>
+      </w:pPr>
+      <w:r>
+        <w:rPr>
+          <w:lang w:val="en-US"/>
+        </w:rPr>
+        <w:drawing>
+          <wp:inline distT="0" distB="0" distL="0" distR="0" wp14:anchorId="41690D63" wp14:editId="473FB7F5">
+            <wp:extent cx="3890010" cy="2537768"/>
+            <wp:effectExtent l="19050" t="19050" r="15240" b="15240"/>
+            <wp:docPr id="291468105" name="Picture 1"/>
+            <wp:cNvGraphicFramePr>
+              <a:graphicFrameLocks xmlns:a="http://schemas.openxmlformats.org/drawingml/2006/main" noChangeAspect="1"/>
+            </wp:cNvGraphicFramePr>
+            <a:graphic xmlns:a="http://schemas.openxmlformats.org/drawingml/2006/main">
+              <a:graphicData uri="http://schemas.openxmlformats.org/drawingml/2006/picture">
+                <pic:pic xmlns:pic="http://schemas.openxmlformats.org/drawingml/2006/picture">
+                  <pic:nvPicPr>
+                    <pic:cNvPr id="291468105" name=""/>
+                    <pic:cNvPicPr/>
+                  </pic:nvPicPr>
+                  <pic:blipFill>
+                    <a:blip r:embed="rId17"/>
+                    <a:stretch>
+                      <a:fillRect/>
+                    </a:stretch>
+                  </pic:blipFill>
+                  <pic:spPr>
+                    <a:xfrm>
+                      <a:off x="0" y="0"/>
+                      <a:ext cx="3906326" cy="2548412"/>
+                    </a:xfrm>
+                    <a:prstGeom prst="rect">
+                      <a:avLst/>
+                    </a:prstGeom>
+                    <a:ln w="6350">
+                      <a:solidFill>
+                        <a:schemeClr val="tx1"/>
+                      </a:solidFill>
+                    </a:ln>
+                  </pic:spPr>
+                </pic:pic>
+              </a:graphicData>
+            </a:graphic>
+          </wp:inline>
+        </w:drawing>
+      </w:r>
+    </w:p>
+    <w:p>
+      <w:pPr>
+        <w:jc w:val="both"/>
+        <w:rPr>
+          <w:b/>
+          <w:bCs/>
+          <w:lang w:val="en-US"/>
+        </w:rPr>
+      </w:pPr>
+      <w:r>
+        <w:rPr>
+          <w:b/>
+          <w:bCs/>
+          <w:lang w:val="en-US"/>
+        </w:rPr>
+        <w:t>Output:</w:t>
+      </w:r>
+    </w:p>
+    <w:p>
+      <w:pPr>
+        <w:jc w:val="both"/>
+        <w:rPr>
+          <w:lang w:val="en-US"/>
+        </w:rPr>
+      </w:pPr>
+      <w:r>
+        <w:rPr>
+          <w:lang w:val="en-US"/>
+        </w:rPr>
+        <w:drawing>
+          <wp:inline distT="0" distB="0" distL="0" distR="0" wp14:anchorId="6BD04F0C" wp14:editId="20288FA7">
+            <wp:extent cx="2933954" cy="1539373"/>
+            <wp:effectExtent l="19050" t="19050" r="19050" b="22860"/>
+            <wp:docPr id="781368387" name="Picture 1"/>
+            <wp:cNvGraphicFramePr>
+              <a:graphicFrameLocks xmlns:a="http://schemas.openxmlformats.org/drawingml/2006/main" noChangeAspect="1"/>
+            </wp:cNvGraphicFramePr>
+            <a:graphic xmlns:a="http://schemas.openxmlformats.org/drawingml/2006/main">
+              <a:graphicData uri="http://schemas.openxmlformats.org/drawingml/2006/picture">
+                <pic:pic xmlns:pic="http://schemas.openxmlformats.org/drawingml/2006/picture">
+                  <pic:nvPicPr>
+                    <pic:cNvPr id="781368387" name=""/>
+                    <pic:cNvPicPr/>
+                  </pic:nvPicPr>
+                  <pic:blipFill>
+                    <a:blip r:embed="rId18"/>
+                    <a:stretch>
+                      <a:fillRect/>
+                    </a:stretch>
+                  </pic:blipFill>
+                  <pic:spPr>
+                    <a:xfrm>
+                      <a:off x="0" y="0"/>
+                      <a:ext cx="2933954" cy="1539373"/>
+                    </a:xfrm>
+                    <a:prstGeom prst="rect">
+                      <a:avLst/>
+                    </a:prstGeom>
+                    <a:ln w="6350">
+                      <a:solidFill>
+                        <a:schemeClr val="tx1"/>
+                      </a:solidFill>
+                    </a:ln>
+                  </pic:spPr>
+                </pic:pic>
+              </a:graphicData>
+            </a:graphic>
+          </wp:inline>
+        </w:drawing>
+      </w:r>
+    </w:p>
+    <w:p>
+      <w:pPr>
+        <w:pStyle w:val="Heading2"/>
+        <w:numPr>
+          <w:ilvl w:val="1"/>
+          <w:numId w:val="14"/>
+        </w:numPr>
+        <w:ind w:left="709" w:hanging="709"/>
+        <w:rPr>
+          <w:lang w:val="en-US"/>
+        </w:rPr>
+      </w:pPr>
+      <w:bookmarkStart w:id="30" w:name="_Toc235388811"/>
+      <w:r>
+        <w:rPr>
+          <w:lang w:val="en-US"/>
+        </w:rPr>
+        <w:t>Live Script</w:t>
+      </w:r>
+      <w:bookmarkEnd w:id="30"/>
+    </w:p>
+    <w:p>
+      <w:pPr>
+        <w:jc w:val="both"/>
+        <w:rPr>
+          <w:lang w:val="en-US"/>
+        </w:rPr>
+      </w:pPr>
+      <w:r>
+        <w:rPr>
+          <w:lang w:val="en-US"/>
+        </w:rPr>
+        <w:t>A MATLAB Live Script is an interactive notebook document that combines executable MATLAB code with formatted text, mathematical equations, images, and interactive UI control inside a single environment called the MATLAB Live Editor</w:t>
+      </w:r>
+    </w:p>
+    <w:p>
+      <w:pPr>
+        <w:pStyle w:val="ListParagraph"/>
+        <w:numPr>
+          <w:ilvl w:val="0"/>
+          <w:numId w:val="4"/>
+        </w:numPr>
+        <w:jc w:val="both"/>
+        <w:rPr>
+          <w:lang w:val="en-US"/>
+        </w:rPr>
+      </w:pPr>
+      <w:r>
+        <w:rPr>
+          <w:lang w:val="en-US"/>
+        </w:rPr>
+        <w:t xml:space="preserve">File extension: </w:t>
+      </w:r>
+      <w:r>
+        <w:rPr>
+          <w:color w:val="EE0000"/>
+          <w:highlight w:val="lightGray"/>
+          <w:lang w:val="en-US"/>
+        </w:rPr>
+        <w:t>‘.m</w:t>
+      </w:r>
+      <w:r>
+        <w:rPr>
+          <w:color w:val="EE0000"/>
+          <w:highlight w:val="lightGray"/>
+          <w:lang w:val="en-US"/>
+        </w:rPr>
+        <w:t>lx</w:t>
+      </w:r>
+      <w:r>
+        <w:rPr>
+          <w:color w:val="EE0000"/>
+          <w:highlight w:val="lightGray"/>
+          <w:lang w:val="en-US"/>
+        </w:rPr>
+        <w:t>’</w:t>
+      </w:r>
+      <w:r>
+        <w:rPr>
+          <w:lang w:val="en-US"/>
+        </w:rPr>
+        <w:t>,</w:t>
+      </w:r>
+      <w:r>
+        <w:rPr>
+          <w:color w:val="EE0000"/>
+          <w:lang w:val="en-US"/>
+        </w:rPr>
+        <w:t xml:space="preserve"> </w:t>
+      </w:r>
+      <w:r>
+        <w:rPr>
+          <w:lang w:val="en-US"/>
+        </w:rPr>
+        <w:t xml:space="preserve">e.g., </w:t>
+      </w:r>
+      <w:r>
+        <w:rPr>
+          <w:lang w:val="en-US"/>
+        </w:rPr>
+        <w:t>file.m</w:t>
+      </w:r>
+      <w:r>
+        <w:rPr>
+          <w:lang w:val="en-US"/>
+        </w:rPr>
+        <w:t>lx</w:t>
+      </w:r>
+    </w:p>
+    <w:p>
+      <w:pPr>
+        <w:pStyle w:val="Heading3"/>
+        <w:numPr>
+          <w:ilvl w:val="2"/>
+          <w:numId w:val="14"/>
+        </w:numPr>
+        <w:ind w:left="709"/>
+        <w:rPr>
+          <w:lang w:val="en-US"/>
+        </w:rPr>
+      </w:pPr>
+      <w:bookmarkStart w:id="31" w:name="_Toc235388812"/>
+      <w:r>
+        <w:rPr>
+          <w:lang w:val="en-US"/>
+        </w:rPr>
+        <w:t>How to Create a Live Script</w:t>
+      </w:r>
+      <w:bookmarkEnd w:id="31"/>
+    </w:p>
+    <w:p>
+      <w:pPr>
+        <w:jc w:val="both"/>
+        <w:rPr>
+          <w:lang w:val="en-US"/>
+        </w:rPr>
+      </w:pPr>
+      <w:r>
+        <w:rPr>
+          <w:lang w:val="en-US"/>
+        </w:rPr>
+        <w:t>You can start a new script file using any of these methods:</w:t>
+      </w:r>
+    </w:p>
+    <w:p>
+      <w:pPr>
+        <w:pStyle w:val="ListParagraph"/>
+        <w:numPr>
+          <w:ilvl w:val="0"/>
+          <w:numId w:val="4"/>
+        </w:numPr>
+        <w:jc w:val="both"/>
+        <w:rPr>
+          <w:lang w:val="en-US"/>
+        </w:rPr>
+      </w:pPr>
+      <w:r>
+        <w:rPr>
+          <w:b/>
+          <w:bCs/>
+          <w:lang w:val="en-US"/>
+        </w:rPr>
+        <w:t>Via Toolstrip:</w:t>
+      </w:r>
+      <w:r>
+        <w:rPr>
+          <w:lang w:val="en-US"/>
+        </w:rPr>
+        <w:t xml:space="preserve"> Navigate to the </w:t>
+      </w:r>
+      <w:r>
+        <w:rPr>
+          <w:i/>
+          <w:iCs/>
+          <w:lang w:val="en-US"/>
+        </w:rPr>
+        <w:t>Home</w:t>
+      </w:r>
+      <w:r>
+        <w:rPr>
+          <w:lang w:val="en-US"/>
+        </w:rPr>
+        <w:t xml:space="preserve"> tab and click the </w:t>
+      </w:r>
+      <w:r>
+        <w:rPr>
+          <w:i/>
+          <w:iCs/>
+          <w:lang w:val="en-US"/>
+        </w:rPr>
+        <w:t>New Live Script</w:t>
+      </w:r>
+      <w:r>
+        <w:rPr>
+          <w:lang w:val="en-US"/>
+        </w:rPr>
+        <w:t xml:space="preserve"> button.</w:t>
+      </w:r>
+    </w:p>
+    <w:p>
+      <w:pPr>
+        <w:pStyle w:val="ListParagraph"/>
+        <w:numPr>
+          <w:ilvl w:val="0"/>
+          <w:numId w:val="4"/>
+        </w:numPr>
+        <w:jc w:val="both"/>
+        <w:rPr>
+          <w:lang w:val="en-US"/>
+        </w:rPr>
+      </w:pPr>
+      <w:r>
+        <w:rPr>
+          <w:b/>
+          <w:bCs/>
+          <w:lang w:val="en-US"/>
+        </w:rPr>
+        <w:t>Via Command Window:</w:t>
+      </w:r>
+      <w:r>
+        <w:rPr>
+          <w:lang w:val="en-US"/>
+        </w:rPr>
+        <w:t xml:space="preserve"> Type edit </w:t>
+      </w:r>
+      <w:r>
+        <w:rPr>
+          <w:highlight w:val="lightGray"/>
+          <w:lang w:val="en-US"/>
+        </w:rPr>
+        <w:t>filename.mlx</w:t>
+      </w:r>
+      <w:r>
+        <w:rPr>
+          <w:lang w:val="en-US"/>
+        </w:rPr>
+        <w:t xml:space="preserve"> and hit enter.</w:t>
+      </w:r>
+    </w:p>
+    <w:p>
+      <w:pPr>
+        <w:pStyle w:val="ListParagraph"/>
+        <w:numPr>
+          <w:ilvl w:val="0"/>
+          <w:numId w:val="4"/>
+        </w:numPr>
+        <w:jc w:val="both"/>
+        <w:rPr>
+          <w:lang w:val="en-US"/>
+        </w:rPr>
+      </w:pPr>
+      <w:r>
+        <w:rPr>
+          <w:b/>
+          <w:bCs/>
+          <w:lang w:val="en-US"/>
+        </w:rPr>
+        <w:t>Convert Existing Script:</w:t>
+      </w:r>
+      <w:r>
+        <w:rPr>
+          <w:lang w:val="en-US"/>
+        </w:rPr>
+        <w:t xml:space="preserve"> Right-click any standard .m file in your Current Folder browser and select Open as Live Script, and save it.</w:t>
+      </w:r>
+    </w:p>
+    <w:p>
+      <w:pPr>
+        <w:jc w:val="both"/>
+        <w:rPr>
+          <w:lang w:val="en-US"/>
+        </w:rPr>
+      </w:pPr>
+      <w:r>
+        <w:rPr>
+          <w:lang w:val="en-US"/>
+        </w:rPr>
+        <w:t>Example and Output:</w:t>
+      </w:r>
+    </w:p>
+    <w:p>
+      <w:pPr>
+        <w:jc w:val="both"/>
+        <w:rPr>
+          <w:lang w:val="en-US"/>
+        </w:rPr>
+      </w:pPr>
+      <w:r>
+        <w:rPr>
+          <w:lang w:val="en-US"/>
+        </w:rPr>
+        <w:drawing>
+          <wp:inline distT="0" distB="0" distL="0" distR="0" wp14:anchorId="1FB10CB5" wp14:editId="23A4A028">
+            <wp:extent cx="5133395" cy="2042598"/>
+            <wp:effectExtent l="19050" t="19050" r="10160" b="15240"/>
+            <wp:docPr id="156105801" name="Picture 1"/>
+            <wp:cNvGraphicFramePr>
+              <a:graphicFrameLocks xmlns:a="http://schemas.openxmlformats.org/drawingml/2006/main" noChangeAspect="1"/>
+            </wp:cNvGraphicFramePr>
+            <a:graphic xmlns:a="http://schemas.openxmlformats.org/drawingml/2006/main">
+              <a:graphicData uri="http://schemas.openxmlformats.org/drawingml/2006/picture">
+                <pic:pic xmlns:pic="http://schemas.openxmlformats.org/drawingml/2006/picture">
+                  <pic:nvPicPr>
+                    <pic:cNvPr id="156105801" name=""/>
+                    <pic:cNvPicPr/>
+                  </pic:nvPicPr>
+                  <pic:blipFill>
+                    <a:blip r:embed="rId19"/>
+                    <a:stretch>
+                      <a:fillRect/>
+                    </a:stretch>
+                  </pic:blipFill>
+                  <pic:spPr>
+                    <a:xfrm>
+                      <a:off x="0" y="0"/>
+                      <a:ext cx="5150305" cy="2049326"/>
+                    </a:xfrm>
+                    <a:prstGeom prst="rect">
+                      <a:avLst/>
+                    </a:prstGeom>
+                    <a:ln w="6350">
+                      <a:solidFill>
+                        <a:schemeClr val="tx1"/>
+                      </a:solidFill>
+                    </a:ln>
+                  </pic:spPr>
+                </pic:pic>
+              </a:graphicData>
+            </a:graphic>
+          </wp:inline>
+        </w:drawing>
+      </w:r>
+    </w:p>
+    <w:p>
+      <w:pPr>
+        <w:jc w:val="both"/>
+        <w:rPr>
+          <w:lang w:val="en-US"/>
+        </w:rPr>
+      </w:pPr>
+    </w:p>
+    <w:p>
+      <w:pPr>
+        <w:jc w:val="both"/>
+        <w:rPr>
+          <w:lang w:val="en-US"/>
+        </w:rPr>
+      </w:pPr>
+    </w:p>
+    <w:p>
+      <w:pPr>
+        <w:jc w:val="both"/>
+        <w:rPr>
+          <w:lang w:val="en-US"/>
+        </w:rPr>
+      </w:pPr>
+    </w:p>
+    <w:p>
+      <w:pPr>
+        <w:jc w:val="both"/>
+        <w:rPr>
+          <w:lang w:val="en-US"/>
+        </w:rPr>
+      </w:pPr>
+      <w:r>
+        <w:rPr>
+          <w:lang w:val="en-US"/>
+        </w:rPr>
+        <w:t>Scratch Work:</w:t>
+      </w:r>
+    </w:p>
+    <w:p>
+      <w:pPr>
+        <w:jc w:val="both"/>
+        <w:rPr>
+          <w:lang w:val="en-US"/>
+        </w:rPr>
+      </w:pPr>
     </w:p>
     <w:p>
       <w:pPr>
@@ -5268,7 +6517,7 @@
                     <pic:cNvPicPr/>
                   </pic:nvPicPr>
                   <pic:blipFill>
-                    <a:blip r:embed="rId16"/>
+                    <a:blip r:embed="rId20"/>
                     <a:stretch>
                       <a:fillRect/>
                     </a:stretch>
@@ -5296,9 +6545,334 @@
           <w:lang w:val="en-US"/>
         </w:rPr>
       </w:pPr>
+      <w:r>
+        <w:rPr>
+          <w:lang w:val="en-US"/>
+        </w:rPr>
+        <w:t>Class 3:</w:t>
+      </w:r>
+    </w:p>
+    <w:p>
+      <w:pPr>
+        <w:jc w:val="both"/>
+        <w:rPr>
+          <w:lang w:val="en-US"/>
+        </w:rPr>
+      </w:pPr>
+      <w:r>
+        <w:rPr>
+          <w:lang w:val="en-US"/>
+        </w:rPr>
+        <w:t>Variables</w:t>
+      </w:r>
+    </w:p>
+    <w:p>
+      <w:pPr>
+        <w:jc w:val="both"/>
+        <w:rPr>
+          <w:lang w:val="en-US"/>
+        </w:rPr>
+      </w:pPr>
+      <w:r>
+        <w:rPr>
+          <w:lang w:val="en-US"/>
+        </w:rPr>
+        <w:lastRenderedPageBreak/>
+        <w:drawing>
+          <wp:inline distT="0" distB="0" distL="0" distR="0" wp14:anchorId="431FD2B8" wp14:editId="256F3EC7">
+            <wp:extent cx="6120130" cy="3295650"/>
+            <wp:effectExtent l="0" t="0" r="0" b="0"/>
+            <wp:docPr id="1208351271" name="Picture 1"/>
+            <wp:cNvGraphicFramePr>
+              <a:graphicFrameLocks xmlns:a="http://schemas.openxmlformats.org/drawingml/2006/main" noChangeAspect="1"/>
+            </wp:cNvGraphicFramePr>
+            <a:graphic xmlns:a="http://schemas.openxmlformats.org/drawingml/2006/main">
+              <a:graphicData uri="http://schemas.openxmlformats.org/drawingml/2006/picture">
+                <pic:pic xmlns:pic="http://schemas.openxmlformats.org/drawingml/2006/picture">
+                  <pic:nvPicPr>
+                    <pic:cNvPr id="1208351271" name=""/>
+                    <pic:cNvPicPr/>
+                  </pic:nvPicPr>
+                  <pic:blipFill>
+                    <a:blip r:embed="rId21"/>
+                    <a:stretch>
+                      <a:fillRect/>
+                    </a:stretch>
+                  </pic:blipFill>
+                  <pic:spPr>
+                    <a:xfrm>
+                      <a:off x="0" y="0"/>
+                      <a:ext cx="6120130" cy="3295650"/>
+                    </a:xfrm>
+                    <a:prstGeom prst="rect">
+                      <a:avLst/>
+                    </a:prstGeom>
+                  </pic:spPr>
+                </pic:pic>
+              </a:graphicData>
+            </a:graphic>
+          </wp:inline>
+        </w:drawing>
+      </w:r>
+    </w:p>
+    <w:p>
+      <w:pPr>
+        <w:jc w:val="both"/>
+        <w:rPr>
+          <w:lang w:val="en-US"/>
+        </w:rPr>
+      </w:pPr>
+      <w:r>
+        <w:rPr>
+          <w:lang w:val="en-US"/>
+        </w:rPr>
+        <w:t xml:space="preserve"> </w:t>
+      </w:r>
+      <w:r>
+        <w:rPr>
+          <w:lang w:val="en-US"/>
+        </w:rPr>
+        <w:drawing>
+          <wp:inline distT="0" distB="0" distL="0" distR="0" wp14:anchorId="7D82FB36" wp14:editId="150A3A63">
+            <wp:extent cx="6120130" cy="3522345"/>
+            <wp:effectExtent l="0" t="0" r="0" b="1905"/>
+            <wp:docPr id="282603965" name="Picture 1"/>
+            <wp:cNvGraphicFramePr>
+              <a:graphicFrameLocks xmlns:a="http://schemas.openxmlformats.org/drawingml/2006/main" noChangeAspect="1"/>
+            </wp:cNvGraphicFramePr>
+            <a:graphic xmlns:a="http://schemas.openxmlformats.org/drawingml/2006/main">
+              <a:graphicData uri="http://schemas.openxmlformats.org/drawingml/2006/picture">
+                <pic:pic xmlns:pic="http://schemas.openxmlformats.org/drawingml/2006/picture">
+                  <pic:nvPicPr>
+                    <pic:cNvPr id="282603965" name=""/>
+                    <pic:cNvPicPr/>
+                  </pic:nvPicPr>
+                  <pic:blipFill>
+                    <a:blip r:embed="rId22"/>
+                    <a:stretch>
+                      <a:fillRect/>
+                    </a:stretch>
+                  </pic:blipFill>
+                  <pic:spPr>
+                    <a:xfrm>
+                      <a:off x="0" y="0"/>
+                      <a:ext cx="6120130" cy="3522345"/>
+                    </a:xfrm>
+                    <a:prstGeom prst="rect">
+                      <a:avLst/>
+                    </a:prstGeom>
+                  </pic:spPr>
+                </pic:pic>
+              </a:graphicData>
+            </a:graphic>
+          </wp:inline>
+        </w:drawing>
+      </w:r>
+    </w:p>
+    <w:p>
+      <w:pPr>
+        <w:jc w:val="both"/>
+        <w:rPr>
+          <w:lang w:val="en-US"/>
+        </w:rPr>
+      </w:pPr>
+      <w:r>
+        <w:rPr>
+          <w:lang w:val="en-US"/>
+        </w:rPr>
+        <w:lastRenderedPageBreak/>
+        <w:drawing>
+          <wp:inline distT="0" distB="0" distL="0" distR="0" wp14:anchorId="63E7872E" wp14:editId="4439C91A">
+            <wp:extent cx="4839119" cy="2331922"/>
+            <wp:effectExtent l="0" t="0" r="0" b="0"/>
+            <wp:docPr id="2129086388" name="Picture 1"/>
+            <wp:cNvGraphicFramePr>
+              <a:graphicFrameLocks xmlns:a="http://schemas.openxmlformats.org/drawingml/2006/main" noChangeAspect="1"/>
+            </wp:cNvGraphicFramePr>
+            <a:graphic xmlns:a="http://schemas.openxmlformats.org/drawingml/2006/main">
+              <a:graphicData uri="http://schemas.openxmlformats.org/drawingml/2006/picture">
+                <pic:pic xmlns:pic="http://schemas.openxmlformats.org/drawingml/2006/picture">
+                  <pic:nvPicPr>
+                    <pic:cNvPr id="2129086388" name=""/>
+                    <pic:cNvPicPr/>
+                  </pic:nvPicPr>
+                  <pic:blipFill>
+                    <a:blip r:embed="rId23"/>
+                    <a:stretch>
+                      <a:fillRect/>
+                    </a:stretch>
+                  </pic:blipFill>
+                  <pic:spPr>
+                    <a:xfrm>
+                      <a:off x="0" y="0"/>
+                      <a:ext cx="4839119" cy="2331922"/>
+                    </a:xfrm>
+                    <a:prstGeom prst="rect">
+                      <a:avLst/>
+                    </a:prstGeom>
+                  </pic:spPr>
+                </pic:pic>
+              </a:graphicData>
+            </a:graphic>
+          </wp:inline>
+        </w:drawing>
+      </w:r>
+    </w:p>
+    <w:p>
+      <w:pPr>
+        <w:jc w:val="both"/>
+        <w:rPr>
+          <w:lang w:val="en-US"/>
+        </w:rPr>
+      </w:pPr>
+      <w:r>
+        <w:rPr>
+          <w:lang w:val="en-US"/>
+        </w:rPr>
+        <w:drawing>
+          <wp:inline distT="0" distB="0" distL="0" distR="0" wp14:anchorId="24F9EEB3" wp14:editId="68E2C135">
+            <wp:extent cx="6120130" cy="3776980"/>
+            <wp:effectExtent l="0" t="0" r="0" b="0"/>
+            <wp:docPr id="672483281" name="Picture 1"/>
+            <wp:cNvGraphicFramePr>
+              <a:graphicFrameLocks xmlns:a="http://schemas.openxmlformats.org/drawingml/2006/main" noChangeAspect="1"/>
+            </wp:cNvGraphicFramePr>
+            <a:graphic xmlns:a="http://schemas.openxmlformats.org/drawingml/2006/main">
+              <a:graphicData uri="http://schemas.openxmlformats.org/drawingml/2006/picture">
+                <pic:pic xmlns:pic="http://schemas.openxmlformats.org/drawingml/2006/picture">
+                  <pic:nvPicPr>
+                    <pic:cNvPr id="672483281" name=""/>
+                    <pic:cNvPicPr/>
+                  </pic:nvPicPr>
+                  <pic:blipFill>
+                    <a:blip r:embed="rId24"/>
+                    <a:stretch>
+                      <a:fillRect/>
+                    </a:stretch>
+                  </pic:blipFill>
+                  <pic:spPr>
+                    <a:xfrm>
+                      <a:off x="0" y="0"/>
+                      <a:ext cx="6120130" cy="3776980"/>
+                    </a:xfrm>
+                    <a:prstGeom prst="rect">
+                      <a:avLst/>
+                    </a:prstGeom>
+                  </pic:spPr>
+                </pic:pic>
+              </a:graphicData>
+            </a:graphic>
+          </wp:inline>
+        </w:drawing>
+      </w:r>
+    </w:p>
+    <w:p>
+      <w:pPr>
+        <w:jc w:val="both"/>
+        <w:rPr>
+          <w:lang w:val="en-US"/>
+        </w:rPr>
+      </w:pPr>
+      <w:r>
+        <w:rPr>
+          <w:lang w:val="en-US"/>
+        </w:rPr>
+        <w:lastRenderedPageBreak/>
+        <w:drawing>
+          <wp:inline distT="0" distB="0" distL="0" distR="0" wp14:anchorId="30C95508" wp14:editId="2CCCBD09">
+            <wp:extent cx="6120130" cy="3543300"/>
+            <wp:effectExtent l="0" t="0" r="0" b="0"/>
+            <wp:docPr id="1161934984" name="Picture 1"/>
+            <wp:cNvGraphicFramePr>
+              <a:graphicFrameLocks xmlns:a="http://schemas.openxmlformats.org/drawingml/2006/main" noChangeAspect="1"/>
+            </wp:cNvGraphicFramePr>
+            <a:graphic xmlns:a="http://schemas.openxmlformats.org/drawingml/2006/main">
+              <a:graphicData uri="http://schemas.openxmlformats.org/drawingml/2006/picture">
+                <pic:pic xmlns:pic="http://schemas.openxmlformats.org/drawingml/2006/picture">
+                  <pic:nvPicPr>
+                    <pic:cNvPr id="1161934984" name=""/>
+                    <pic:cNvPicPr/>
+                  </pic:nvPicPr>
+                  <pic:blipFill>
+                    <a:blip r:embed="rId25"/>
+                    <a:stretch>
+                      <a:fillRect/>
+                    </a:stretch>
+                  </pic:blipFill>
+                  <pic:spPr>
+                    <a:xfrm>
+                      <a:off x="0" y="0"/>
+                      <a:ext cx="6120130" cy="3543300"/>
+                    </a:xfrm>
+                    <a:prstGeom prst="rect">
+                      <a:avLst/>
+                    </a:prstGeom>
+                  </pic:spPr>
+                </pic:pic>
+              </a:graphicData>
+            </a:graphic>
+          </wp:inline>
+        </w:drawing>
+      </w:r>
+    </w:p>
+    <w:p>
+      <w:pPr>
+        <w:jc w:val="both"/>
+        <w:rPr>
+          <w:lang w:val="en-US"/>
+        </w:rPr>
+      </w:pPr>
+      <w:r>
+        <w:rPr>
+          <w:lang w:val="en-US"/>
+        </w:rPr>
+        <w:drawing>
+          <wp:inline distT="0" distB="0" distL="0" distR="0" wp14:anchorId="49E4371E" wp14:editId="5A319F4F">
+            <wp:extent cx="6120130" cy="3995420"/>
+            <wp:effectExtent l="0" t="0" r="0" b="5080"/>
+            <wp:docPr id="847933372" name="Picture 1"/>
+            <wp:cNvGraphicFramePr>
+              <a:graphicFrameLocks xmlns:a="http://schemas.openxmlformats.org/drawingml/2006/main" noChangeAspect="1"/>
+            </wp:cNvGraphicFramePr>
+            <a:graphic xmlns:a="http://schemas.openxmlformats.org/drawingml/2006/main">
+              <a:graphicData uri="http://schemas.openxmlformats.org/drawingml/2006/picture">
+                <pic:pic xmlns:pic="http://schemas.openxmlformats.org/drawingml/2006/picture">
+                  <pic:nvPicPr>
+                    <pic:cNvPr id="847933372" name=""/>
+                    <pic:cNvPicPr/>
+                  </pic:nvPicPr>
+                  <pic:blipFill>
+                    <a:blip r:embed="rId26"/>
+                    <a:stretch>
+                      <a:fillRect/>
+                    </a:stretch>
+                  </pic:blipFill>
+                  <pic:spPr>
+                    <a:xfrm>
+                      <a:off x="0" y="0"/>
+                      <a:ext cx="6120130" cy="3995420"/>
+                    </a:xfrm>
+                    <a:prstGeom prst="rect">
+                      <a:avLst/>
+                    </a:prstGeom>
+                  </pic:spPr>
+                </pic:pic>
+              </a:graphicData>
+            </a:graphic>
+          </wp:inline>
+        </w:drawing>
+      </w:r>
+    </w:p>
+    <w:p>
+      <w:pPr>
+        <w:jc w:val="both"/>
+        <w:rPr>
+          <w:lang w:val="en-US"/>
+        </w:rPr>
+      </w:pPr>
     </w:p>
     <w:sectPr>
-      <w:footerReference w:type="default" r:id="rId17"/>
+      <w:footerReference w:type="default" r:id="rId27"/>
       <w:pgSz w:w="11906" w:h="16838"/>
       <w:pgMar w:top="1134" w:right="1134" w:bottom="1440" w:left="1134" w:header="709" w:footer="709" w:gutter="0"/>
       <w:cols w:space="708"/>

</xml_diff>